<commit_message>
commit changes no word
</commit_message>
<xml_diff>
--- a/iShoppingKelly/Relatório.docx
+++ b/iShoppingKelly/Relatório.docx
@@ -716,7 +716,7 @@
     </w:p>
     <w:tbl>
       <w:tblPr>
-        <w:tblW w:w="0" w:type="auto"/>
+        <w:tblW w:w="8584" w:type="dxa"/>
         <w:tblCellSpacing w:w="15" w:type="dxa"/>
         <w:tblCellMar>
           <w:top w:w="15" w:type="dxa"/>
@@ -728,7 +728,7 @@
       </w:tblPr>
       <w:tblGrid>
         <w:gridCol w:w="1626"/>
-        <w:gridCol w:w="981"/>
+        <w:gridCol w:w="1061"/>
         <w:gridCol w:w="2273"/>
         <w:gridCol w:w="3624"/>
       </w:tblGrid>
@@ -771,7 +771,7 @@
         </w:tc>
         <w:tc>
           <w:tcPr>
-            <w:tcW w:w="0" w:type="auto"/>
+            <w:tcW w:w="1031" w:type="dxa"/>
             <w:vAlign w:val="center"/>
             <w:hideMark/>
           </w:tcPr>
@@ -899,7 +899,7 @@
         </w:tc>
         <w:tc>
           <w:tcPr>
-            <w:tcW w:w="0" w:type="auto"/>
+            <w:tcW w:w="1031" w:type="dxa"/>
             <w:vAlign w:val="center"/>
             <w:hideMark/>
           </w:tcPr>
@@ -1032,7 +1032,7 @@
         </w:tc>
         <w:tc>
           <w:tcPr>
-            <w:tcW w:w="0" w:type="auto"/>
+            <w:tcW w:w="1031" w:type="dxa"/>
             <w:vAlign w:val="center"/>
             <w:hideMark/>
           </w:tcPr>
@@ -1166,7 +1166,7 @@
         </w:tc>
         <w:tc>
           <w:tcPr>
-            <w:tcW w:w="0" w:type="auto"/>
+            <w:tcW w:w="1031" w:type="dxa"/>
             <w:vAlign w:val="center"/>
             <w:hideMark/>
           </w:tcPr>
@@ -1310,7 +1310,7 @@
         </w:tc>
         <w:tc>
           <w:tcPr>
-            <w:tcW w:w="0" w:type="auto"/>
+            <w:tcW w:w="1031" w:type="dxa"/>
             <w:vAlign w:val="center"/>
             <w:hideMark/>
           </w:tcPr>
@@ -1454,7 +1454,7 @@
         </w:tc>
         <w:tc>
           <w:tcPr>
-            <w:tcW w:w="0" w:type="auto"/>
+            <w:tcW w:w="1031" w:type="dxa"/>
             <w:vAlign w:val="center"/>
             <w:hideMark/>
           </w:tcPr>
@@ -1598,7 +1598,7 @@
         </w:tc>
         <w:tc>
           <w:tcPr>
-            <w:tcW w:w="0" w:type="auto"/>
+            <w:tcW w:w="1031" w:type="dxa"/>
             <w:vAlign w:val="center"/>
             <w:hideMark/>
           </w:tcPr>
@@ -1744,7 +1744,7 @@
         </w:tc>
         <w:tc>
           <w:tcPr>
-            <w:tcW w:w="0" w:type="auto"/>
+            <w:tcW w:w="1031" w:type="dxa"/>
             <w:vAlign w:val="center"/>
             <w:hideMark/>
           </w:tcPr>
@@ -1857,7 +1857,7 @@
         </w:tc>
         <w:tc>
           <w:tcPr>
-            <w:tcW w:w="0" w:type="auto"/>
+            <w:tcW w:w="1031" w:type="dxa"/>
             <w:vAlign w:val="center"/>
             <w:hideMark/>
           </w:tcPr>
@@ -1972,7 +1972,7 @@
         </w:tc>
         <w:tc>
           <w:tcPr>
-            <w:tcW w:w="0" w:type="auto"/>
+            <w:tcW w:w="1031" w:type="dxa"/>
             <w:vAlign w:val="center"/>
             <w:hideMark/>
           </w:tcPr>
@@ -2101,7 +2101,7 @@
           <w:szCs w:val="48"/>
           <w:lang w:eastAsia="pt-PT"/>
         </w:rPr>
-        <w:t>3. Justificação das Opções de Implementação</w:t>
+        <w:t>Justificação das Opções de Implementação</w:t>
       </w:r>
     </w:p>
     <w:p>
@@ -2126,7 +2126,18 @@
           <w:szCs w:val="36"/>
           <w:lang w:eastAsia="pt-PT"/>
         </w:rPr>
-        <w:t>3.1 Arquitetura MVC</w:t>
+        <w:t>1.</w:t>
+      </w:r>
+      <w:r>
+        <w:rPr>
+          <w:rFonts w:ascii="Arial" w:eastAsia="Times New Roman" w:hAnsi="Arial" w:cs="Arial"/>
+          <w:b/>
+          <w:bCs/>
+          <w:sz w:val="36"/>
+          <w:szCs w:val="36"/>
+          <w:lang w:eastAsia="pt-PT"/>
+        </w:rPr>
+        <w:t xml:space="preserve"> Arquitetura MVC</w:t>
       </w:r>
     </w:p>
     <w:p>
@@ -2596,17 +2607,6 @@
           <w:lang w:eastAsia="pt-PT"/>
         </w:rPr>
       </w:pPr>
-      <w:r>
-        <w:rPr>
-          <w:rFonts w:ascii="Arial" w:eastAsia="Times New Roman" w:hAnsi="Arial" w:cs="Arial"/>
-          <w:sz w:val="24"/>
-          <w:szCs w:val="24"/>
-          <w:lang w:eastAsia="pt-PT"/>
-        </w:rPr>
-        <w:pict>
-          <v:rect id="_x0000_i1028" style="width:0;height:1.5pt" o:hralign="center" o:hrstd="t" o:hr="t" fillcolor="#a0a0a0" stroked="f"/>
-        </w:pict>
-      </w:r>
     </w:p>
     <w:p>
       <w:pPr>
@@ -2630,7 +2630,18 @@
           <w:szCs w:val="36"/>
           <w:lang w:eastAsia="pt-PT"/>
         </w:rPr>
-        <w:t xml:space="preserve">3.2 Utilização do </w:t>
+        <w:t>2.</w:t>
+      </w:r>
+      <w:r>
+        <w:rPr>
+          <w:rFonts w:ascii="Arial" w:eastAsia="Times New Roman" w:hAnsi="Arial" w:cs="Arial"/>
+          <w:b/>
+          <w:bCs/>
+          <w:sz w:val="36"/>
+          <w:szCs w:val="36"/>
+          <w:lang w:eastAsia="pt-PT"/>
+        </w:rPr>
+        <w:t xml:space="preserve"> Utilização do </w:t>
       </w:r>
       <w:proofErr w:type="spellStart"/>
       <w:r>
@@ -2908,17 +2919,6 @@
           <w:lang w:eastAsia="pt-PT"/>
         </w:rPr>
       </w:pPr>
-      <w:r>
-        <w:rPr>
-          <w:rFonts w:ascii="Arial" w:eastAsia="Times New Roman" w:hAnsi="Arial" w:cs="Arial"/>
-          <w:sz w:val="24"/>
-          <w:szCs w:val="24"/>
-          <w:lang w:eastAsia="pt-PT"/>
-        </w:rPr>
-        <w:pict>
-          <v:rect id="_x0000_i1029" style="width:0;height:1.5pt" o:hralign="center" o:hrstd="t" o:hr="t" fillcolor="#a0a0a0" stroked="f"/>
-        </w:pict>
-      </w:r>
     </w:p>
     <w:p>
       <w:pPr>
@@ -2942,9 +2942,8 @@
           <w:szCs w:val="36"/>
           <w:lang w:eastAsia="pt-PT"/>
         </w:rPr>
-        <w:t xml:space="preserve">3.3 Utilização de LINQ </w:t>
-      </w:r>
-      <w:proofErr w:type="spellStart"/>
+        <w:t>3.</w:t>
+      </w:r>
       <w:r>
         <w:rPr>
           <w:rFonts w:ascii="Arial" w:eastAsia="Times New Roman" w:hAnsi="Arial" w:cs="Arial"/>
@@ -2954,9 +2953,9 @@
           <w:szCs w:val="36"/>
           <w:lang w:eastAsia="pt-PT"/>
         </w:rPr>
-        <w:t>Method</w:t>
-      </w:r>
-      <w:proofErr w:type="spellEnd"/>
+        <w:t xml:space="preserve"> Utilização de LINQ </w:t>
+      </w:r>
+      <w:proofErr w:type="spellStart"/>
       <w:r>
         <w:rPr>
           <w:rFonts w:ascii="Arial" w:eastAsia="Times New Roman" w:hAnsi="Arial" w:cs="Arial"/>
@@ -2966,9 +2965,9 @@
           <w:szCs w:val="36"/>
           <w:lang w:eastAsia="pt-PT"/>
         </w:rPr>
-        <w:t xml:space="preserve"> </w:t>
-      </w:r>
-      <w:proofErr w:type="spellStart"/>
+        <w:t>Method</w:t>
+      </w:r>
+      <w:proofErr w:type="spellEnd"/>
       <w:r>
         <w:rPr>
           <w:rFonts w:ascii="Arial" w:eastAsia="Times New Roman" w:hAnsi="Arial" w:cs="Arial"/>
@@ -2978,6 +2977,18 @@
           <w:szCs w:val="36"/>
           <w:lang w:eastAsia="pt-PT"/>
         </w:rPr>
+        <w:t xml:space="preserve"> </w:t>
+      </w:r>
+      <w:proofErr w:type="spellStart"/>
+      <w:r>
+        <w:rPr>
+          <w:rFonts w:ascii="Arial" w:eastAsia="Times New Roman" w:hAnsi="Arial" w:cs="Arial"/>
+          <w:b/>
+          <w:bCs/>
+          <w:sz w:val="36"/>
+          <w:szCs w:val="36"/>
+          <w:lang w:eastAsia="pt-PT"/>
+        </w:rPr>
         <w:t>Syntax</w:t>
       </w:r>
       <w:proofErr w:type="spellEnd"/>
@@ -3097,17 +3108,6 @@
           <w:lang w:eastAsia="pt-PT"/>
         </w:rPr>
       </w:pPr>
-      <w:r>
-        <w:rPr>
-          <w:rFonts w:ascii="Arial" w:eastAsia="Times New Roman" w:hAnsi="Arial" w:cs="Arial"/>
-          <w:sz w:val="24"/>
-          <w:szCs w:val="24"/>
-          <w:lang w:eastAsia="pt-PT"/>
-        </w:rPr>
-        <w:pict>
-          <v:rect id="_x0000_i1030" style="width:0;height:1.5pt" o:hralign="center" o:hrstd="t" o:hr="t" fillcolor="#a0a0a0" stroked="f"/>
-        </w:pict>
-      </w:r>
     </w:p>
     <w:p>
       <w:pPr>
@@ -3131,7 +3131,18 @@
           <w:szCs w:val="36"/>
           <w:lang w:eastAsia="pt-PT"/>
         </w:rPr>
-        <w:t>3.4 Tratamento de Exceções</w:t>
+        <w:t>4.</w:t>
+      </w:r>
+      <w:r>
+        <w:rPr>
+          <w:rFonts w:ascii="Arial" w:eastAsia="Times New Roman" w:hAnsi="Arial" w:cs="Arial"/>
+          <w:b/>
+          <w:bCs/>
+          <w:sz w:val="36"/>
+          <w:szCs w:val="36"/>
+          <w:lang w:eastAsia="pt-PT"/>
+        </w:rPr>
+        <w:t xml:space="preserve"> Tratamento de Exceções</w:t>
       </w:r>
     </w:p>
     <w:p>
@@ -3362,17 +3373,6 @@
           <w:lang w:eastAsia="pt-PT"/>
         </w:rPr>
       </w:pPr>
-      <w:r>
-        <w:rPr>
-          <w:rFonts w:ascii="Arial" w:eastAsia="Times New Roman" w:hAnsi="Arial" w:cs="Arial"/>
-          <w:sz w:val="24"/>
-          <w:szCs w:val="24"/>
-          <w:lang w:eastAsia="pt-PT"/>
-        </w:rPr>
-        <w:pict>
-          <v:rect id="_x0000_i1031" style="width:0;height:1.5pt" o:hralign="center" o:hrstd="t" o:hr="t" fillcolor="#a0a0a0" stroked="f"/>
-        </w:pict>
-      </w:r>
     </w:p>
     <w:p>
       <w:pPr>
@@ -3396,7 +3396,18 @@
           <w:szCs w:val="36"/>
           <w:lang w:eastAsia="pt-PT"/>
         </w:rPr>
-        <w:t>3.5 Auditoria de Dados</w:t>
+        <w:t>5.</w:t>
+      </w:r>
+      <w:r>
+        <w:rPr>
+          <w:rFonts w:ascii="Arial" w:eastAsia="Times New Roman" w:hAnsi="Arial" w:cs="Arial"/>
+          <w:b/>
+          <w:bCs/>
+          <w:sz w:val="36"/>
+          <w:szCs w:val="36"/>
+          <w:lang w:eastAsia="pt-PT"/>
+        </w:rPr>
+        <w:t xml:space="preserve"> Auditoria de Dados</w:t>
       </w:r>
     </w:p>
     <w:p>
@@ -3866,17 +3877,6 @@
           <w:lang w:eastAsia="pt-PT"/>
         </w:rPr>
       </w:pPr>
-      <w:r>
-        <w:rPr>
-          <w:rFonts w:ascii="Arial" w:eastAsia="Times New Roman" w:hAnsi="Arial" w:cs="Arial"/>
-          <w:sz w:val="24"/>
-          <w:szCs w:val="24"/>
-          <w:lang w:eastAsia="pt-PT"/>
-        </w:rPr>
-        <w:pict>
-          <v:rect id="_x0000_i1032" style="width:0;height:1.5pt" o:hralign="center" o:hrstd="t" o:hr="t" fillcolor="#a0a0a0" stroked="f"/>
-        </w:pict>
-      </w:r>
     </w:p>
     <w:p>
       <w:pPr>
@@ -3900,7 +3900,18 @@
           <w:szCs w:val="36"/>
           <w:lang w:eastAsia="pt-PT"/>
         </w:rPr>
-        <w:t>3.6 Segurança das Passwords</w:t>
+        <w:t>6.</w:t>
+      </w:r>
+      <w:r>
+        <w:rPr>
+          <w:rFonts w:ascii="Arial" w:eastAsia="Times New Roman" w:hAnsi="Arial" w:cs="Arial"/>
+          <w:b/>
+          <w:bCs/>
+          <w:sz w:val="36"/>
+          <w:szCs w:val="36"/>
+          <w:lang w:eastAsia="pt-PT"/>
+        </w:rPr>
+        <w:t xml:space="preserve"> Segurança das Passwords</w:t>
       </w:r>
     </w:p>
     <w:p>
@@ -3999,17 +4010,6 @@
           <w:lang w:eastAsia="pt-PT"/>
         </w:rPr>
       </w:pPr>
-      <w:r>
-        <w:rPr>
-          <w:rFonts w:ascii="Arial" w:eastAsia="Times New Roman" w:hAnsi="Arial" w:cs="Arial"/>
-          <w:sz w:val="24"/>
-          <w:szCs w:val="24"/>
-          <w:lang w:eastAsia="pt-PT"/>
-        </w:rPr>
-        <w:pict>
-          <v:rect id="_x0000_i1033" style="width:0;height:1.5pt" o:hralign="center" o:hrstd="t" o:hr="t" fillcolor="#a0a0a0" stroked="f"/>
-        </w:pict>
-      </w:r>
     </w:p>
     <w:p>
       <w:pPr>
@@ -4033,7 +4033,18 @@
           <w:szCs w:val="36"/>
           <w:lang w:eastAsia="pt-PT"/>
         </w:rPr>
-        <w:t>3.7 Gestão de Orçamentos Mensais</w:t>
+        <w:t>7.</w:t>
+      </w:r>
+      <w:r>
+        <w:rPr>
+          <w:rFonts w:ascii="Arial" w:eastAsia="Times New Roman" w:hAnsi="Arial" w:cs="Arial"/>
+          <w:b/>
+          <w:bCs/>
+          <w:sz w:val="36"/>
+          <w:szCs w:val="36"/>
+          <w:lang w:eastAsia="pt-PT"/>
+        </w:rPr>
+        <w:t xml:space="preserve"> Gestão de Orçamentos Mensais</w:t>
       </w:r>
     </w:p>
     <w:p>
@@ -4131,17 +4142,6 @@
           <w:lang w:eastAsia="pt-PT"/>
         </w:rPr>
       </w:pPr>
-      <w:r>
-        <w:rPr>
-          <w:rFonts w:ascii="Arial" w:eastAsia="Times New Roman" w:hAnsi="Arial" w:cs="Arial"/>
-          <w:sz w:val="24"/>
-          <w:szCs w:val="24"/>
-          <w:lang w:eastAsia="pt-PT"/>
-        </w:rPr>
-        <w:pict>
-          <v:rect id="_x0000_i1034" style="width:0;height:1.5pt" o:hralign="center" o:hrstd="t" o:hr="t" fillcolor="#a0a0a0" stroked="f"/>
-        </w:pict>
-      </w:r>
     </w:p>
     <w:p>
       <w:pPr>
@@ -4165,7 +4165,18 @@
           <w:szCs w:val="36"/>
           <w:lang w:eastAsia="pt-PT"/>
         </w:rPr>
-        <w:t>3.8 Filtros e Funcionalidades de Pesquisa</w:t>
+        <w:t>8.</w:t>
+      </w:r>
+      <w:r>
+        <w:rPr>
+          <w:rFonts w:ascii="Arial" w:eastAsia="Times New Roman" w:hAnsi="Arial" w:cs="Arial"/>
+          <w:b/>
+          <w:bCs/>
+          <w:sz w:val="36"/>
+          <w:szCs w:val="36"/>
+          <w:lang w:eastAsia="pt-PT"/>
+        </w:rPr>
+        <w:t xml:space="preserve"> Filtros e Funcionalidades de Pesquisa</w:t>
       </w:r>
     </w:p>
     <w:p>
@@ -4461,18 +4472,6 @@
           <w:lang w:eastAsia="pt-PT"/>
         </w:rPr>
       </w:pPr>
-      <w:r>
-        <w:rPr>
-          <w:rFonts w:ascii="Arial" w:eastAsia="Times New Roman" w:hAnsi="Arial" w:cs="Arial"/>
-          <w:sz w:val="24"/>
-          <w:szCs w:val="24"/>
-          <w:lang w:eastAsia="pt-PT"/>
-        </w:rPr>
-        <w:lastRenderedPageBreak/>
-        <w:pict>
-          <v:rect id="_x0000_i1035" style="width:0;height:1.5pt" o:hralign="center" o:hrstd="t" o:hr="t" fillcolor="#a0a0a0" stroked="f"/>
-        </w:pict>
-      </w:r>
     </w:p>
     <w:p>
       <w:pPr>
@@ -4496,7 +4495,18 @@
           <w:szCs w:val="36"/>
           <w:lang w:eastAsia="pt-PT"/>
         </w:rPr>
-        <w:t>3.9 Estatísticas e Sugestões Inteligentes</w:t>
+        <w:t>9.</w:t>
+      </w:r>
+      <w:r>
+        <w:rPr>
+          <w:rFonts w:ascii="Arial" w:eastAsia="Times New Roman" w:hAnsi="Arial" w:cs="Arial"/>
+          <w:b/>
+          <w:bCs/>
+          <w:sz w:val="36"/>
+          <w:szCs w:val="36"/>
+          <w:lang w:eastAsia="pt-PT"/>
+        </w:rPr>
+        <w:t xml:space="preserve"> Estatísticas e Sugestões Inteligentes</w:t>
       </w:r>
     </w:p>
     <w:p>
@@ -4808,17 +4818,6 @@
           <w:lang w:eastAsia="pt-PT"/>
         </w:rPr>
       </w:pPr>
-      <w:r>
-        <w:rPr>
-          <w:rFonts w:ascii="Arial" w:eastAsia="Times New Roman" w:hAnsi="Arial" w:cs="Arial"/>
-          <w:sz w:val="24"/>
-          <w:szCs w:val="24"/>
-          <w:lang w:eastAsia="pt-PT"/>
-        </w:rPr>
-        <w:pict>
-          <v:rect id="_x0000_i1036" style="width:0;height:1.5pt" o:hralign="center" o:hrstd="t" o:hr="t" fillcolor="#a0a0a0" stroked="f"/>
-        </w:pict>
-      </w:r>
     </w:p>
     <w:p>
       <w:pPr>
@@ -4844,11 +4843,16 @@
           <w:szCs w:val="48"/>
           <w:lang w:eastAsia="pt-PT"/>
         </w:rPr>
-        <w:t>4. Manual de Utilização</w:t>
-      </w:r>
-    </w:p>
-    <w:p>
-      <w:pPr>
+        <w:t>Manual de Utilização</w:t>
+      </w:r>
+    </w:p>
+    <w:p>
+      <w:pPr>
+        <w:pStyle w:val="PargrafodaLista"/>
+        <w:numPr>
+          <w:ilvl w:val="0"/>
+          <w:numId w:val="36"/>
+        </w:numPr>
         <w:spacing w:before="100" w:beforeAutospacing="1" w:after="100" w:afterAutospacing="1" w:line="240" w:lineRule="auto"/>
         <w:outlineLvl w:val="1"/>
         <w:rPr>
@@ -4869,7 +4873,7 @@
           <w:szCs w:val="36"/>
           <w:lang w:eastAsia="pt-PT"/>
         </w:rPr>
-        <w:t>4.1 Introdução</w:t>
+        <w:t xml:space="preserve"> Introdução</w:t>
       </w:r>
     </w:p>
     <w:p>
@@ -5110,21 +5114,14 @@
           <w:lang w:eastAsia="pt-PT"/>
         </w:rPr>
       </w:pPr>
-      <w:r>
-        <w:rPr>
-          <w:rFonts w:ascii="Arial" w:eastAsia="Times New Roman" w:hAnsi="Arial" w:cs="Arial"/>
-          <w:sz w:val="24"/>
-          <w:szCs w:val="24"/>
-          <w:lang w:eastAsia="pt-PT"/>
-        </w:rPr>
-        <w:lastRenderedPageBreak/>
-        <w:pict>
-          <v:rect id="_x0000_i1037" style="width:0;height:1.5pt" o:hralign="center" o:hrstd="t" o:hr="t" fillcolor="#a0a0a0" stroked="f"/>
-        </w:pict>
-      </w:r>
-    </w:p>
-    <w:p>
-      <w:pPr>
+    </w:p>
+    <w:p>
+      <w:pPr>
+        <w:pStyle w:val="PargrafodaLista"/>
+        <w:numPr>
+          <w:ilvl w:val="0"/>
+          <w:numId w:val="36"/>
+        </w:numPr>
         <w:spacing w:before="100" w:beforeAutospacing="1" w:after="100" w:afterAutospacing="1" w:line="240" w:lineRule="auto"/>
         <w:outlineLvl w:val="1"/>
         <w:rPr>
@@ -5145,7 +5142,7 @@
           <w:szCs w:val="36"/>
           <w:lang w:eastAsia="pt-PT"/>
         </w:rPr>
-        <w:t>4.2 Requisitos Técnicos</w:t>
+        <w:t xml:space="preserve"> Requisitos Técnicos</w:t>
       </w:r>
     </w:p>
     <w:p>
@@ -5305,20 +5302,14 @@
           <w:lang w:eastAsia="pt-PT"/>
         </w:rPr>
       </w:pPr>
-      <w:r>
-        <w:rPr>
-          <w:rFonts w:ascii="Arial" w:eastAsia="Times New Roman" w:hAnsi="Arial" w:cs="Arial"/>
-          <w:sz w:val="24"/>
-          <w:szCs w:val="24"/>
-          <w:lang w:eastAsia="pt-PT"/>
-        </w:rPr>
-        <w:pict>
-          <v:rect id="_x0000_i1038" style="width:0;height:1.5pt" o:hralign="center" o:hrstd="t" o:hr="t" fillcolor="#a0a0a0" stroked="f"/>
-        </w:pict>
-      </w:r>
-    </w:p>
-    <w:p>
-      <w:pPr>
+    </w:p>
+    <w:p>
+      <w:pPr>
+        <w:pStyle w:val="PargrafodaLista"/>
+        <w:numPr>
+          <w:ilvl w:val="0"/>
+          <w:numId w:val="36"/>
+        </w:numPr>
         <w:spacing w:before="100" w:beforeAutospacing="1" w:after="100" w:afterAutospacing="1" w:line="240" w:lineRule="auto"/>
         <w:outlineLvl w:val="1"/>
         <w:rPr>
@@ -5339,7 +5330,7 @@
           <w:szCs w:val="36"/>
           <w:lang w:eastAsia="pt-PT"/>
         </w:rPr>
-        <w:t>4.3 Execução da Aplicação</w:t>
+        <w:t xml:space="preserve"> Execução da Aplicação</w:t>
       </w:r>
     </w:p>
     <w:p>
@@ -5544,20 +5535,14 @@
           <w:lang w:eastAsia="pt-PT"/>
         </w:rPr>
       </w:pPr>
-      <w:r>
-        <w:rPr>
-          <w:rFonts w:ascii="Arial" w:eastAsia="Times New Roman" w:hAnsi="Arial" w:cs="Arial"/>
-          <w:sz w:val="24"/>
-          <w:szCs w:val="24"/>
-          <w:lang w:eastAsia="pt-PT"/>
-        </w:rPr>
-        <w:pict>
-          <v:rect id="_x0000_i1039" style="width:0;height:1.5pt" o:hralign="center" o:hrstd="t" o:hr="t" fillcolor="#a0a0a0" stroked="f"/>
-        </w:pict>
-      </w:r>
-    </w:p>
-    <w:p>
-      <w:pPr>
+    </w:p>
+    <w:p>
+      <w:pPr>
+        <w:pStyle w:val="PargrafodaLista"/>
+        <w:numPr>
+          <w:ilvl w:val="0"/>
+          <w:numId w:val="14"/>
+        </w:numPr>
         <w:spacing w:before="100" w:beforeAutospacing="1" w:after="100" w:afterAutospacing="1" w:line="240" w:lineRule="auto"/>
         <w:outlineLvl w:val="1"/>
         <w:rPr>
@@ -5578,7 +5563,7 @@
           <w:szCs w:val="36"/>
           <w:lang w:eastAsia="pt-PT"/>
         </w:rPr>
-        <w:t>4.4 Autenticação</w:t>
+        <w:t xml:space="preserve"> Autenticação</w:t>
       </w:r>
     </w:p>
     <w:p>
@@ -5867,20 +5852,14 @@
           <w:lang w:eastAsia="pt-PT"/>
         </w:rPr>
       </w:pPr>
-      <w:r>
-        <w:rPr>
-          <w:rFonts w:ascii="Arial" w:eastAsia="Times New Roman" w:hAnsi="Arial" w:cs="Arial"/>
-          <w:sz w:val="24"/>
-          <w:szCs w:val="24"/>
-          <w:lang w:eastAsia="pt-PT"/>
-        </w:rPr>
-        <w:pict>
-          <v:rect id="_x0000_i1040" style="width:0;height:1.5pt" o:hralign="center" o:hrstd="t" o:hr="t" fillcolor="#a0a0a0" stroked="f"/>
-        </w:pict>
-      </w:r>
-    </w:p>
-    <w:p>
-      <w:pPr>
+    </w:p>
+    <w:p>
+      <w:pPr>
+        <w:pStyle w:val="PargrafodaLista"/>
+        <w:numPr>
+          <w:ilvl w:val="0"/>
+          <w:numId w:val="14"/>
+        </w:numPr>
         <w:spacing w:before="100" w:beforeAutospacing="1" w:after="100" w:afterAutospacing="1" w:line="240" w:lineRule="auto"/>
         <w:outlineLvl w:val="1"/>
         <w:rPr>
@@ -5901,7 +5880,7 @@
           <w:szCs w:val="36"/>
           <w:lang w:eastAsia="pt-PT"/>
         </w:rPr>
-        <w:t>4.5 Janela Principal</w:t>
+        <w:t xml:space="preserve"> Janela Principal</w:t>
       </w:r>
     </w:p>
     <w:p>
@@ -6345,20 +6324,14 @@
           <w:lang w:eastAsia="pt-PT"/>
         </w:rPr>
       </w:pPr>
-      <w:r>
-        <w:rPr>
-          <w:rFonts w:ascii="Arial" w:eastAsia="Times New Roman" w:hAnsi="Arial" w:cs="Arial"/>
-          <w:sz w:val="24"/>
-          <w:szCs w:val="24"/>
-          <w:lang w:eastAsia="pt-PT"/>
-        </w:rPr>
-        <w:pict>
-          <v:rect id="_x0000_i1041" style="width:0;height:1.5pt" o:hralign="center" o:hrstd="t" o:hr="t" fillcolor="#a0a0a0" stroked="f"/>
-        </w:pict>
-      </w:r>
-    </w:p>
-    <w:p>
-      <w:pPr>
+    </w:p>
+    <w:p>
+      <w:pPr>
+        <w:pStyle w:val="PargrafodaLista"/>
+        <w:numPr>
+          <w:ilvl w:val="0"/>
+          <w:numId w:val="14"/>
+        </w:numPr>
         <w:spacing w:before="100" w:beforeAutospacing="1" w:after="100" w:afterAutospacing="1" w:line="240" w:lineRule="auto"/>
         <w:outlineLvl w:val="1"/>
         <w:rPr>
@@ -6379,7 +6352,7 @@
           <w:szCs w:val="36"/>
           <w:lang w:eastAsia="pt-PT"/>
         </w:rPr>
-        <w:t>4.6 Gestão de Utilizadores</w:t>
+        <w:t xml:space="preserve"> Gestão de Utilizadores</w:t>
       </w:r>
     </w:p>
     <w:p>
@@ -6587,20 +6560,14 @@
           <w:lang w:eastAsia="pt-PT"/>
         </w:rPr>
       </w:pPr>
-      <w:r>
-        <w:rPr>
-          <w:rFonts w:ascii="Arial" w:eastAsia="Times New Roman" w:hAnsi="Arial" w:cs="Arial"/>
-          <w:sz w:val="24"/>
-          <w:szCs w:val="24"/>
-          <w:lang w:eastAsia="pt-PT"/>
-        </w:rPr>
-        <w:pict>
-          <v:rect id="_x0000_i1042" style="width:0;height:1.5pt" o:hralign="center" o:hrstd="t" o:hr="t" fillcolor="#a0a0a0" stroked="f"/>
-        </w:pict>
-      </w:r>
-    </w:p>
-    <w:p>
-      <w:pPr>
+    </w:p>
+    <w:p>
+      <w:pPr>
+        <w:pStyle w:val="PargrafodaLista"/>
+        <w:numPr>
+          <w:ilvl w:val="0"/>
+          <w:numId w:val="14"/>
+        </w:numPr>
         <w:spacing w:before="100" w:beforeAutospacing="1" w:after="100" w:afterAutospacing="1" w:line="240" w:lineRule="auto"/>
         <w:outlineLvl w:val="1"/>
         <w:rPr>
@@ -6622,7 +6589,7 @@
           <w:lang w:eastAsia="pt-PT"/>
         </w:rPr>
         <w:lastRenderedPageBreak/>
-        <w:t>4.7 Gestão de Tipos de Artigo</w:t>
+        <w:t xml:space="preserve"> Gestão de Tipos de Artigo</w:t>
       </w:r>
     </w:p>
     <w:p>
@@ -6767,20 +6734,14 @@
           <w:lang w:eastAsia="pt-PT"/>
         </w:rPr>
       </w:pPr>
-      <w:r>
-        <w:rPr>
-          <w:rFonts w:ascii="Arial" w:eastAsia="Times New Roman" w:hAnsi="Arial" w:cs="Arial"/>
-          <w:sz w:val="24"/>
-          <w:szCs w:val="24"/>
-          <w:lang w:eastAsia="pt-PT"/>
-        </w:rPr>
-        <w:pict>
-          <v:rect id="_x0000_i1043" style="width:0;height:1.5pt" o:hralign="center" o:hrstd="t" o:hr="t" fillcolor="#a0a0a0" stroked="f"/>
-        </w:pict>
-      </w:r>
-    </w:p>
-    <w:p>
-      <w:pPr>
+    </w:p>
+    <w:p>
+      <w:pPr>
+        <w:pStyle w:val="PargrafodaLista"/>
+        <w:numPr>
+          <w:ilvl w:val="0"/>
+          <w:numId w:val="14"/>
+        </w:numPr>
         <w:spacing w:before="100" w:beforeAutospacing="1" w:after="100" w:afterAutospacing="1" w:line="240" w:lineRule="auto"/>
         <w:outlineLvl w:val="1"/>
         <w:rPr>
@@ -6801,7 +6762,7 @@
           <w:szCs w:val="36"/>
           <w:lang w:eastAsia="pt-PT"/>
         </w:rPr>
-        <w:t>4.8 Gestão de Artigos</w:t>
+        <w:t xml:space="preserve"> Gestão de Artigos</w:t>
       </w:r>
     </w:p>
     <w:p>
@@ -6950,20 +6911,14 @@
           <w:lang w:eastAsia="pt-PT"/>
         </w:rPr>
       </w:pPr>
-      <w:r>
-        <w:rPr>
-          <w:rFonts w:ascii="Arial" w:eastAsia="Times New Roman" w:hAnsi="Arial" w:cs="Arial"/>
-          <w:sz w:val="24"/>
-          <w:szCs w:val="24"/>
-          <w:lang w:eastAsia="pt-PT"/>
-        </w:rPr>
-        <w:pict>
-          <v:rect id="_x0000_i1044" style="width:0;height:1.5pt" o:hralign="center" o:hrstd="t" o:hr="t" fillcolor="#a0a0a0" stroked="f"/>
-        </w:pict>
-      </w:r>
-    </w:p>
-    <w:p>
-      <w:pPr>
+    </w:p>
+    <w:p>
+      <w:pPr>
+        <w:pStyle w:val="PargrafodaLista"/>
+        <w:numPr>
+          <w:ilvl w:val="0"/>
+          <w:numId w:val="14"/>
+        </w:numPr>
         <w:spacing w:before="100" w:beforeAutospacing="1" w:after="100" w:afterAutospacing="1" w:line="240" w:lineRule="auto"/>
         <w:outlineLvl w:val="1"/>
         <w:rPr>
@@ -6984,7 +6939,7 @@
           <w:szCs w:val="36"/>
           <w:lang w:eastAsia="pt-PT"/>
         </w:rPr>
-        <w:t>4.9 Gestão de Orçamentos</w:t>
+        <w:t xml:space="preserve"> Gestão de Orçamentos</w:t>
       </w:r>
     </w:p>
     <w:p>
@@ -7129,20 +7084,14 @@
           <w:lang w:eastAsia="pt-PT"/>
         </w:rPr>
       </w:pPr>
-      <w:r>
-        <w:rPr>
-          <w:rFonts w:ascii="Arial" w:eastAsia="Times New Roman" w:hAnsi="Arial" w:cs="Arial"/>
-          <w:sz w:val="24"/>
-          <w:szCs w:val="24"/>
-          <w:lang w:eastAsia="pt-PT"/>
-        </w:rPr>
-        <w:pict>
-          <v:rect id="_x0000_i1045" style="width:0;height:1.5pt" o:hralign="center" o:hrstd="t" o:hr="t" fillcolor="#a0a0a0" stroked="f"/>
-        </w:pict>
-      </w:r>
-    </w:p>
-    <w:p>
-      <w:pPr>
+    </w:p>
+    <w:p>
+      <w:pPr>
+        <w:pStyle w:val="PargrafodaLista"/>
+        <w:numPr>
+          <w:ilvl w:val="0"/>
+          <w:numId w:val="14"/>
+        </w:numPr>
         <w:spacing w:before="100" w:beforeAutospacing="1" w:after="100" w:afterAutospacing="1" w:line="240" w:lineRule="auto"/>
         <w:outlineLvl w:val="1"/>
         <w:rPr>
@@ -7163,7 +7112,7 @@
           <w:szCs w:val="36"/>
           <w:lang w:eastAsia="pt-PT"/>
         </w:rPr>
-        <w:t>4.10 Planeamento de Compras</w:t>
+        <w:t>Planeamento de Compras</w:t>
       </w:r>
     </w:p>
     <w:p>
@@ -7399,6 +7348,11 @@
     </w:p>
     <w:p>
       <w:pPr>
+        <w:pStyle w:val="PargrafodaLista"/>
+        <w:numPr>
+          <w:ilvl w:val="0"/>
+          <w:numId w:val="14"/>
+        </w:numPr>
         <w:spacing w:before="100" w:beforeAutospacing="1" w:after="100" w:afterAutospacing="1" w:line="240" w:lineRule="auto"/>
         <w:outlineLvl w:val="1"/>
         <w:rPr>
@@ -7419,7 +7373,7 @@
           <w:szCs w:val="36"/>
           <w:lang w:eastAsia="pt-PT"/>
         </w:rPr>
-        <w:t>4.11 Edição de Compras</w:t>
+        <w:t xml:space="preserve"> Edição de Compras</w:t>
       </w:r>
     </w:p>
     <w:p>
@@ -7659,20 +7613,14 @@
           <w:lang w:eastAsia="pt-PT"/>
         </w:rPr>
       </w:pPr>
-      <w:r>
-        <w:rPr>
-          <w:rFonts w:ascii="Arial" w:eastAsia="Times New Roman" w:hAnsi="Arial" w:cs="Arial"/>
-          <w:sz w:val="24"/>
-          <w:szCs w:val="24"/>
-          <w:lang w:eastAsia="pt-PT"/>
-        </w:rPr>
-        <w:pict>
-          <v:rect id="_x0000_i1047" style="width:0;height:1.5pt" o:hralign="center" o:hrstd="t" o:hr="t" fillcolor="#a0a0a0" stroked="f"/>
-        </w:pict>
-      </w:r>
-    </w:p>
-    <w:p>
-      <w:pPr>
+    </w:p>
+    <w:p>
+      <w:pPr>
+        <w:pStyle w:val="PargrafodaLista"/>
+        <w:numPr>
+          <w:ilvl w:val="0"/>
+          <w:numId w:val="14"/>
+        </w:numPr>
         <w:spacing w:before="100" w:beforeAutospacing="1" w:after="100" w:afterAutospacing="1" w:line="240" w:lineRule="auto"/>
         <w:outlineLvl w:val="1"/>
         <w:rPr>
@@ -7693,7 +7641,7 @@
           <w:szCs w:val="36"/>
           <w:lang w:eastAsia="pt-PT"/>
         </w:rPr>
-        <w:t>4.12 Modo Compra</w:t>
+        <w:t xml:space="preserve"> Modo Compra</w:t>
       </w:r>
     </w:p>
     <w:p>
@@ -8075,20 +8023,14 @@
           <w:lang w:eastAsia="pt-PT"/>
         </w:rPr>
       </w:pPr>
-      <w:r>
-        <w:rPr>
-          <w:rFonts w:ascii="Arial" w:eastAsia="Times New Roman" w:hAnsi="Arial" w:cs="Arial"/>
-          <w:sz w:val="24"/>
-          <w:szCs w:val="24"/>
-          <w:lang w:eastAsia="pt-PT"/>
-        </w:rPr>
-        <w:pict>
-          <v:rect id="_x0000_i1048" style="width:0;height:1.5pt" o:hralign="center" o:hrstd="t" o:hr="t" fillcolor="#a0a0a0" stroked="f"/>
-        </w:pict>
-      </w:r>
-    </w:p>
-    <w:p>
-      <w:pPr>
+    </w:p>
+    <w:p>
+      <w:pPr>
+        <w:pStyle w:val="PargrafodaLista"/>
+        <w:numPr>
+          <w:ilvl w:val="0"/>
+          <w:numId w:val="14"/>
+        </w:numPr>
         <w:spacing w:before="100" w:beforeAutospacing="1" w:after="100" w:afterAutospacing="1" w:line="240" w:lineRule="auto"/>
         <w:outlineLvl w:val="1"/>
         <w:rPr>
@@ -8109,7 +8051,7 @@
           <w:szCs w:val="36"/>
           <w:lang w:eastAsia="pt-PT"/>
         </w:rPr>
-        <w:t>4.13 Estatísticas</w:t>
+        <w:t xml:space="preserve"> Estatísticas</w:t>
       </w:r>
     </w:p>
     <w:p>
@@ -8356,20 +8298,14 @@
           <w:lang w:eastAsia="pt-PT"/>
         </w:rPr>
       </w:pPr>
-      <w:r>
-        <w:rPr>
-          <w:rFonts w:ascii="Arial" w:eastAsia="Times New Roman" w:hAnsi="Arial" w:cs="Arial"/>
-          <w:sz w:val="24"/>
-          <w:szCs w:val="24"/>
-          <w:lang w:eastAsia="pt-PT"/>
-        </w:rPr>
-        <w:pict>
-          <v:rect id="_x0000_i1049" style="width:0;height:1.5pt" o:hralign="center" o:hrstd="t" o:hr="t" fillcolor="#a0a0a0" stroked="f"/>
-        </w:pict>
-      </w:r>
-    </w:p>
-    <w:p>
-      <w:pPr>
+    </w:p>
+    <w:p>
+      <w:pPr>
+        <w:pStyle w:val="PargrafodaLista"/>
+        <w:numPr>
+          <w:ilvl w:val="0"/>
+          <w:numId w:val="14"/>
+        </w:numPr>
         <w:spacing w:before="100" w:beforeAutospacing="1" w:after="100" w:afterAutospacing="1" w:line="240" w:lineRule="auto"/>
         <w:outlineLvl w:val="1"/>
         <w:rPr>
@@ -8390,7 +8326,7 @@
           <w:szCs w:val="36"/>
           <w:lang w:eastAsia="pt-PT"/>
         </w:rPr>
-        <w:t>4.14 Exportação para CSV</w:t>
+        <w:t xml:space="preserve"> Exportação para CSV</w:t>
       </w:r>
     </w:p>
     <w:p>
@@ -10937,6 +10873,95 @@
     </w:lvl>
   </w:abstractNum>
   <w:abstractNum w:abstractNumId="15" w15:restartNumberingAfterBreak="0">
+    <w:nsid w:val="37307B55"/>
+    <w:multiLevelType w:val="hybridMultilevel"/>
+    <w:tmpl w:val="3FB0C828"/>
+    <w:lvl w:ilvl="0" w:tplc="0816000F">
+      <w:start w:val="1"/>
+      <w:numFmt w:val="decimal"/>
+      <w:lvlText w:val="%1."/>
+      <w:lvlJc w:val="left"/>
+      <w:pPr>
+        <w:ind w:left="720" w:hanging="360"/>
+      </w:pPr>
+      <w:rPr>
+        <w:rFonts w:hint="default"/>
+      </w:rPr>
+    </w:lvl>
+    <w:lvl w:ilvl="1" w:tplc="08160019" w:tentative="1">
+      <w:start w:val="1"/>
+      <w:numFmt w:val="lowerLetter"/>
+      <w:lvlText w:val="%2."/>
+      <w:lvlJc w:val="left"/>
+      <w:pPr>
+        <w:ind w:left="1440" w:hanging="360"/>
+      </w:pPr>
+    </w:lvl>
+    <w:lvl w:ilvl="2" w:tplc="0816001B" w:tentative="1">
+      <w:start w:val="1"/>
+      <w:numFmt w:val="lowerRoman"/>
+      <w:lvlText w:val="%3."/>
+      <w:lvlJc w:val="right"/>
+      <w:pPr>
+        <w:ind w:left="2160" w:hanging="180"/>
+      </w:pPr>
+    </w:lvl>
+    <w:lvl w:ilvl="3" w:tplc="0816000F" w:tentative="1">
+      <w:start w:val="1"/>
+      <w:numFmt w:val="decimal"/>
+      <w:lvlText w:val="%4."/>
+      <w:lvlJc w:val="left"/>
+      <w:pPr>
+        <w:ind w:left="2880" w:hanging="360"/>
+      </w:pPr>
+    </w:lvl>
+    <w:lvl w:ilvl="4" w:tplc="08160019" w:tentative="1">
+      <w:start w:val="1"/>
+      <w:numFmt w:val="lowerLetter"/>
+      <w:lvlText w:val="%5."/>
+      <w:lvlJc w:val="left"/>
+      <w:pPr>
+        <w:ind w:left="3600" w:hanging="360"/>
+      </w:pPr>
+    </w:lvl>
+    <w:lvl w:ilvl="5" w:tplc="0816001B" w:tentative="1">
+      <w:start w:val="1"/>
+      <w:numFmt w:val="lowerRoman"/>
+      <w:lvlText w:val="%6."/>
+      <w:lvlJc w:val="right"/>
+      <w:pPr>
+        <w:ind w:left="4320" w:hanging="180"/>
+      </w:pPr>
+    </w:lvl>
+    <w:lvl w:ilvl="6" w:tplc="0816000F" w:tentative="1">
+      <w:start w:val="1"/>
+      <w:numFmt w:val="decimal"/>
+      <w:lvlText w:val="%7."/>
+      <w:lvlJc w:val="left"/>
+      <w:pPr>
+        <w:ind w:left="5040" w:hanging="360"/>
+      </w:pPr>
+    </w:lvl>
+    <w:lvl w:ilvl="7" w:tplc="08160019" w:tentative="1">
+      <w:start w:val="1"/>
+      <w:numFmt w:val="lowerLetter"/>
+      <w:lvlText w:val="%8."/>
+      <w:lvlJc w:val="left"/>
+      <w:pPr>
+        <w:ind w:left="5760" w:hanging="360"/>
+      </w:pPr>
+    </w:lvl>
+    <w:lvl w:ilvl="8" w:tplc="0816001B" w:tentative="1">
+      <w:start w:val="1"/>
+      <w:numFmt w:val="lowerRoman"/>
+      <w:lvlText w:val="%9."/>
+      <w:lvlJc w:val="right"/>
+      <w:pPr>
+        <w:ind w:left="6480" w:hanging="180"/>
+      </w:pPr>
+    </w:lvl>
+  </w:abstractNum>
+  <w:abstractNum w:abstractNumId="16" w15:restartNumberingAfterBreak="0">
     <w:nsid w:val="3BCA7715"/>
     <w:multiLevelType w:val="multilevel"/>
     <w:tmpl w:val="6B367216"/>
@@ -11085,7 +11110,7 @@
       </w:rPr>
     </w:lvl>
   </w:abstractNum>
-  <w:abstractNum w:abstractNumId="16" w15:restartNumberingAfterBreak="0">
+  <w:abstractNum w:abstractNumId="17" w15:restartNumberingAfterBreak="0">
     <w:nsid w:val="3D551BAA"/>
     <w:multiLevelType w:val="multilevel"/>
     <w:tmpl w:val="0EE48DC0"/>
@@ -11234,7 +11259,7 @@
       </w:rPr>
     </w:lvl>
   </w:abstractNum>
-  <w:abstractNum w:abstractNumId="17" w15:restartNumberingAfterBreak="0">
+  <w:abstractNum w:abstractNumId="18" w15:restartNumberingAfterBreak="0">
     <w:nsid w:val="40B40698"/>
     <w:multiLevelType w:val="multilevel"/>
     <w:tmpl w:val="2DFC6652"/>
@@ -11383,7 +11408,7 @@
       </w:rPr>
     </w:lvl>
   </w:abstractNum>
-  <w:abstractNum w:abstractNumId="18" w15:restartNumberingAfterBreak="0">
+  <w:abstractNum w:abstractNumId="19" w15:restartNumberingAfterBreak="0">
     <w:nsid w:val="414123E9"/>
     <w:multiLevelType w:val="multilevel"/>
     <w:tmpl w:val="9A6C9590"/>
@@ -11532,7 +11557,7 @@
       </w:rPr>
     </w:lvl>
   </w:abstractNum>
-  <w:abstractNum w:abstractNumId="19" w15:restartNumberingAfterBreak="0">
+  <w:abstractNum w:abstractNumId="20" w15:restartNumberingAfterBreak="0">
     <w:nsid w:val="425E5B44"/>
     <w:multiLevelType w:val="multilevel"/>
     <w:tmpl w:val="F8B275D0"/>
@@ -11681,7 +11706,7 @@
       </w:rPr>
     </w:lvl>
   </w:abstractNum>
-  <w:abstractNum w:abstractNumId="20" w15:restartNumberingAfterBreak="0">
+  <w:abstractNum w:abstractNumId="21" w15:restartNumberingAfterBreak="0">
     <w:nsid w:val="42D11892"/>
     <w:multiLevelType w:val="multilevel"/>
     <w:tmpl w:val="8AB49C42"/>
@@ -11830,7 +11855,7 @@
       </w:rPr>
     </w:lvl>
   </w:abstractNum>
-  <w:abstractNum w:abstractNumId="21" w15:restartNumberingAfterBreak="0">
+  <w:abstractNum w:abstractNumId="22" w15:restartNumberingAfterBreak="0">
     <w:nsid w:val="43304F5C"/>
     <w:multiLevelType w:val="multilevel"/>
     <w:tmpl w:val="7BA84A6C"/>
@@ -11979,7 +12004,7 @@
       </w:rPr>
     </w:lvl>
   </w:abstractNum>
-  <w:abstractNum w:abstractNumId="22" w15:restartNumberingAfterBreak="0">
+  <w:abstractNum w:abstractNumId="23" w15:restartNumberingAfterBreak="0">
     <w:nsid w:val="471710E7"/>
     <w:multiLevelType w:val="multilevel"/>
     <w:tmpl w:val="418AA56C"/>
@@ -12128,7 +12153,7 @@
       </w:rPr>
     </w:lvl>
   </w:abstractNum>
-  <w:abstractNum w:abstractNumId="23" w15:restartNumberingAfterBreak="0">
+  <w:abstractNum w:abstractNumId="24" w15:restartNumberingAfterBreak="0">
     <w:nsid w:val="4A141866"/>
     <w:multiLevelType w:val="multilevel"/>
     <w:tmpl w:val="521EA36A"/>
@@ -12277,7 +12302,7 @@
       </w:rPr>
     </w:lvl>
   </w:abstractNum>
-  <w:abstractNum w:abstractNumId="24" w15:restartNumberingAfterBreak="0">
+  <w:abstractNum w:abstractNumId="25" w15:restartNumberingAfterBreak="0">
     <w:nsid w:val="4C4237BB"/>
     <w:multiLevelType w:val="multilevel"/>
     <w:tmpl w:val="5D68C748"/>
@@ -12426,7 +12451,7 @@
       </w:rPr>
     </w:lvl>
   </w:abstractNum>
-  <w:abstractNum w:abstractNumId="25" w15:restartNumberingAfterBreak="0">
+  <w:abstractNum w:abstractNumId="26" w15:restartNumberingAfterBreak="0">
     <w:nsid w:val="52C7652F"/>
     <w:multiLevelType w:val="multilevel"/>
     <w:tmpl w:val="31F85AD2"/>
@@ -12575,7 +12600,7 @@
       </w:rPr>
     </w:lvl>
   </w:abstractNum>
-  <w:abstractNum w:abstractNumId="26" w15:restartNumberingAfterBreak="0">
+  <w:abstractNum w:abstractNumId="27" w15:restartNumberingAfterBreak="0">
     <w:nsid w:val="53A774DC"/>
     <w:multiLevelType w:val="multilevel"/>
     <w:tmpl w:val="FA485EF0"/>
@@ -12724,7 +12749,7 @@
       </w:rPr>
     </w:lvl>
   </w:abstractNum>
-  <w:abstractNum w:abstractNumId="27" w15:restartNumberingAfterBreak="0">
+  <w:abstractNum w:abstractNumId="28" w15:restartNumberingAfterBreak="0">
     <w:nsid w:val="5BE47111"/>
     <w:multiLevelType w:val="multilevel"/>
     <w:tmpl w:val="E65A8D64"/>
@@ -12873,7 +12898,7 @@
       </w:rPr>
     </w:lvl>
   </w:abstractNum>
-  <w:abstractNum w:abstractNumId="28" w15:restartNumberingAfterBreak="0">
+  <w:abstractNum w:abstractNumId="29" w15:restartNumberingAfterBreak="0">
     <w:nsid w:val="5FF050E6"/>
     <w:multiLevelType w:val="multilevel"/>
     <w:tmpl w:val="76B6A6C4"/>
@@ -13022,7 +13047,7 @@
       </w:rPr>
     </w:lvl>
   </w:abstractNum>
-  <w:abstractNum w:abstractNumId="29" w15:restartNumberingAfterBreak="0">
+  <w:abstractNum w:abstractNumId="30" w15:restartNumberingAfterBreak="0">
     <w:nsid w:val="6E546604"/>
     <w:multiLevelType w:val="multilevel"/>
     <w:tmpl w:val="E1DA276A"/>
@@ -13135,7 +13160,7 @@
       </w:pPr>
     </w:lvl>
   </w:abstractNum>
-  <w:abstractNum w:abstractNumId="30" w15:restartNumberingAfterBreak="0">
+  <w:abstractNum w:abstractNumId="31" w15:restartNumberingAfterBreak="0">
     <w:nsid w:val="721F700A"/>
     <w:multiLevelType w:val="multilevel"/>
     <w:tmpl w:val="0EF41ED6"/>
@@ -13284,7 +13309,7 @@
       </w:rPr>
     </w:lvl>
   </w:abstractNum>
-  <w:abstractNum w:abstractNumId="31" w15:restartNumberingAfterBreak="0">
+  <w:abstractNum w:abstractNumId="32" w15:restartNumberingAfterBreak="0">
     <w:nsid w:val="7A276DA6"/>
     <w:multiLevelType w:val="multilevel"/>
     <w:tmpl w:val="7220D318"/>
@@ -13433,7 +13458,7 @@
       </w:rPr>
     </w:lvl>
   </w:abstractNum>
-  <w:abstractNum w:abstractNumId="32" w15:restartNumberingAfterBreak="0">
+  <w:abstractNum w:abstractNumId="33" w15:restartNumberingAfterBreak="0">
     <w:nsid w:val="7B023BC3"/>
     <w:multiLevelType w:val="multilevel"/>
     <w:tmpl w:val="E64ED1E2"/>
@@ -13582,7 +13607,7 @@
       </w:rPr>
     </w:lvl>
   </w:abstractNum>
-  <w:abstractNum w:abstractNumId="33" w15:restartNumberingAfterBreak="0">
+  <w:abstractNum w:abstractNumId="34" w15:restartNumberingAfterBreak="0">
     <w:nsid w:val="7F0E0318"/>
     <w:multiLevelType w:val="multilevel"/>
     <w:tmpl w:val="9F1ED99A"/>
@@ -13731,7 +13756,7 @@
       </w:rPr>
     </w:lvl>
   </w:abstractNum>
-  <w:abstractNum w:abstractNumId="34" w15:restartNumberingAfterBreak="0">
+  <w:abstractNum w:abstractNumId="35" w15:restartNumberingAfterBreak="0">
     <w:nsid w:val="7F6B05B9"/>
     <w:multiLevelType w:val="multilevel"/>
     <w:tmpl w:val="673AA9AA"/>
@@ -13881,16 +13906,16 @@
     </w:lvl>
   </w:abstractNum>
   <w:num w:numId="1">
-    <w:abstractNumId w:val="24"/>
+    <w:abstractNumId w:val="25"/>
   </w:num>
   <w:num w:numId="2">
-    <w:abstractNumId w:val="31"/>
+    <w:abstractNumId w:val="32"/>
   </w:num>
   <w:num w:numId="3">
-    <w:abstractNumId w:val="27"/>
+    <w:abstractNumId w:val="28"/>
   </w:num>
   <w:num w:numId="4">
-    <w:abstractNumId w:val="28"/>
+    <w:abstractNumId w:val="29"/>
   </w:num>
   <w:num w:numId="5">
     <w:abstractNumId w:val="5"/>
@@ -13899,13 +13924,13 @@
     <w:abstractNumId w:val="2"/>
   </w:num>
   <w:num w:numId="7">
-    <w:abstractNumId w:val="34"/>
+    <w:abstractNumId w:val="35"/>
   </w:num>
   <w:num w:numId="8">
     <w:abstractNumId w:val="14"/>
   </w:num>
   <w:num w:numId="9">
-    <w:abstractNumId w:val="20"/>
+    <w:abstractNumId w:val="21"/>
   </w:num>
   <w:num w:numId="10">
     <w:abstractNumId w:val="7"/>
@@ -13920,16 +13945,16 @@
     <w:abstractNumId w:val="9"/>
   </w:num>
   <w:num w:numId="14">
-    <w:abstractNumId w:val="29"/>
+    <w:abstractNumId w:val="30"/>
   </w:num>
   <w:num w:numId="15">
-    <w:abstractNumId w:val="23"/>
+    <w:abstractNumId w:val="24"/>
   </w:num>
   <w:num w:numId="16">
-    <w:abstractNumId w:val="26"/>
+    <w:abstractNumId w:val="27"/>
   </w:num>
   <w:num w:numId="17">
-    <w:abstractNumId w:val="19"/>
+    <w:abstractNumId w:val="20"/>
   </w:num>
   <w:num w:numId="18">
     <w:abstractNumId w:val="11"/>
@@ -13938,16 +13963,16 @@
     <w:abstractNumId w:val="4"/>
   </w:num>
   <w:num w:numId="20">
-    <w:abstractNumId w:val="18"/>
+    <w:abstractNumId w:val="19"/>
   </w:num>
   <w:num w:numId="21">
     <w:abstractNumId w:val="12"/>
   </w:num>
   <w:num w:numId="22">
-    <w:abstractNumId w:val="30"/>
+    <w:abstractNumId w:val="31"/>
   </w:num>
   <w:num w:numId="23">
-    <w:abstractNumId w:val="15"/>
+    <w:abstractNumId w:val="16"/>
   </w:num>
   <w:num w:numId="24">
     <w:abstractNumId w:val="6"/>
@@ -13956,16 +13981,16 @@
     <w:abstractNumId w:val="8"/>
   </w:num>
   <w:num w:numId="26">
-    <w:abstractNumId w:val="16"/>
+    <w:abstractNumId w:val="17"/>
   </w:num>
   <w:num w:numId="27">
-    <w:abstractNumId w:val="25"/>
+    <w:abstractNumId w:val="26"/>
   </w:num>
   <w:num w:numId="28">
-    <w:abstractNumId w:val="17"/>
+    <w:abstractNumId w:val="18"/>
   </w:num>
   <w:num w:numId="29">
-    <w:abstractNumId w:val="32"/>
+    <w:abstractNumId w:val="33"/>
   </w:num>
   <w:num w:numId="30">
     <w:abstractNumId w:val="10"/>
@@ -13977,13 +14002,16 @@
     <w:abstractNumId w:val="0"/>
   </w:num>
   <w:num w:numId="33">
-    <w:abstractNumId w:val="33"/>
+    <w:abstractNumId w:val="34"/>
   </w:num>
   <w:num w:numId="34">
-    <w:abstractNumId w:val="21"/>
+    <w:abstractNumId w:val="22"/>
   </w:num>
   <w:num w:numId="35">
-    <w:abstractNumId w:val="22"/>
+    <w:abstractNumId w:val="23"/>
+  </w:num>
+  <w:num w:numId="36">
+    <w:abstractNumId w:val="15"/>
   </w:num>
 </w:numbering>
 </file>
@@ -14584,6 +14612,17 @@
       <w:bCs/>
     </w:rPr>
   </w:style>
+  <w:style w:type="paragraph" w:styleId="PargrafodaLista">
+    <w:name w:val="List Paragraph"/>
+    <w:basedOn w:val="Normal"/>
+    <w:uiPriority w:val="34"/>
+    <w:qFormat/>
+    <w:rsid w:val="002A1F70"/>
+    <w:pPr>
+      <w:ind w:left="720"/>
+      <w:contextualSpacing/>
+    </w:pPr>
+  </w:style>
 </w:styles>
 </file>
 

</xml_diff>

<commit_message>
Commit até a pagina 9
</commit_message>
<xml_diff>
--- a/iShoppingKelly/Relatório.docx
+++ b/iShoppingKelly/Relatório.docx
@@ -16,7 +16,6 @@
           <w:lang w:eastAsia="pt-PT"/>
         </w:rPr>
       </w:pPr>
-      <w:proofErr w:type="spellStart"/>
       <w:r>
         <w:rPr>
           <w:rFonts w:ascii="Arial" w:eastAsia="Times New Roman" w:hAnsi="Arial" w:cs="Arial"/>
@@ -29,7 +28,6 @@
         </w:rPr>
         <w:t>iShoppingKelly</w:t>
       </w:r>
-      <w:proofErr w:type="spellEnd"/>
     </w:p>
     <w:p>
       <w:pPr>
@@ -365,19 +363,8 @@
                 <w:szCs w:val="24"/>
                 <w:lang w:eastAsia="pt-PT"/>
               </w:rPr>
-              <w:t xml:space="preserve">Bianca Maluf </w:t>
+              <w:t>Bianca Maluf Bigolin</w:t>
             </w:r>
-            <w:proofErr w:type="spellStart"/>
-            <w:r>
-              <w:rPr>
-                <w:rFonts w:ascii="Arial" w:eastAsia="Times New Roman" w:hAnsi="Arial" w:cs="Arial"/>
-                <w:sz w:val="24"/>
-                <w:szCs w:val="24"/>
-                <w:lang w:eastAsia="pt-PT"/>
-              </w:rPr>
-              <w:t>Bigolin</w:t>
-            </w:r>
-            <w:proofErr w:type="spellEnd"/>
           </w:p>
         </w:tc>
         <w:tc>
@@ -414,37 +401,6 @@
     </w:tbl>
     <w:p>
       <w:pPr>
-        <w:spacing w:before="100" w:beforeAutospacing="1" w:after="100" w:afterAutospacing="1" w:line="240" w:lineRule="auto"/>
-        <w:rPr>
-          <w:rFonts w:ascii="Arial" w:eastAsia="Times New Roman" w:hAnsi="Arial" w:cs="Arial"/>
-          <w:sz w:val="24"/>
-          <w:szCs w:val="24"/>
-          <w:lang w:eastAsia="pt-PT"/>
-        </w:rPr>
-      </w:pPr>
-      <w:r>
-        <w:rPr>
-          <w:rFonts w:ascii="Arial" w:eastAsia="Times New Roman" w:hAnsi="Arial" w:cs="Arial"/>
-          <w:b/>
-          <w:bCs/>
-          <w:sz w:val="24"/>
-          <w:szCs w:val="24"/>
-          <w:lang w:eastAsia="pt-PT"/>
-        </w:rPr>
-        <w:t>Nota:</w:t>
-      </w:r>
-      <w:r>
-        <w:rPr>
-          <w:rFonts w:ascii="Arial" w:eastAsia="Times New Roman" w:hAnsi="Arial" w:cs="Arial"/>
-          <w:sz w:val="24"/>
-          <w:szCs w:val="24"/>
-          <w:lang w:eastAsia="pt-PT"/>
-        </w:rPr>
-        <w:t xml:space="preserve"> Inserir o nome e número de estudante de todos os elementos do grupo.</w:t>
-      </w:r>
-    </w:p>
-    <w:p>
-      <w:pPr>
         <w:spacing w:after="0" w:line="240" w:lineRule="auto"/>
         <w:rPr>
           <w:rFonts w:ascii="Arial" w:eastAsia="Times New Roman" w:hAnsi="Arial" w:cs="Arial"/>
@@ -557,7 +513,6 @@
           <w:lang w:eastAsia="pt-PT"/>
         </w:rPr>
       </w:pPr>
-      <w:proofErr w:type="spellStart"/>
       <w:r>
         <w:rPr>
           <w:rFonts w:ascii="Arial" w:eastAsia="Times New Roman" w:hAnsi="Arial" w:cs="Arial"/>
@@ -567,7 +522,6 @@
         </w:rPr>
         <w:t>TipoArtigo</w:t>
       </w:r>
-      <w:proofErr w:type="spellEnd"/>
     </w:p>
     <w:p>
       <w:pPr>
@@ -631,7 +585,6 @@
           <w:lang w:eastAsia="pt-PT"/>
         </w:rPr>
       </w:pPr>
-      <w:proofErr w:type="spellStart"/>
       <w:r>
         <w:rPr>
           <w:rFonts w:ascii="Arial" w:eastAsia="Times New Roman" w:hAnsi="Arial" w:cs="Arial"/>
@@ -641,7 +594,6 @@
         </w:rPr>
         <w:t>ItemCompra</w:t>
       </w:r>
-      <w:proofErr w:type="spellEnd"/>
     </w:p>
     <w:p>
       <w:pPr>
@@ -657,7 +609,6 @@
           <w:lang w:eastAsia="pt-PT"/>
         </w:rPr>
       </w:pPr>
-      <w:proofErr w:type="spellStart"/>
       <w:r>
         <w:rPr>
           <w:rFonts w:ascii="Arial" w:eastAsia="Times New Roman" w:hAnsi="Arial" w:cs="Arial"/>
@@ -667,7 +618,6 @@
         </w:rPr>
         <w:t>Orcamento</w:t>
       </w:r>
-      <w:proofErr w:type="spellEnd"/>
     </w:p>
     <w:p>
       <w:pPr>
@@ -731,145 +681,11 @@
         <w:tblLook w:val="04A0" w:firstRow="1" w:lastRow="0" w:firstColumn="1" w:lastColumn="0" w:noHBand="0" w:noVBand="1"/>
       </w:tblPr>
       <w:tblGrid>
-        <w:gridCol w:w="1626"/>
+        <w:gridCol w:w="1169"/>
         <w:gridCol w:w="1061"/>
-        <w:gridCol w:w="2273"/>
-        <w:gridCol w:w="3624"/>
+        <w:gridCol w:w="2385"/>
+        <w:gridCol w:w="3969"/>
       </w:tblGrid>
-      <w:tr>
-        <w:trPr>
-          <w:tblHeader/>
-          <w:tblCellSpacing w:w="15" w:type="dxa"/>
-        </w:trPr>
-        <w:tc>
-          <w:tcPr>
-            <w:tcW w:w="0" w:type="auto"/>
-            <w:vAlign w:val="center"/>
-            <w:hideMark/>
-          </w:tcPr>
-          <w:p>
-            <w:pPr>
-              <w:spacing w:after="0" w:line="240" w:lineRule="auto"/>
-              <w:jc w:val="center"/>
-              <w:rPr>
-                <w:rFonts w:ascii="Arial" w:eastAsia="Times New Roman" w:hAnsi="Arial" w:cs="Arial"/>
-                <w:b/>
-                <w:bCs/>
-                <w:sz w:val="24"/>
-                <w:szCs w:val="24"/>
-                <w:lang w:eastAsia="pt-PT"/>
-              </w:rPr>
-            </w:pPr>
-            <w:r>
-              <w:rPr>
-                <w:rFonts w:ascii="Arial" w:eastAsia="Times New Roman" w:hAnsi="Arial" w:cs="Arial"/>
-                <w:b/>
-                <w:bCs/>
-                <w:sz w:val="24"/>
-                <w:szCs w:val="24"/>
-                <w:lang w:eastAsia="pt-PT"/>
-              </w:rPr>
-              <w:t>Entidade Origem</w:t>
-            </w:r>
-          </w:p>
-        </w:tc>
-        <w:tc>
-          <w:tcPr>
-            <w:tcW w:w="1031" w:type="dxa"/>
-            <w:vAlign w:val="center"/>
-            <w:hideMark/>
-          </w:tcPr>
-          <w:p>
-            <w:pPr>
-              <w:spacing w:after="0" w:line="240" w:lineRule="auto"/>
-              <w:jc w:val="center"/>
-              <w:rPr>
-                <w:rFonts w:ascii="Arial" w:eastAsia="Times New Roman" w:hAnsi="Arial" w:cs="Arial"/>
-                <w:b/>
-                <w:bCs/>
-                <w:sz w:val="24"/>
-                <w:szCs w:val="24"/>
-                <w:lang w:eastAsia="pt-PT"/>
-              </w:rPr>
-            </w:pPr>
-            <w:r>
-              <w:rPr>
-                <w:rFonts w:ascii="Arial" w:eastAsia="Times New Roman" w:hAnsi="Arial" w:cs="Arial"/>
-                <w:b/>
-                <w:bCs/>
-                <w:sz w:val="24"/>
-                <w:szCs w:val="24"/>
-                <w:lang w:eastAsia="pt-PT"/>
-              </w:rPr>
-              <w:t>Relação</w:t>
-            </w:r>
-          </w:p>
-        </w:tc>
-        <w:tc>
-          <w:tcPr>
-            <w:tcW w:w="0" w:type="auto"/>
-            <w:vAlign w:val="center"/>
-            <w:hideMark/>
-          </w:tcPr>
-          <w:p>
-            <w:pPr>
-              <w:spacing w:after="0" w:line="240" w:lineRule="auto"/>
-              <w:jc w:val="center"/>
-              <w:rPr>
-                <w:rFonts w:ascii="Arial" w:eastAsia="Times New Roman" w:hAnsi="Arial" w:cs="Arial"/>
-                <w:b/>
-                <w:bCs/>
-                <w:sz w:val="24"/>
-                <w:szCs w:val="24"/>
-                <w:lang w:eastAsia="pt-PT"/>
-              </w:rPr>
-            </w:pPr>
-            <w:r>
-              <w:rPr>
-                <w:rFonts w:ascii="Arial" w:eastAsia="Times New Roman" w:hAnsi="Arial" w:cs="Arial"/>
-                <w:b/>
-                <w:bCs/>
-                <w:sz w:val="24"/>
-                <w:szCs w:val="24"/>
-                <w:lang w:eastAsia="pt-PT"/>
-              </w:rPr>
-              <w:t>Entidade Destino</w:t>
-            </w:r>
-          </w:p>
-        </w:tc>
-        <w:tc>
-          <w:tcPr>
-            <w:tcW w:w="0" w:type="auto"/>
-            <w:vAlign w:val="center"/>
-            <w:hideMark/>
-          </w:tcPr>
-          <w:p>
-            <w:pPr>
-              <w:spacing w:after="0" w:line="240" w:lineRule="auto"/>
-              <w:jc w:val="center"/>
-              <w:rPr>
-                <w:rFonts w:ascii="Arial" w:eastAsia="Times New Roman" w:hAnsi="Arial" w:cs="Arial"/>
-                <w:b/>
-                <w:bCs/>
-                <w:sz w:val="24"/>
-                <w:szCs w:val="24"/>
-                <w:lang w:eastAsia="pt-PT"/>
-              </w:rPr>
-            </w:pPr>
-            <w:r>
-              <w:rPr>
-                <w:rFonts w:ascii="Arial" w:eastAsia="Times New Roman" w:hAnsi="Arial" w:cs="Arial"/>
-                <w:b/>
-                <w:bCs/>
-                <w:sz w:val="24"/>
-                <w:szCs w:val="24"/>
-                <w:lang w:eastAsia="pt-PT"/>
-              </w:rPr>
-              <w:t>Descrição</w:t>
-            </w:r>
-          </w:p>
-        </w:tc>
-      </w:tr>
       <w:tr>
         <w:trPr>
           <w:tblCellSpacing w:w="15" w:type="dxa"/>
@@ -951,27 +767,7 @@
                 <w:szCs w:val="24"/>
                 <w:lang w:eastAsia="pt-PT"/>
               </w:rPr>
-              <w:t>Compra (</w:t>
-            </w:r>
-            <w:proofErr w:type="spellStart"/>
-            <w:r>
-              <w:rPr>
-                <w:rFonts w:ascii="Arial" w:eastAsia="Times New Roman" w:hAnsi="Arial" w:cs="Arial"/>
-                <w:sz w:val="24"/>
-                <w:szCs w:val="24"/>
-                <w:lang w:eastAsia="pt-PT"/>
-              </w:rPr>
-              <w:t>CriadaPor</w:t>
-            </w:r>
-            <w:proofErr w:type="spellEnd"/>
-            <w:r>
-              <w:rPr>
-                <w:rFonts w:ascii="Arial" w:eastAsia="Times New Roman" w:hAnsi="Arial" w:cs="Arial"/>
-                <w:sz w:val="24"/>
-                <w:szCs w:val="24"/>
-                <w:lang w:eastAsia="pt-PT"/>
-              </w:rPr>
-              <w:t>)</w:t>
+              <w:t>Compra (CriadaPor)</w:t>
             </w:r>
           </w:p>
         </w:tc>
@@ -1084,27 +880,7 @@
                 <w:szCs w:val="24"/>
                 <w:lang w:eastAsia="pt-PT"/>
               </w:rPr>
-              <w:t>Compra (</w:t>
-            </w:r>
-            <w:proofErr w:type="spellStart"/>
-            <w:r>
-              <w:rPr>
-                <w:rFonts w:ascii="Arial" w:eastAsia="Times New Roman" w:hAnsi="Arial" w:cs="Arial"/>
-                <w:sz w:val="24"/>
-                <w:szCs w:val="24"/>
-                <w:lang w:eastAsia="pt-PT"/>
-              </w:rPr>
-              <w:t>FechadaPor</w:t>
-            </w:r>
-            <w:proofErr w:type="spellEnd"/>
-            <w:r>
-              <w:rPr>
-                <w:rFonts w:ascii="Arial" w:eastAsia="Times New Roman" w:hAnsi="Arial" w:cs="Arial"/>
-                <w:sz w:val="24"/>
-                <w:szCs w:val="24"/>
-                <w:lang w:eastAsia="pt-PT"/>
-              </w:rPr>
-              <w:t>)</w:t>
+              <w:t>Compra (FechadaPor)</w:t>
             </w:r>
           </w:p>
         </w:tc>
@@ -1163,7 +939,6 @@
                 <w:szCs w:val="24"/>
                 <w:lang w:eastAsia="pt-PT"/>
               </w:rPr>
-              <w:lastRenderedPageBreak/>
               <w:t>Utilizador</w:t>
             </w:r>
           </w:p>
@@ -1211,7 +986,6 @@
                 <w:lang w:eastAsia="pt-PT"/>
               </w:rPr>
             </w:pPr>
-            <w:proofErr w:type="spellStart"/>
             <w:r>
               <w:rPr>
                 <w:rFonts w:ascii="Arial" w:eastAsia="Times New Roman" w:hAnsi="Arial" w:cs="Arial"/>
@@ -1219,37 +993,7 @@
                 <w:szCs w:val="24"/>
                 <w:lang w:eastAsia="pt-PT"/>
               </w:rPr>
-              <w:t>ItemCompra</w:t>
-            </w:r>
-            <w:proofErr w:type="spellEnd"/>
-            <w:r>
-              <w:rPr>
-                <w:rFonts w:ascii="Arial" w:eastAsia="Times New Roman" w:hAnsi="Arial" w:cs="Arial"/>
-                <w:sz w:val="24"/>
-                <w:szCs w:val="24"/>
-                <w:lang w:eastAsia="pt-PT"/>
-              </w:rPr>
-              <w:t xml:space="preserve"> (</w:t>
-            </w:r>
-            <w:proofErr w:type="spellStart"/>
-            <w:r>
-              <w:rPr>
-                <w:rFonts w:ascii="Arial" w:eastAsia="Times New Roman" w:hAnsi="Arial" w:cs="Arial"/>
-                <w:sz w:val="24"/>
-                <w:szCs w:val="24"/>
-                <w:lang w:eastAsia="pt-PT"/>
-              </w:rPr>
-              <w:t>CriadoPor</w:t>
-            </w:r>
-            <w:proofErr w:type="spellEnd"/>
-            <w:r>
-              <w:rPr>
-                <w:rFonts w:ascii="Arial" w:eastAsia="Times New Roman" w:hAnsi="Arial" w:cs="Arial"/>
-                <w:sz w:val="24"/>
-                <w:szCs w:val="24"/>
-                <w:lang w:eastAsia="pt-PT"/>
-              </w:rPr>
-              <w:t>)</w:t>
+              <w:t>ItemCompra (CriadoPor)</w:t>
             </w:r>
           </w:p>
         </w:tc>
@@ -1355,7 +1099,6 @@
                 <w:lang w:eastAsia="pt-PT"/>
               </w:rPr>
             </w:pPr>
-            <w:proofErr w:type="spellStart"/>
             <w:r>
               <w:rPr>
                 <w:rFonts w:ascii="Arial" w:eastAsia="Times New Roman" w:hAnsi="Arial" w:cs="Arial"/>
@@ -1363,37 +1106,7 @@
                 <w:szCs w:val="24"/>
                 <w:lang w:eastAsia="pt-PT"/>
               </w:rPr>
-              <w:t>ItemCompra</w:t>
-            </w:r>
-            <w:proofErr w:type="spellEnd"/>
-            <w:r>
-              <w:rPr>
-                <w:rFonts w:ascii="Arial" w:eastAsia="Times New Roman" w:hAnsi="Arial" w:cs="Arial"/>
-                <w:sz w:val="24"/>
-                <w:szCs w:val="24"/>
-                <w:lang w:eastAsia="pt-PT"/>
-              </w:rPr>
-              <w:t xml:space="preserve"> (</w:t>
-            </w:r>
-            <w:proofErr w:type="spellStart"/>
-            <w:r>
-              <w:rPr>
-                <w:rFonts w:ascii="Arial" w:eastAsia="Times New Roman" w:hAnsi="Arial" w:cs="Arial"/>
-                <w:sz w:val="24"/>
-                <w:szCs w:val="24"/>
-                <w:lang w:eastAsia="pt-PT"/>
-              </w:rPr>
-              <w:t>AlteradoPor</w:t>
-            </w:r>
-            <w:proofErr w:type="spellEnd"/>
-            <w:r>
-              <w:rPr>
-                <w:rFonts w:ascii="Arial" w:eastAsia="Times New Roman" w:hAnsi="Arial" w:cs="Arial"/>
-                <w:sz w:val="24"/>
-                <w:szCs w:val="24"/>
-                <w:lang w:eastAsia="pt-PT"/>
-              </w:rPr>
-              <w:t>)</w:t>
+              <w:t>ItemCompra (AlteradoPor)</w:t>
             </w:r>
           </w:p>
         </w:tc>
@@ -1452,6 +1165,7 @@
                 <w:szCs w:val="24"/>
                 <w:lang w:eastAsia="pt-PT"/>
               </w:rPr>
+              <w:lastRenderedPageBreak/>
               <w:t>Utilizador</w:t>
             </w:r>
           </w:p>
@@ -1499,7 +1213,6 @@
                 <w:lang w:eastAsia="pt-PT"/>
               </w:rPr>
             </w:pPr>
-            <w:proofErr w:type="spellStart"/>
             <w:r>
               <w:rPr>
                 <w:rFonts w:ascii="Arial" w:eastAsia="Times New Roman" w:hAnsi="Arial" w:cs="Arial"/>
@@ -1507,37 +1220,7 @@
                 <w:szCs w:val="24"/>
                 <w:lang w:eastAsia="pt-PT"/>
               </w:rPr>
-              <w:t>Orcamento</w:t>
-            </w:r>
-            <w:proofErr w:type="spellEnd"/>
-            <w:r>
-              <w:rPr>
-                <w:rFonts w:ascii="Arial" w:eastAsia="Times New Roman" w:hAnsi="Arial" w:cs="Arial"/>
-                <w:sz w:val="24"/>
-                <w:szCs w:val="24"/>
-                <w:lang w:eastAsia="pt-PT"/>
-              </w:rPr>
-              <w:t xml:space="preserve"> (</w:t>
-            </w:r>
-            <w:proofErr w:type="spellStart"/>
-            <w:r>
-              <w:rPr>
-                <w:rFonts w:ascii="Arial" w:eastAsia="Times New Roman" w:hAnsi="Arial" w:cs="Arial"/>
-                <w:sz w:val="24"/>
-                <w:szCs w:val="24"/>
-                <w:lang w:eastAsia="pt-PT"/>
-              </w:rPr>
-              <w:t>CriadoPor</w:t>
-            </w:r>
-            <w:proofErr w:type="spellEnd"/>
-            <w:r>
-              <w:rPr>
-                <w:rFonts w:ascii="Arial" w:eastAsia="Times New Roman" w:hAnsi="Arial" w:cs="Arial"/>
-                <w:sz w:val="24"/>
-                <w:szCs w:val="24"/>
-                <w:lang w:eastAsia="pt-PT"/>
-              </w:rPr>
-              <w:t>)</w:t>
+              <w:t>Orcamento (CriadoPor)</w:t>
             </w:r>
           </w:p>
         </w:tc>
@@ -1643,7 +1326,6 @@
                 <w:lang w:eastAsia="pt-PT"/>
               </w:rPr>
             </w:pPr>
-            <w:proofErr w:type="spellStart"/>
             <w:r>
               <w:rPr>
                 <w:rFonts w:ascii="Arial" w:eastAsia="Times New Roman" w:hAnsi="Arial" w:cs="Arial"/>
@@ -1651,37 +1333,7 @@
                 <w:szCs w:val="24"/>
                 <w:lang w:eastAsia="pt-PT"/>
               </w:rPr>
-              <w:t>Orcamento</w:t>
-            </w:r>
-            <w:proofErr w:type="spellEnd"/>
-            <w:r>
-              <w:rPr>
-                <w:rFonts w:ascii="Arial" w:eastAsia="Times New Roman" w:hAnsi="Arial" w:cs="Arial"/>
-                <w:sz w:val="24"/>
-                <w:szCs w:val="24"/>
-                <w:lang w:eastAsia="pt-PT"/>
-              </w:rPr>
-              <w:t xml:space="preserve"> (</w:t>
-            </w:r>
-            <w:proofErr w:type="spellStart"/>
-            <w:r>
-              <w:rPr>
-                <w:rFonts w:ascii="Arial" w:eastAsia="Times New Roman" w:hAnsi="Arial" w:cs="Arial"/>
-                <w:sz w:val="24"/>
-                <w:szCs w:val="24"/>
-                <w:lang w:eastAsia="pt-PT"/>
-              </w:rPr>
-              <w:t>AlteradoPor</w:t>
-            </w:r>
-            <w:proofErr w:type="spellEnd"/>
-            <w:r>
-              <w:rPr>
-                <w:rFonts w:ascii="Arial" w:eastAsia="Times New Roman" w:hAnsi="Arial" w:cs="Arial"/>
-                <w:sz w:val="24"/>
-                <w:szCs w:val="24"/>
-                <w:lang w:eastAsia="pt-PT"/>
-              </w:rPr>
-              <w:t>)</w:t>
+              <w:t>Orcamento (AlteradoPor)</w:t>
             </w:r>
           </w:p>
         </w:tc>
@@ -1733,7 +1385,6 @@
                 <w:lang w:eastAsia="pt-PT"/>
               </w:rPr>
             </w:pPr>
-            <w:proofErr w:type="spellStart"/>
             <w:r>
               <w:rPr>
                 <w:rFonts w:ascii="Arial" w:eastAsia="Times New Roman" w:hAnsi="Arial" w:cs="Arial"/>
@@ -1743,7 +1394,6 @@
               </w:rPr>
               <w:t>TipoArtigo</w:t>
             </w:r>
-            <w:proofErr w:type="spellEnd"/>
           </w:p>
         </w:tc>
         <w:tc>
@@ -1902,7 +1552,6 @@
                 <w:lang w:eastAsia="pt-PT"/>
               </w:rPr>
             </w:pPr>
-            <w:proofErr w:type="spellStart"/>
             <w:r>
               <w:rPr>
                 <w:rFonts w:ascii="Arial" w:eastAsia="Times New Roman" w:hAnsi="Arial" w:cs="Arial"/>
@@ -1912,7 +1561,6 @@
               </w:rPr>
               <w:t>ItemCompra</w:t>
             </w:r>
-            <w:proofErr w:type="spellEnd"/>
           </w:p>
         </w:tc>
         <w:tc>
@@ -2017,7 +1665,6 @@
                 <w:lang w:eastAsia="pt-PT"/>
               </w:rPr>
             </w:pPr>
-            <w:proofErr w:type="spellStart"/>
             <w:r>
               <w:rPr>
                 <w:rFonts w:ascii="Arial" w:eastAsia="Times New Roman" w:hAnsi="Arial" w:cs="Arial"/>
@@ -2027,7 +1674,6 @@
               </w:rPr>
               <w:t>ItemCompra</w:t>
             </w:r>
-            <w:proofErr w:type="spellEnd"/>
           </w:p>
         </w:tc>
         <w:tc>
@@ -2150,27 +1796,7 @@
           <w:szCs w:val="24"/>
           <w:lang w:eastAsia="pt-PT"/>
         </w:rPr>
-        <w:t>O desenvolvimento da aplicação foi realizado segundo o padrão arquitetural MVC (</w:t>
-      </w:r>
-      <w:proofErr w:type="spellStart"/>
-      <w:r>
-        <w:rPr>
-          <w:rFonts w:ascii="Arial" w:eastAsia="Times New Roman" w:hAnsi="Arial" w:cs="Arial"/>
-          <w:sz w:val="24"/>
-          <w:szCs w:val="24"/>
-          <w:lang w:eastAsia="pt-PT"/>
-        </w:rPr>
-        <w:t>Model-View-Controller</w:t>
-      </w:r>
-      <w:proofErr w:type="spellEnd"/>
-      <w:r>
-        <w:rPr>
-          <w:rFonts w:ascii="Arial" w:eastAsia="Times New Roman" w:hAnsi="Arial" w:cs="Arial"/>
-          <w:sz w:val="24"/>
-          <w:szCs w:val="24"/>
-          <w:lang w:eastAsia="pt-PT"/>
-        </w:rPr>
-        <w:t>)</w:t>
+        <w:t>O desenvolvimento da aplicação foi realizado segundo o padrão arquitetural MVC (Model-View-Controller)</w:t>
       </w:r>
       <w:r>
         <w:rPr>
@@ -2222,7 +1848,6 @@
           <w:lang w:eastAsia="pt-PT"/>
         </w:rPr>
       </w:pPr>
-      <w:proofErr w:type="spellStart"/>
       <w:r>
         <w:rPr>
           <w:rFonts w:ascii="Arial" w:eastAsia="Times New Roman" w:hAnsi="Arial" w:cs="Arial"/>
@@ -2234,7 +1859,6 @@
         </w:rPr>
         <w:t>Model</w:t>
       </w:r>
-      <w:proofErr w:type="spellEnd"/>
       <w:r>
         <w:rPr>
           <w:rFonts w:ascii="Arial" w:eastAsia="Times New Roman" w:hAnsi="Arial" w:cs="Arial"/>
@@ -2294,7 +1918,6 @@
           <w:lang w:eastAsia="pt-PT"/>
         </w:rPr>
       </w:pPr>
-      <w:proofErr w:type="spellStart"/>
       <w:r>
         <w:rPr>
           <w:rFonts w:ascii="Arial" w:eastAsia="Times New Roman" w:hAnsi="Arial" w:cs="Arial"/>
@@ -2304,7 +1927,6 @@
         </w:rPr>
         <w:t>TipoArtigo</w:t>
       </w:r>
-      <w:proofErr w:type="spellEnd"/>
     </w:p>
     <w:p>
       <w:pPr>
@@ -2368,7 +1990,6 @@
           <w:lang w:eastAsia="pt-PT"/>
         </w:rPr>
       </w:pPr>
-      <w:proofErr w:type="spellStart"/>
       <w:r>
         <w:rPr>
           <w:rFonts w:ascii="Arial" w:eastAsia="Times New Roman" w:hAnsi="Arial" w:cs="Arial"/>
@@ -2378,7 +1999,6 @@
         </w:rPr>
         <w:t>ItemCompra</w:t>
       </w:r>
-      <w:proofErr w:type="spellEnd"/>
     </w:p>
     <w:p>
       <w:pPr>
@@ -2394,7 +2014,6 @@
           <w:lang w:eastAsia="pt-PT"/>
         </w:rPr>
       </w:pPr>
-      <w:proofErr w:type="spellStart"/>
       <w:r>
         <w:rPr>
           <w:rFonts w:ascii="Arial" w:eastAsia="Times New Roman" w:hAnsi="Arial" w:cs="Arial"/>
@@ -2404,7 +2023,6 @@
         </w:rPr>
         <w:t>Orcamento</w:t>
       </w:r>
-      <w:proofErr w:type="spellEnd"/>
     </w:p>
     <w:p>
       <w:pPr>
@@ -2439,7 +2057,6 @@
           <w:lang w:eastAsia="pt-PT"/>
         </w:rPr>
       </w:pPr>
-      <w:proofErr w:type="spellStart"/>
       <w:r>
         <w:rPr>
           <w:rFonts w:ascii="Arial" w:eastAsia="Times New Roman" w:hAnsi="Arial" w:cs="Arial"/>
@@ -2451,7 +2068,6 @@
         </w:rPr>
         <w:t>View</w:t>
       </w:r>
-      <w:proofErr w:type="spellEnd"/>
       <w:r>
         <w:rPr>
           <w:rFonts w:ascii="Arial" w:eastAsia="Times New Roman" w:hAnsi="Arial" w:cs="Arial"/>
@@ -2470,47 +2086,7 @@
           <w:szCs w:val="24"/>
           <w:lang w:eastAsia="pt-PT"/>
         </w:rPr>
-        <w:t xml:space="preserve">As </w:t>
-      </w:r>
-      <w:proofErr w:type="spellStart"/>
-      <w:r>
-        <w:rPr>
-          <w:rFonts w:ascii="Arial" w:eastAsia="Times New Roman" w:hAnsi="Arial" w:cs="Arial"/>
-          <w:sz w:val="24"/>
-          <w:szCs w:val="24"/>
-          <w:lang w:eastAsia="pt-PT"/>
-        </w:rPr>
-        <w:t>Views</w:t>
-      </w:r>
-      <w:proofErr w:type="spellEnd"/>
-      <w:r>
-        <w:rPr>
-          <w:rFonts w:ascii="Arial" w:eastAsia="Times New Roman" w:hAnsi="Arial" w:cs="Arial"/>
-          <w:sz w:val="24"/>
-          <w:szCs w:val="24"/>
-          <w:lang w:eastAsia="pt-PT"/>
-        </w:rPr>
-        <w:t xml:space="preserve"> correspondem aos formulários Windows </w:t>
-      </w:r>
-      <w:proofErr w:type="spellStart"/>
-      <w:r>
-        <w:rPr>
-          <w:rFonts w:ascii="Arial" w:eastAsia="Times New Roman" w:hAnsi="Arial" w:cs="Arial"/>
-          <w:sz w:val="24"/>
-          <w:szCs w:val="24"/>
-          <w:lang w:eastAsia="pt-PT"/>
-        </w:rPr>
-        <w:t>Forms</w:t>
-      </w:r>
-      <w:proofErr w:type="spellEnd"/>
-      <w:r>
-        <w:rPr>
-          <w:rFonts w:ascii="Arial" w:eastAsia="Times New Roman" w:hAnsi="Arial" w:cs="Arial"/>
-          <w:sz w:val="24"/>
-          <w:szCs w:val="24"/>
-          <w:lang w:eastAsia="pt-PT"/>
-        </w:rPr>
-        <w:t xml:space="preserve"> utilizados para interação com o utilizador, permitindo visualizar e introduzir informação.</w:t>
+        <w:t>As Views correspondem aos formulários Windows Forms utilizados para interação com o utilizador, permitindo visualizar e introduzir informação.</w:t>
       </w:r>
     </w:p>
     <w:p>
@@ -2526,7 +2102,6 @@
           <w:lang w:eastAsia="pt-PT"/>
         </w:rPr>
       </w:pPr>
-      <w:proofErr w:type="spellStart"/>
       <w:r>
         <w:rPr>
           <w:rFonts w:ascii="Arial" w:eastAsia="Times New Roman" w:hAnsi="Arial" w:cs="Arial"/>
@@ -2536,10 +2111,8 @@
           <w:szCs w:val="27"/>
           <w:lang w:eastAsia="pt-PT"/>
         </w:rPr>
-        <w:lastRenderedPageBreak/>
         <w:t>Controller</w:t>
       </w:r>
-      <w:proofErr w:type="spellEnd"/>
       <w:r>
         <w:rPr>
           <w:rFonts w:ascii="Arial" w:eastAsia="Times New Roman" w:hAnsi="Arial" w:cs="Arial"/>
@@ -2558,27 +2131,7 @@
           <w:szCs w:val="24"/>
           <w:lang w:eastAsia="pt-PT"/>
         </w:rPr>
-        <w:t xml:space="preserve">Os </w:t>
-      </w:r>
-      <w:proofErr w:type="spellStart"/>
-      <w:r>
-        <w:rPr>
-          <w:rFonts w:ascii="Arial" w:eastAsia="Times New Roman" w:hAnsi="Arial" w:cs="Arial"/>
-          <w:sz w:val="24"/>
-          <w:szCs w:val="24"/>
-          <w:lang w:eastAsia="pt-PT"/>
-        </w:rPr>
-        <w:t>Controllers</w:t>
-      </w:r>
-      <w:proofErr w:type="spellEnd"/>
-      <w:r>
-        <w:rPr>
-          <w:rFonts w:ascii="Arial" w:eastAsia="Times New Roman" w:hAnsi="Arial" w:cs="Arial"/>
-          <w:sz w:val="24"/>
-          <w:szCs w:val="24"/>
-          <w:lang w:eastAsia="pt-PT"/>
-        </w:rPr>
-        <w:t xml:space="preserve"> são responsáveis pela lógica de negócio e pelo acesso aos dados. Cada entidade possui um controlador específico que centraliza todas as operações relacionadas.</w:t>
+        <w:t>Os Controllers são responsáveis pela lógica de negócio e pelo acesso aos dados. Cada entidade possui um controlador específico que centraliza todas as operações relacionadas.</w:t>
       </w:r>
     </w:p>
     <w:p>
@@ -2615,10 +2168,211 @@
           <w:szCs w:val="36"/>
           <w:lang w:eastAsia="pt-PT"/>
         </w:rPr>
+        <w:t xml:space="preserve"> Entity Framework 6</w:t>
+      </w:r>
+    </w:p>
+    <w:p>
+      <w:pPr>
+        <w:spacing w:before="100" w:beforeAutospacing="1" w:after="100" w:afterAutospacing="1" w:line="240" w:lineRule="auto"/>
+        <w:rPr>
+          <w:rFonts w:ascii="Arial" w:eastAsia="Times New Roman" w:hAnsi="Arial" w:cs="Arial"/>
+          <w:sz w:val="24"/>
+          <w:szCs w:val="24"/>
+          <w:lang w:eastAsia="pt-PT"/>
+        </w:rPr>
+      </w:pPr>
+      <w:r>
+        <w:rPr>
+          <w:rFonts w:ascii="Arial" w:eastAsia="Times New Roman" w:hAnsi="Arial" w:cs="Arial"/>
+          <w:sz w:val="24"/>
+          <w:szCs w:val="24"/>
+          <w:lang w:eastAsia="pt-PT"/>
+        </w:rPr>
+        <w:lastRenderedPageBreak/>
+        <w:t>O acesso à base de dados foi implementado através do Entity Framework 6</w:t>
+      </w:r>
+      <w:r>
+        <w:rPr>
+          <w:rFonts w:ascii="Arial" w:eastAsia="Times New Roman" w:hAnsi="Arial" w:cs="Arial"/>
+          <w:sz w:val="24"/>
+          <w:szCs w:val="24"/>
+          <w:lang w:eastAsia="pt-PT"/>
+        </w:rPr>
         <w:t xml:space="preserve"> </w:t>
       </w:r>
-      <w:proofErr w:type="spellStart"/>
-      <w:r>
+      <w:r>
+        <w:rPr>
+          <w:rFonts w:ascii="Arial" w:eastAsia="Times New Roman" w:hAnsi="Arial" w:cs="Arial"/>
+          <w:sz w:val="24"/>
+          <w:szCs w:val="24"/>
+          <w:lang w:eastAsia="pt-PT"/>
+        </w:rPr>
+        <w:t>utilizando SQL Server LocalDB.</w:t>
+      </w:r>
+    </w:p>
+    <w:p>
+      <w:pPr>
+        <w:spacing w:before="100" w:beforeAutospacing="1" w:after="100" w:afterAutospacing="1" w:line="240" w:lineRule="auto"/>
+        <w:rPr>
+          <w:rFonts w:ascii="Arial" w:eastAsia="Times New Roman" w:hAnsi="Arial" w:cs="Arial"/>
+          <w:sz w:val="24"/>
+          <w:szCs w:val="24"/>
+          <w:lang w:eastAsia="pt-PT"/>
+        </w:rPr>
+      </w:pPr>
+      <w:r>
+        <w:rPr>
+          <w:rFonts w:ascii="Arial" w:eastAsia="Times New Roman" w:hAnsi="Arial" w:cs="Arial"/>
+          <w:sz w:val="24"/>
+          <w:szCs w:val="24"/>
+          <w:lang w:eastAsia="pt-PT"/>
+        </w:rPr>
+        <w:t>Esta tecnologia permit</w:t>
+      </w:r>
+      <w:r>
+        <w:rPr>
+          <w:rFonts w:ascii="Arial" w:eastAsia="Times New Roman" w:hAnsi="Arial" w:cs="Arial"/>
+          <w:sz w:val="24"/>
+          <w:szCs w:val="24"/>
+          <w:lang w:eastAsia="pt-PT"/>
+        </w:rPr>
+        <w:t>e s</w:t>
+      </w:r>
+      <w:r>
+        <w:rPr>
+          <w:rFonts w:ascii="Arial" w:eastAsia="Times New Roman" w:hAnsi="Arial" w:cs="Arial"/>
+          <w:sz w:val="24"/>
+          <w:szCs w:val="24"/>
+          <w:lang w:eastAsia="pt-PT"/>
+        </w:rPr>
+        <w:t>implificar operações CRUD;</w:t>
+      </w:r>
+      <w:r>
+        <w:rPr>
+          <w:rFonts w:ascii="Arial" w:eastAsia="Times New Roman" w:hAnsi="Arial" w:cs="Arial"/>
+          <w:sz w:val="24"/>
+          <w:szCs w:val="24"/>
+          <w:lang w:eastAsia="pt-PT"/>
+        </w:rPr>
+        <w:t xml:space="preserve"> </w:t>
+      </w:r>
+      <w:r>
+        <w:rPr>
+          <w:rFonts w:ascii="Arial" w:eastAsia="Times New Roman" w:hAnsi="Arial" w:cs="Arial"/>
+          <w:sz w:val="24"/>
+          <w:szCs w:val="24"/>
+          <w:lang w:eastAsia="pt-PT"/>
+        </w:rPr>
+        <w:t>Reduzir código SQL manual;</w:t>
+      </w:r>
+      <w:r>
+        <w:rPr>
+          <w:rFonts w:ascii="Arial" w:eastAsia="Times New Roman" w:hAnsi="Arial" w:cs="Arial"/>
+          <w:sz w:val="24"/>
+          <w:szCs w:val="24"/>
+          <w:lang w:eastAsia="pt-PT"/>
+        </w:rPr>
+        <w:t xml:space="preserve"> </w:t>
+      </w:r>
+      <w:r>
+        <w:rPr>
+          <w:rFonts w:ascii="Arial" w:eastAsia="Times New Roman" w:hAnsi="Arial" w:cs="Arial"/>
+          <w:sz w:val="24"/>
+          <w:szCs w:val="24"/>
+          <w:lang w:eastAsia="pt-PT"/>
+        </w:rPr>
+        <w:t>Utilizar LINQ para consultas</w:t>
+      </w:r>
+      <w:r>
+        <w:rPr>
+          <w:rFonts w:ascii="Arial" w:eastAsia="Times New Roman" w:hAnsi="Arial" w:cs="Arial"/>
+          <w:sz w:val="24"/>
+          <w:szCs w:val="24"/>
+          <w:lang w:eastAsia="pt-PT"/>
+        </w:rPr>
+        <w:t xml:space="preserve"> e </w:t>
+      </w:r>
+      <w:r>
+        <w:rPr>
+          <w:rFonts w:ascii="Arial" w:eastAsia="Times New Roman" w:hAnsi="Arial" w:cs="Arial"/>
+          <w:sz w:val="24"/>
+          <w:szCs w:val="24"/>
+          <w:lang w:eastAsia="pt-PT"/>
+        </w:rPr>
+        <w:t>Gerar automaticamente a base de dados através do modelo.</w:t>
+      </w:r>
+    </w:p>
+    <w:p>
+      <w:pPr>
+        <w:spacing w:before="100" w:beforeAutospacing="1" w:after="100" w:afterAutospacing="1" w:line="240" w:lineRule="auto"/>
+        <w:rPr>
+          <w:rFonts w:ascii="Arial" w:eastAsia="Times New Roman" w:hAnsi="Arial" w:cs="Arial"/>
+          <w:sz w:val="24"/>
+          <w:szCs w:val="24"/>
+          <w:lang w:eastAsia="pt-PT"/>
+        </w:rPr>
+      </w:pPr>
+      <w:r>
+        <w:rPr>
+          <w:rFonts w:ascii="Arial" w:eastAsia="Times New Roman" w:hAnsi="Arial" w:cs="Arial"/>
+          <w:sz w:val="24"/>
+          <w:szCs w:val="24"/>
+          <w:lang w:eastAsia="pt-PT"/>
+        </w:rPr>
+        <w:t>A escolha do LocalDB deve-se ao facto de</w:t>
+      </w:r>
+      <w:r>
+        <w:rPr>
+          <w:rFonts w:ascii="Arial" w:eastAsia="Times New Roman" w:hAnsi="Arial" w:cs="Arial"/>
+          <w:sz w:val="24"/>
+          <w:szCs w:val="24"/>
+          <w:lang w:eastAsia="pt-PT"/>
+        </w:rPr>
+        <w:t>, além de ser assim pedido no enunciado,</w:t>
+      </w:r>
+      <w:r>
+        <w:rPr>
+          <w:rFonts w:ascii="Arial" w:eastAsia="Times New Roman" w:hAnsi="Arial" w:cs="Arial"/>
+          <w:sz w:val="24"/>
+          <w:szCs w:val="24"/>
+          <w:lang w:eastAsia="pt-PT"/>
+        </w:rPr>
+        <w:t xml:space="preserve"> ser </w:t>
+      </w:r>
+      <w:r>
+        <w:rPr>
+          <w:rFonts w:ascii="Arial" w:eastAsia="Times New Roman" w:hAnsi="Arial" w:cs="Arial"/>
+          <w:sz w:val="24"/>
+          <w:szCs w:val="24"/>
+          <w:lang w:eastAsia="pt-PT"/>
+        </w:rPr>
+        <w:t xml:space="preserve">também </w:t>
+      </w:r>
+      <w:r>
+        <w:rPr>
+          <w:rFonts w:ascii="Arial" w:eastAsia="Times New Roman" w:hAnsi="Arial" w:cs="Arial"/>
+          <w:sz w:val="24"/>
+          <w:szCs w:val="24"/>
+          <w:lang w:eastAsia="pt-PT"/>
+        </w:rPr>
+        <w:t>uma solução leve e adequada para aplicações académicas e protótipos.</w:t>
+      </w:r>
+    </w:p>
+    <w:p>
+      <w:pPr>
+        <w:spacing w:after="0" w:line="240" w:lineRule="auto"/>
+        <w:rPr>
+          <w:rFonts w:ascii="Arial" w:eastAsia="Times New Roman" w:hAnsi="Arial" w:cs="Arial"/>
+          <w:sz w:val="24"/>
+          <w:szCs w:val="24"/>
+          <w:lang w:eastAsia="pt-PT"/>
+        </w:rPr>
+      </w:pPr>
+    </w:p>
+    <w:p>
+      <w:pPr>
+        <w:spacing w:before="100" w:beforeAutospacing="1" w:after="100" w:afterAutospacing="1" w:line="240" w:lineRule="auto"/>
+        <w:outlineLvl w:val="1"/>
         <w:rPr>
           <w:rFonts w:ascii="Arial" w:eastAsia="Times New Roman" w:hAnsi="Arial" w:cs="Arial"/>
           <w:b/>
@@ -2627,9 +2381,7 @@
           <w:szCs w:val="36"/>
           <w:lang w:eastAsia="pt-PT"/>
         </w:rPr>
-        <w:t>Entity</w:t>
-      </w:r>
-      <w:proofErr w:type="spellEnd"/>
+      </w:pPr>
       <w:r>
         <w:rPr>
           <w:rFonts w:ascii="Arial" w:eastAsia="Times New Roman" w:hAnsi="Arial" w:cs="Arial"/>
@@ -2639,270 +2391,9 @@
           <w:szCs w:val="36"/>
           <w:lang w:eastAsia="pt-PT"/>
         </w:rPr>
-        <w:t xml:space="preserve"> Framework 6</w:t>
-      </w:r>
-    </w:p>
-    <w:p>
-      <w:pPr>
-        <w:spacing w:before="100" w:beforeAutospacing="1" w:after="100" w:afterAutospacing="1" w:line="240" w:lineRule="auto"/>
-        <w:rPr>
-          <w:rFonts w:ascii="Arial" w:eastAsia="Times New Roman" w:hAnsi="Arial" w:cs="Arial"/>
-          <w:sz w:val="24"/>
-          <w:szCs w:val="24"/>
-          <w:lang w:eastAsia="pt-PT"/>
-        </w:rPr>
-      </w:pPr>
-      <w:r>
-        <w:rPr>
-          <w:rFonts w:ascii="Arial" w:eastAsia="Times New Roman" w:hAnsi="Arial" w:cs="Arial"/>
-          <w:sz w:val="24"/>
-          <w:szCs w:val="24"/>
-          <w:lang w:eastAsia="pt-PT"/>
-        </w:rPr>
-        <w:t xml:space="preserve">O acesso à base de dados foi implementado através do </w:t>
-      </w:r>
-      <w:proofErr w:type="spellStart"/>
-      <w:r>
-        <w:rPr>
-          <w:rFonts w:ascii="Arial" w:eastAsia="Times New Roman" w:hAnsi="Arial" w:cs="Arial"/>
-          <w:sz w:val="24"/>
-          <w:szCs w:val="24"/>
-          <w:lang w:eastAsia="pt-PT"/>
-        </w:rPr>
-        <w:t>Entity</w:t>
-      </w:r>
-      <w:proofErr w:type="spellEnd"/>
-      <w:r>
-        <w:rPr>
-          <w:rFonts w:ascii="Arial" w:eastAsia="Times New Roman" w:hAnsi="Arial" w:cs="Arial"/>
-          <w:sz w:val="24"/>
-          <w:szCs w:val="24"/>
-          <w:lang w:eastAsia="pt-PT"/>
-        </w:rPr>
-        <w:t xml:space="preserve"> Framework 6</w:t>
-      </w:r>
-      <w:r>
-        <w:rPr>
-          <w:rFonts w:ascii="Arial" w:eastAsia="Times New Roman" w:hAnsi="Arial" w:cs="Arial"/>
-          <w:sz w:val="24"/>
-          <w:szCs w:val="24"/>
-          <w:lang w:eastAsia="pt-PT"/>
-        </w:rPr>
-        <w:t xml:space="preserve"> </w:t>
-      </w:r>
-      <w:r>
-        <w:rPr>
-          <w:rFonts w:ascii="Arial" w:eastAsia="Times New Roman" w:hAnsi="Arial" w:cs="Arial"/>
-          <w:sz w:val="24"/>
-          <w:szCs w:val="24"/>
-          <w:lang w:eastAsia="pt-PT"/>
-        </w:rPr>
-        <w:t xml:space="preserve">utilizando SQL Server </w:t>
-      </w:r>
-      <w:proofErr w:type="spellStart"/>
-      <w:r>
-        <w:rPr>
-          <w:rFonts w:ascii="Arial" w:eastAsia="Times New Roman" w:hAnsi="Arial" w:cs="Arial"/>
-          <w:sz w:val="24"/>
-          <w:szCs w:val="24"/>
-          <w:lang w:eastAsia="pt-PT"/>
-        </w:rPr>
-        <w:t>LocalDB</w:t>
-      </w:r>
-      <w:proofErr w:type="spellEnd"/>
-      <w:r>
-        <w:rPr>
-          <w:rFonts w:ascii="Arial" w:eastAsia="Times New Roman" w:hAnsi="Arial" w:cs="Arial"/>
-          <w:sz w:val="24"/>
-          <w:szCs w:val="24"/>
-          <w:lang w:eastAsia="pt-PT"/>
-        </w:rPr>
-        <w:t>.</w:t>
-      </w:r>
-    </w:p>
-    <w:p>
-      <w:pPr>
-        <w:spacing w:before="100" w:beforeAutospacing="1" w:after="100" w:afterAutospacing="1" w:line="240" w:lineRule="auto"/>
-        <w:rPr>
-          <w:rFonts w:ascii="Arial" w:eastAsia="Times New Roman" w:hAnsi="Arial" w:cs="Arial"/>
-          <w:sz w:val="24"/>
-          <w:szCs w:val="24"/>
-          <w:lang w:eastAsia="pt-PT"/>
-        </w:rPr>
-      </w:pPr>
-      <w:r>
-        <w:rPr>
-          <w:rFonts w:ascii="Arial" w:eastAsia="Times New Roman" w:hAnsi="Arial" w:cs="Arial"/>
-          <w:sz w:val="24"/>
-          <w:szCs w:val="24"/>
-          <w:lang w:eastAsia="pt-PT"/>
-        </w:rPr>
-        <w:t>Esta tecnologia permit</w:t>
-      </w:r>
-      <w:r>
-        <w:rPr>
-          <w:rFonts w:ascii="Arial" w:eastAsia="Times New Roman" w:hAnsi="Arial" w:cs="Arial"/>
-          <w:sz w:val="24"/>
-          <w:szCs w:val="24"/>
-          <w:lang w:eastAsia="pt-PT"/>
-        </w:rPr>
-        <w:t>e s</w:t>
-      </w:r>
-      <w:r>
-        <w:rPr>
-          <w:rFonts w:ascii="Arial" w:eastAsia="Times New Roman" w:hAnsi="Arial" w:cs="Arial"/>
-          <w:sz w:val="24"/>
-          <w:szCs w:val="24"/>
-          <w:lang w:eastAsia="pt-PT"/>
-        </w:rPr>
-        <w:t>implificar operações CRUD;</w:t>
-      </w:r>
-      <w:r>
-        <w:rPr>
-          <w:rFonts w:ascii="Arial" w:eastAsia="Times New Roman" w:hAnsi="Arial" w:cs="Arial"/>
-          <w:sz w:val="24"/>
-          <w:szCs w:val="24"/>
-          <w:lang w:eastAsia="pt-PT"/>
-        </w:rPr>
-        <w:t xml:space="preserve"> </w:t>
-      </w:r>
-      <w:r>
-        <w:rPr>
-          <w:rFonts w:ascii="Arial" w:eastAsia="Times New Roman" w:hAnsi="Arial" w:cs="Arial"/>
-          <w:sz w:val="24"/>
-          <w:szCs w:val="24"/>
-          <w:lang w:eastAsia="pt-PT"/>
-        </w:rPr>
-        <w:t>Reduzir código SQL manual;</w:t>
-      </w:r>
-      <w:r>
-        <w:rPr>
-          <w:rFonts w:ascii="Arial" w:eastAsia="Times New Roman" w:hAnsi="Arial" w:cs="Arial"/>
-          <w:sz w:val="24"/>
-          <w:szCs w:val="24"/>
-          <w:lang w:eastAsia="pt-PT"/>
-        </w:rPr>
-        <w:t xml:space="preserve"> </w:t>
-      </w:r>
-      <w:r>
-        <w:rPr>
-          <w:rFonts w:ascii="Arial" w:eastAsia="Times New Roman" w:hAnsi="Arial" w:cs="Arial"/>
-          <w:sz w:val="24"/>
-          <w:szCs w:val="24"/>
-          <w:lang w:eastAsia="pt-PT"/>
-        </w:rPr>
-        <w:t>Utilizar LINQ para consultas</w:t>
-      </w:r>
-      <w:r>
-        <w:rPr>
-          <w:rFonts w:ascii="Arial" w:eastAsia="Times New Roman" w:hAnsi="Arial" w:cs="Arial"/>
-          <w:sz w:val="24"/>
-          <w:szCs w:val="24"/>
-          <w:lang w:eastAsia="pt-PT"/>
-        </w:rPr>
-        <w:t xml:space="preserve"> e </w:t>
-      </w:r>
-      <w:r>
-        <w:rPr>
-          <w:rFonts w:ascii="Arial" w:eastAsia="Times New Roman" w:hAnsi="Arial" w:cs="Arial"/>
-          <w:sz w:val="24"/>
-          <w:szCs w:val="24"/>
-          <w:lang w:eastAsia="pt-PT"/>
-        </w:rPr>
-        <w:t>Gerar automaticamente a base de dados através do modelo.</w:t>
-      </w:r>
-    </w:p>
-    <w:p>
-      <w:pPr>
-        <w:spacing w:before="100" w:beforeAutospacing="1" w:after="100" w:afterAutospacing="1" w:line="240" w:lineRule="auto"/>
-        <w:rPr>
-          <w:rFonts w:ascii="Arial" w:eastAsia="Times New Roman" w:hAnsi="Arial" w:cs="Arial"/>
-          <w:sz w:val="24"/>
-          <w:szCs w:val="24"/>
-          <w:lang w:eastAsia="pt-PT"/>
-        </w:rPr>
-      </w:pPr>
-      <w:r>
-        <w:rPr>
-          <w:rFonts w:ascii="Arial" w:eastAsia="Times New Roman" w:hAnsi="Arial" w:cs="Arial"/>
-          <w:sz w:val="24"/>
-          <w:szCs w:val="24"/>
-          <w:lang w:eastAsia="pt-PT"/>
-        </w:rPr>
-        <w:t xml:space="preserve">A escolha do </w:t>
-      </w:r>
-      <w:proofErr w:type="spellStart"/>
-      <w:r>
-        <w:rPr>
-          <w:rFonts w:ascii="Arial" w:eastAsia="Times New Roman" w:hAnsi="Arial" w:cs="Arial"/>
-          <w:sz w:val="24"/>
-          <w:szCs w:val="24"/>
-          <w:lang w:eastAsia="pt-PT"/>
-        </w:rPr>
-        <w:t>LocalDB</w:t>
-      </w:r>
-      <w:proofErr w:type="spellEnd"/>
-      <w:r>
-        <w:rPr>
-          <w:rFonts w:ascii="Arial" w:eastAsia="Times New Roman" w:hAnsi="Arial" w:cs="Arial"/>
-          <w:sz w:val="24"/>
-          <w:szCs w:val="24"/>
-          <w:lang w:eastAsia="pt-PT"/>
-        </w:rPr>
-        <w:t xml:space="preserve"> deve-se ao facto de</w:t>
-      </w:r>
-      <w:r>
-        <w:rPr>
-          <w:rFonts w:ascii="Arial" w:eastAsia="Times New Roman" w:hAnsi="Arial" w:cs="Arial"/>
-          <w:sz w:val="24"/>
-          <w:szCs w:val="24"/>
-          <w:lang w:eastAsia="pt-PT"/>
-        </w:rPr>
-        <w:t>, além de ser assim pedido no enunciado,</w:t>
-      </w:r>
-      <w:r>
-        <w:rPr>
-          <w:rFonts w:ascii="Arial" w:eastAsia="Times New Roman" w:hAnsi="Arial" w:cs="Arial"/>
-          <w:sz w:val="24"/>
-          <w:szCs w:val="24"/>
-          <w:lang w:eastAsia="pt-PT"/>
-        </w:rPr>
-        <w:t xml:space="preserve"> ser </w:t>
-      </w:r>
-      <w:r>
-        <w:rPr>
-          <w:rFonts w:ascii="Arial" w:eastAsia="Times New Roman" w:hAnsi="Arial" w:cs="Arial"/>
-          <w:sz w:val="24"/>
-          <w:szCs w:val="24"/>
-          <w:lang w:eastAsia="pt-PT"/>
-        </w:rPr>
-        <w:t xml:space="preserve">também </w:t>
-      </w:r>
-      <w:r>
-        <w:rPr>
-          <w:rFonts w:ascii="Arial" w:eastAsia="Times New Roman" w:hAnsi="Arial" w:cs="Arial"/>
-          <w:sz w:val="24"/>
-          <w:szCs w:val="24"/>
-          <w:lang w:eastAsia="pt-PT"/>
-        </w:rPr>
-        <w:t>uma solução leve e adequada para aplicações académicas e protótipos.</w:t>
-      </w:r>
-    </w:p>
-    <w:p>
-      <w:pPr>
-        <w:spacing w:after="0" w:line="240" w:lineRule="auto"/>
-        <w:rPr>
-          <w:rFonts w:ascii="Arial" w:eastAsia="Times New Roman" w:hAnsi="Arial" w:cs="Arial"/>
-          <w:sz w:val="24"/>
-          <w:szCs w:val="24"/>
-          <w:lang w:eastAsia="pt-PT"/>
-        </w:rPr>
-      </w:pPr>
-    </w:p>
-    <w:p>
-      <w:pPr>
-        <w:spacing w:before="100" w:beforeAutospacing="1" w:after="100" w:afterAutospacing="1" w:line="240" w:lineRule="auto"/>
-        <w:outlineLvl w:val="1"/>
+        <w:t>3.</w:t>
+      </w:r>
+      <w:r>
         <w:rPr>
           <w:rFonts w:ascii="Arial" w:eastAsia="Times New Roman" w:hAnsi="Arial" w:cs="Arial"/>
           <w:b/>
@@ -2911,8 +2402,136 @@
           <w:szCs w:val="36"/>
           <w:lang w:eastAsia="pt-PT"/>
         </w:rPr>
-      </w:pPr>
-      <w:r>
+        <w:t xml:space="preserve"> LINQ Method Syntax</w:t>
+      </w:r>
+    </w:p>
+    <w:p>
+      <w:pPr>
+        <w:spacing w:before="100" w:beforeAutospacing="1" w:after="100" w:afterAutospacing="1" w:line="240" w:lineRule="auto"/>
+        <w:rPr>
+          <w:rFonts w:ascii="Arial" w:eastAsia="Times New Roman" w:hAnsi="Arial" w:cs="Arial"/>
+          <w:sz w:val="24"/>
+          <w:szCs w:val="24"/>
+          <w:lang w:eastAsia="pt-PT"/>
+        </w:rPr>
+      </w:pPr>
+      <w:r>
+        <w:rPr>
+          <w:rFonts w:ascii="Arial" w:eastAsia="Times New Roman" w:hAnsi="Arial" w:cs="Arial"/>
+          <w:sz w:val="24"/>
+          <w:szCs w:val="24"/>
+          <w:lang w:eastAsia="pt-PT"/>
+        </w:rPr>
+        <w:t xml:space="preserve">Todas as consultas foram </w:t>
+      </w:r>
+      <w:r>
+        <w:rPr>
+          <w:rFonts w:ascii="Arial" w:eastAsia="Times New Roman" w:hAnsi="Arial" w:cs="Arial"/>
+          <w:sz w:val="24"/>
+          <w:szCs w:val="24"/>
+          <w:lang w:eastAsia="pt-PT"/>
+        </w:rPr>
+        <w:t>feitas</w:t>
+      </w:r>
+      <w:r>
+        <w:rPr>
+          <w:rFonts w:ascii="Arial" w:eastAsia="Times New Roman" w:hAnsi="Arial" w:cs="Arial"/>
+          <w:sz w:val="24"/>
+          <w:szCs w:val="24"/>
+          <w:lang w:eastAsia="pt-PT"/>
+        </w:rPr>
+        <w:t xml:space="preserve"> utilizando a sintaxe Method Syntax.</w:t>
+      </w:r>
+    </w:p>
+    <w:p>
+      <w:pPr>
+        <w:spacing w:before="100" w:beforeAutospacing="1" w:after="100" w:afterAutospacing="1" w:line="240" w:lineRule="auto"/>
+        <w:rPr>
+          <w:rFonts w:ascii="Arial" w:eastAsia="Times New Roman" w:hAnsi="Arial" w:cs="Arial"/>
+          <w:sz w:val="24"/>
+          <w:szCs w:val="24"/>
+          <w:lang w:eastAsia="pt-PT"/>
+        </w:rPr>
+      </w:pPr>
+      <w:r>
+        <w:rPr>
+          <w:rFonts w:ascii="Arial" w:eastAsia="Times New Roman" w:hAnsi="Arial" w:cs="Arial"/>
+          <w:sz w:val="24"/>
+          <w:szCs w:val="24"/>
+          <w:lang w:eastAsia="pt-PT"/>
+        </w:rPr>
+        <w:t xml:space="preserve">Esta abordagem </w:t>
+      </w:r>
+      <w:r>
+        <w:rPr>
+          <w:rFonts w:ascii="Arial" w:eastAsia="Times New Roman" w:hAnsi="Arial" w:cs="Arial"/>
+          <w:sz w:val="24"/>
+          <w:szCs w:val="24"/>
+          <w:lang w:eastAsia="pt-PT"/>
+        </w:rPr>
+        <w:t>é muito</w:t>
+      </w:r>
+      <w:r>
+        <w:rPr>
+          <w:rFonts w:ascii="Arial" w:eastAsia="Times New Roman" w:hAnsi="Arial" w:cs="Arial"/>
+          <w:sz w:val="24"/>
+          <w:szCs w:val="24"/>
+          <w:lang w:eastAsia="pt-PT"/>
+        </w:rPr>
+        <w:t xml:space="preserve"> </w:t>
+      </w:r>
+      <w:r>
+        <w:rPr>
+          <w:rFonts w:ascii="Arial" w:eastAsia="Times New Roman" w:hAnsi="Arial" w:cs="Arial"/>
+          <w:sz w:val="24"/>
+          <w:szCs w:val="24"/>
+          <w:lang w:eastAsia="pt-PT"/>
+        </w:rPr>
+        <w:t>flexivel</w:t>
+      </w:r>
+      <w:r>
+        <w:rPr>
+          <w:rFonts w:ascii="Arial" w:eastAsia="Times New Roman" w:hAnsi="Arial" w:cs="Arial"/>
+          <w:sz w:val="24"/>
+          <w:szCs w:val="24"/>
+          <w:lang w:eastAsia="pt-PT"/>
+        </w:rPr>
+        <w:t xml:space="preserve">, é amplamente utilizada em contexto profissional e foi a metodologia </w:t>
+      </w:r>
+      <w:r>
+        <w:rPr>
+          <w:rFonts w:ascii="Arial" w:eastAsia="Times New Roman" w:hAnsi="Arial" w:cs="Arial"/>
+          <w:sz w:val="24"/>
+          <w:szCs w:val="24"/>
+          <w:lang w:eastAsia="pt-PT"/>
+        </w:rPr>
+        <w:t>estudada</w:t>
+      </w:r>
+      <w:r>
+        <w:rPr>
+          <w:rFonts w:ascii="Arial" w:eastAsia="Times New Roman" w:hAnsi="Arial" w:cs="Arial"/>
+          <w:sz w:val="24"/>
+          <w:szCs w:val="24"/>
+          <w:lang w:eastAsia="pt-PT"/>
+        </w:rPr>
+        <w:t xml:space="preserve"> ao longo das aulas práticas.</w:t>
+      </w:r>
+    </w:p>
+    <w:p>
+      <w:pPr>
+        <w:spacing w:after="0" w:line="240" w:lineRule="auto"/>
+        <w:rPr>
+          <w:rFonts w:ascii="Arial" w:eastAsia="Times New Roman" w:hAnsi="Arial" w:cs="Arial"/>
+          <w:sz w:val="24"/>
+          <w:szCs w:val="24"/>
+          <w:lang w:eastAsia="pt-PT"/>
+        </w:rPr>
+      </w:pPr>
+    </w:p>
+    <w:p>
+      <w:pPr>
+        <w:spacing w:before="100" w:beforeAutospacing="1" w:after="100" w:afterAutospacing="1" w:line="240" w:lineRule="auto"/>
+        <w:outlineLvl w:val="1"/>
         <w:rPr>
           <w:rFonts w:ascii="Arial" w:eastAsia="Times New Roman" w:hAnsi="Arial" w:cs="Arial"/>
           <w:b/>
@@ -2921,8 +2540,7 @@
           <w:szCs w:val="36"/>
           <w:lang w:eastAsia="pt-PT"/>
         </w:rPr>
-        <w:t>3.</w:t>
-      </w:r>
+      </w:pPr>
       <w:r>
         <w:rPr>
           <w:rFonts w:ascii="Arial" w:eastAsia="Times New Roman" w:hAnsi="Arial" w:cs="Arial"/>
@@ -2932,9 +2550,8 @@
           <w:szCs w:val="36"/>
           <w:lang w:eastAsia="pt-PT"/>
         </w:rPr>
-        <w:t xml:space="preserve"> LINQ </w:t>
-      </w:r>
-      <w:proofErr w:type="spellStart"/>
+        <w:t>4.</w:t>
+      </w:r>
       <w:r>
         <w:rPr>
           <w:rFonts w:ascii="Arial" w:eastAsia="Times New Roman" w:hAnsi="Arial" w:cs="Arial"/>
@@ -2944,232 +2561,6 @@
           <w:szCs w:val="36"/>
           <w:lang w:eastAsia="pt-PT"/>
         </w:rPr>
-        <w:t>Method</w:t>
-      </w:r>
-      <w:proofErr w:type="spellEnd"/>
-      <w:r>
-        <w:rPr>
-          <w:rFonts w:ascii="Arial" w:eastAsia="Times New Roman" w:hAnsi="Arial" w:cs="Arial"/>
-          <w:b/>
-          <w:bCs/>
-          <w:sz w:val="36"/>
-          <w:szCs w:val="36"/>
-          <w:lang w:eastAsia="pt-PT"/>
-        </w:rPr>
-        <w:t xml:space="preserve"> </w:t>
-      </w:r>
-      <w:proofErr w:type="spellStart"/>
-      <w:r>
-        <w:rPr>
-          <w:rFonts w:ascii="Arial" w:eastAsia="Times New Roman" w:hAnsi="Arial" w:cs="Arial"/>
-          <w:b/>
-          <w:bCs/>
-          <w:sz w:val="36"/>
-          <w:szCs w:val="36"/>
-          <w:lang w:eastAsia="pt-PT"/>
-        </w:rPr>
-        <w:t>Syntax</w:t>
-      </w:r>
-      <w:proofErr w:type="spellEnd"/>
-    </w:p>
-    <w:p>
-      <w:pPr>
-        <w:spacing w:before="100" w:beforeAutospacing="1" w:after="100" w:afterAutospacing="1" w:line="240" w:lineRule="auto"/>
-        <w:rPr>
-          <w:rFonts w:ascii="Arial" w:eastAsia="Times New Roman" w:hAnsi="Arial" w:cs="Arial"/>
-          <w:sz w:val="24"/>
-          <w:szCs w:val="24"/>
-          <w:lang w:eastAsia="pt-PT"/>
-        </w:rPr>
-      </w:pPr>
-      <w:r>
-        <w:rPr>
-          <w:rFonts w:ascii="Arial" w:eastAsia="Times New Roman" w:hAnsi="Arial" w:cs="Arial"/>
-          <w:sz w:val="24"/>
-          <w:szCs w:val="24"/>
-          <w:lang w:eastAsia="pt-PT"/>
-        </w:rPr>
-        <w:t xml:space="preserve">Todas as consultas foram </w:t>
-      </w:r>
-      <w:r>
-        <w:rPr>
-          <w:rFonts w:ascii="Arial" w:eastAsia="Times New Roman" w:hAnsi="Arial" w:cs="Arial"/>
-          <w:sz w:val="24"/>
-          <w:szCs w:val="24"/>
-          <w:lang w:eastAsia="pt-PT"/>
-        </w:rPr>
-        <w:t>feitas</w:t>
-      </w:r>
-      <w:r>
-        <w:rPr>
-          <w:rFonts w:ascii="Arial" w:eastAsia="Times New Roman" w:hAnsi="Arial" w:cs="Arial"/>
-          <w:sz w:val="24"/>
-          <w:szCs w:val="24"/>
-          <w:lang w:eastAsia="pt-PT"/>
-        </w:rPr>
-        <w:t xml:space="preserve"> utilizando a sintaxe </w:t>
-      </w:r>
-      <w:proofErr w:type="spellStart"/>
-      <w:r>
-        <w:rPr>
-          <w:rFonts w:ascii="Arial" w:eastAsia="Times New Roman" w:hAnsi="Arial" w:cs="Arial"/>
-          <w:sz w:val="24"/>
-          <w:szCs w:val="24"/>
-          <w:lang w:eastAsia="pt-PT"/>
-        </w:rPr>
-        <w:t>Method</w:t>
-      </w:r>
-      <w:proofErr w:type="spellEnd"/>
-      <w:r>
-        <w:rPr>
-          <w:rFonts w:ascii="Arial" w:eastAsia="Times New Roman" w:hAnsi="Arial" w:cs="Arial"/>
-          <w:sz w:val="24"/>
-          <w:szCs w:val="24"/>
-          <w:lang w:eastAsia="pt-PT"/>
-        </w:rPr>
-        <w:t xml:space="preserve"> </w:t>
-      </w:r>
-      <w:proofErr w:type="spellStart"/>
-      <w:r>
-        <w:rPr>
-          <w:rFonts w:ascii="Arial" w:eastAsia="Times New Roman" w:hAnsi="Arial" w:cs="Arial"/>
-          <w:sz w:val="24"/>
-          <w:szCs w:val="24"/>
-          <w:lang w:eastAsia="pt-PT"/>
-        </w:rPr>
-        <w:t>Syntax</w:t>
-      </w:r>
-      <w:proofErr w:type="spellEnd"/>
-      <w:r>
-        <w:rPr>
-          <w:rFonts w:ascii="Arial" w:eastAsia="Times New Roman" w:hAnsi="Arial" w:cs="Arial"/>
-          <w:sz w:val="24"/>
-          <w:szCs w:val="24"/>
-          <w:lang w:eastAsia="pt-PT"/>
-        </w:rPr>
-        <w:t>.</w:t>
-      </w:r>
-    </w:p>
-    <w:p>
-      <w:pPr>
-        <w:spacing w:before="100" w:beforeAutospacing="1" w:after="100" w:afterAutospacing="1" w:line="240" w:lineRule="auto"/>
-        <w:rPr>
-          <w:rFonts w:ascii="Arial" w:eastAsia="Times New Roman" w:hAnsi="Arial" w:cs="Arial"/>
-          <w:sz w:val="24"/>
-          <w:szCs w:val="24"/>
-          <w:lang w:eastAsia="pt-PT"/>
-        </w:rPr>
-      </w:pPr>
-      <w:r>
-        <w:rPr>
-          <w:rFonts w:ascii="Arial" w:eastAsia="Times New Roman" w:hAnsi="Arial" w:cs="Arial"/>
-          <w:sz w:val="24"/>
-          <w:szCs w:val="24"/>
-          <w:lang w:eastAsia="pt-PT"/>
-        </w:rPr>
-        <w:t xml:space="preserve">Esta abordagem </w:t>
-      </w:r>
-      <w:r>
-        <w:rPr>
-          <w:rFonts w:ascii="Arial" w:eastAsia="Times New Roman" w:hAnsi="Arial" w:cs="Arial"/>
-          <w:sz w:val="24"/>
-          <w:szCs w:val="24"/>
-          <w:lang w:eastAsia="pt-PT"/>
-        </w:rPr>
-        <w:t>é muito</w:t>
-      </w:r>
-      <w:r>
-        <w:rPr>
-          <w:rFonts w:ascii="Arial" w:eastAsia="Times New Roman" w:hAnsi="Arial" w:cs="Arial"/>
-          <w:sz w:val="24"/>
-          <w:szCs w:val="24"/>
-          <w:lang w:eastAsia="pt-PT"/>
-        </w:rPr>
-        <w:t xml:space="preserve"> </w:t>
-      </w:r>
-      <w:proofErr w:type="spellStart"/>
-      <w:r>
-        <w:rPr>
-          <w:rFonts w:ascii="Arial" w:eastAsia="Times New Roman" w:hAnsi="Arial" w:cs="Arial"/>
-          <w:sz w:val="24"/>
-          <w:szCs w:val="24"/>
-          <w:lang w:eastAsia="pt-PT"/>
-        </w:rPr>
-        <w:t>flexivel</w:t>
-      </w:r>
-      <w:proofErr w:type="spellEnd"/>
-      <w:r>
-        <w:rPr>
-          <w:rFonts w:ascii="Arial" w:eastAsia="Times New Roman" w:hAnsi="Arial" w:cs="Arial"/>
-          <w:sz w:val="24"/>
-          <w:szCs w:val="24"/>
-          <w:lang w:eastAsia="pt-PT"/>
-        </w:rPr>
-        <w:t xml:space="preserve">, é amplamente utilizada em contexto profissional e foi a metodologia </w:t>
-      </w:r>
-      <w:r>
-        <w:rPr>
-          <w:rFonts w:ascii="Arial" w:eastAsia="Times New Roman" w:hAnsi="Arial" w:cs="Arial"/>
-          <w:sz w:val="24"/>
-          <w:szCs w:val="24"/>
-          <w:lang w:eastAsia="pt-PT"/>
-        </w:rPr>
-        <w:t>estudada</w:t>
-      </w:r>
-      <w:r>
-        <w:rPr>
-          <w:rFonts w:ascii="Arial" w:eastAsia="Times New Roman" w:hAnsi="Arial" w:cs="Arial"/>
-          <w:sz w:val="24"/>
-          <w:szCs w:val="24"/>
-          <w:lang w:eastAsia="pt-PT"/>
-        </w:rPr>
-        <w:t xml:space="preserve"> ao longo das aulas práticas.</w:t>
-      </w:r>
-    </w:p>
-    <w:p>
-      <w:pPr>
-        <w:spacing w:after="0" w:line="240" w:lineRule="auto"/>
-        <w:rPr>
-          <w:rFonts w:ascii="Arial" w:eastAsia="Times New Roman" w:hAnsi="Arial" w:cs="Arial"/>
-          <w:sz w:val="24"/>
-          <w:szCs w:val="24"/>
-          <w:lang w:eastAsia="pt-PT"/>
-        </w:rPr>
-      </w:pPr>
-    </w:p>
-    <w:p>
-      <w:pPr>
-        <w:spacing w:before="100" w:beforeAutospacing="1" w:after="100" w:afterAutospacing="1" w:line="240" w:lineRule="auto"/>
-        <w:outlineLvl w:val="1"/>
-        <w:rPr>
-          <w:rFonts w:ascii="Arial" w:eastAsia="Times New Roman" w:hAnsi="Arial" w:cs="Arial"/>
-          <w:b/>
-          <w:bCs/>
-          <w:sz w:val="36"/>
-          <w:szCs w:val="36"/>
-          <w:lang w:eastAsia="pt-PT"/>
-        </w:rPr>
-      </w:pPr>
-      <w:r>
-        <w:rPr>
-          <w:rFonts w:ascii="Arial" w:eastAsia="Times New Roman" w:hAnsi="Arial" w:cs="Arial"/>
-          <w:b/>
-          <w:bCs/>
-          <w:sz w:val="36"/>
-          <w:szCs w:val="36"/>
-          <w:lang w:eastAsia="pt-PT"/>
-        </w:rPr>
-        <w:t>4.</w:t>
-      </w:r>
-      <w:r>
-        <w:rPr>
-          <w:rFonts w:ascii="Arial" w:eastAsia="Times New Roman" w:hAnsi="Arial" w:cs="Arial"/>
-          <w:b/>
-          <w:bCs/>
-          <w:sz w:val="36"/>
-          <w:szCs w:val="36"/>
-          <w:lang w:eastAsia="pt-PT"/>
-        </w:rPr>
         <w:t xml:space="preserve"> Exceções</w:t>
       </w:r>
     </w:p>
@@ -3190,47 +2581,7 @@
           <w:szCs w:val="24"/>
           <w:lang w:eastAsia="pt-PT"/>
         </w:rPr>
-        <w:t xml:space="preserve">Todos os métodos que trabalham com a base de dados estão protegidos por blocos </w:t>
-      </w:r>
-      <w:proofErr w:type="spellStart"/>
-      <w:r>
-        <w:rPr>
-          <w:rFonts w:ascii="Arial" w:eastAsia="Times New Roman" w:hAnsi="Arial" w:cs="Arial"/>
-          <w:sz w:val="24"/>
-          <w:szCs w:val="24"/>
-          <w:lang w:eastAsia="pt-PT"/>
-        </w:rPr>
-        <w:t>try</w:t>
-      </w:r>
-      <w:proofErr w:type="spellEnd"/>
-      <w:r>
-        <w:rPr>
-          <w:rFonts w:ascii="Arial" w:eastAsia="Times New Roman" w:hAnsi="Arial" w:cs="Arial"/>
-          <w:sz w:val="24"/>
-          <w:szCs w:val="24"/>
-          <w:lang w:eastAsia="pt-PT"/>
-        </w:rPr>
-        <w:t>/</w:t>
-      </w:r>
-      <w:proofErr w:type="spellStart"/>
-      <w:r>
-        <w:rPr>
-          <w:rFonts w:ascii="Arial" w:eastAsia="Times New Roman" w:hAnsi="Arial" w:cs="Arial"/>
-          <w:sz w:val="24"/>
-          <w:szCs w:val="24"/>
-          <w:lang w:eastAsia="pt-PT"/>
-        </w:rPr>
-        <w:t>catch</w:t>
-      </w:r>
-      <w:proofErr w:type="spellEnd"/>
-      <w:r>
-        <w:rPr>
-          <w:rFonts w:ascii="Arial" w:eastAsia="Times New Roman" w:hAnsi="Arial" w:cs="Arial"/>
-          <w:sz w:val="24"/>
-          <w:szCs w:val="24"/>
-          <w:lang w:eastAsia="pt-PT"/>
-        </w:rPr>
-        <w:t>.</w:t>
+        <w:t>Todos os métodos que trabalham com a base de dados estão protegidos por blocos try/catch.</w:t>
       </w:r>
       <w:r>
         <w:rPr>
@@ -3310,7 +2661,7 @@
           <w:szCs w:val="24"/>
           <w:lang w:eastAsia="pt-PT"/>
         </w:rPr>
-        <w:t>Maior robustez da aplicação;</w:t>
+        <w:t>Evitar que a aplicação feche de forma inesperada;</w:t>
       </w:r>
     </w:p>
     <w:p>
@@ -3334,7 +2685,7 @@
           <w:szCs w:val="24"/>
           <w:lang w:eastAsia="pt-PT"/>
         </w:rPr>
-        <w:t>Prevenção de encerramentos inesperados;</w:t>
+        <w:t>Aplicação mais segura;</w:t>
       </w:r>
     </w:p>
     <w:p>
@@ -3378,27 +2729,7 @@
           <w:szCs w:val="24"/>
           <w:lang w:eastAsia="pt-PT"/>
         </w:rPr>
-        <w:t>As exceções são comunicadas através de caixas de diálogo (</w:t>
-      </w:r>
-      <w:proofErr w:type="spellStart"/>
-      <w:r>
-        <w:rPr>
-          <w:rFonts w:ascii="Arial" w:eastAsia="Times New Roman" w:hAnsi="Arial" w:cs="Arial"/>
-          <w:sz w:val="24"/>
-          <w:szCs w:val="24"/>
-          <w:lang w:eastAsia="pt-PT"/>
-        </w:rPr>
-        <w:t>MessageBox</w:t>
-      </w:r>
-      <w:proofErr w:type="spellEnd"/>
-      <w:r>
-        <w:rPr>
-          <w:rFonts w:ascii="Arial" w:eastAsia="Times New Roman" w:hAnsi="Arial" w:cs="Arial"/>
-          <w:sz w:val="24"/>
-          <w:szCs w:val="24"/>
-          <w:lang w:eastAsia="pt-PT"/>
-        </w:rPr>
-        <w:t>).</w:t>
+        <w:t>As exceções são comunicadas através de caixas de diálogo (MessageBox).</w:t>
       </w:r>
     </w:p>
     <w:p>
@@ -3481,20 +2812,17 @@
           <w:lang w:eastAsia="pt-PT"/>
         </w:rPr>
       </w:pPr>
-      <w:proofErr w:type="spellStart"/>
-      <w:r>
-        <w:rPr>
-          <w:rFonts w:ascii="Arial" w:eastAsia="Times New Roman" w:hAnsi="Arial" w:cs="Arial"/>
-          <w:b/>
-          <w:bCs/>
-          <w:sz w:val="24"/>
-          <w:szCs w:val="24"/>
-          <w:lang w:eastAsia="pt-PT"/>
-        </w:rPr>
-        <w:lastRenderedPageBreak/>
+      <w:r>
+        <w:rPr>
+          <w:rFonts w:ascii="Arial" w:eastAsia="Times New Roman" w:hAnsi="Arial" w:cs="Arial"/>
+          <w:b/>
+          <w:bCs/>
+          <w:sz w:val="24"/>
+          <w:szCs w:val="24"/>
+          <w:lang w:eastAsia="pt-PT"/>
+        </w:rPr>
         <w:t>ItemCompra</w:t>
       </w:r>
-      <w:proofErr w:type="spellEnd"/>
     </w:p>
     <w:p>
       <w:pPr>
@@ -3605,19 +2933,18 @@
           <w:lang w:eastAsia="pt-PT"/>
         </w:rPr>
       </w:pPr>
-      <w:proofErr w:type="spellStart"/>
-      <w:r>
-        <w:rPr>
-          <w:rFonts w:ascii="Arial" w:eastAsia="Times New Roman" w:hAnsi="Arial" w:cs="Arial"/>
-          <w:b/>
-          <w:bCs/>
-          <w:sz w:val="24"/>
-          <w:szCs w:val="24"/>
-          <w:lang w:eastAsia="pt-PT"/>
-        </w:rPr>
+      <w:r>
+        <w:rPr>
+          <w:rFonts w:ascii="Arial" w:eastAsia="Times New Roman" w:hAnsi="Arial" w:cs="Arial"/>
+          <w:b/>
+          <w:bCs/>
+          <w:sz w:val="24"/>
+          <w:szCs w:val="24"/>
+          <w:lang w:eastAsia="pt-PT"/>
+        </w:rPr>
+        <w:lastRenderedPageBreak/>
         <w:t>Orcamento</w:t>
       </w:r>
-      <w:proofErr w:type="spellEnd"/>
     </w:p>
     <w:p>
       <w:pPr>
@@ -4171,7 +3498,6 @@
           <w:szCs w:val="24"/>
           <w:lang w:eastAsia="pt-PT"/>
         </w:rPr>
-        <w:lastRenderedPageBreak/>
         <w:t xml:space="preserve">Foram </w:t>
       </w:r>
       <w:r>
@@ -4352,6 +3678,7 @@
           <w:szCs w:val="27"/>
           <w:lang w:eastAsia="pt-PT"/>
         </w:rPr>
+        <w:lastRenderedPageBreak/>
         <w:t>Gestão de Artigos</w:t>
       </w:r>
       <w:r>
@@ -4856,27 +4183,7 @@
           <w:szCs w:val="24"/>
           <w:lang w:eastAsia="pt-PT"/>
         </w:rPr>
-        <w:t xml:space="preserve">O </w:t>
-      </w:r>
-      <w:proofErr w:type="spellStart"/>
-      <w:r>
-        <w:rPr>
-          <w:rFonts w:ascii="Arial" w:eastAsia="Times New Roman" w:hAnsi="Arial" w:cs="Arial"/>
-          <w:sz w:val="24"/>
-          <w:szCs w:val="24"/>
-          <w:lang w:eastAsia="pt-PT"/>
-        </w:rPr>
-        <w:t>iShopping</w:t>
-      </w:r>
-      <w:proofErr w:type="spellEnd"/>
-      <w:r>
-        <w:rPr>
-          <w:rFonts w:ascii="Arial" w:eastAsia="Times New Roman" w:hAnsi="Arial" w:cs="Arial"/>
-          <w:sz w:val="24"/>
-          <w:szCs w:val="24"/>
-          <w:lang w:eastAsia="pt-PT"/>
-        </w:rPr>
-        <w:t xml:space="preserve"> é uma aplicação desenvolvida para apoiar a gestão de compras domésticas e controlo de orçamento familiar.</w:t>
+        <w:t>O iShopping é uma aplicação desenvolvida para apoiar a gestão de compras domésticas e controlo de orçamento familiar.</w:t>
       </w:r>
     </w:p>
     <w:p>
@@ -4944,7 +4251,6 @@
           <w:szCs w:val="24"/>
           <w:lang w:eastAsia="pt-PT"/>
         </w:rPr>
-        <w:lastRenderedPageBreak/>
         <w:t>Gestão de tipos de artigo;</w:t>
       </w:r>
     </w:p>
@@ -5225,27 +4531,7 @@
           <w:szCs w:val="24"/>
           <w:lang w:eastAsia="pt-PT"/>
         </w:rPr>
-        <w:t xml:space="preserve">SQL Server </w:t>
-      </w:r>
-      <w:proofErr w:type="spellStart"/>
-      <w:r>
-        <w:rPr>
-          <w:rFonts w:ascii="Arial" w:eastAsia="Times New Roman" w:hAnsi="Arial" w:cs="Arial"/>
-          <w:sz w:val="24"/>
-          <w:szCs w:val="24"/>
-          <w:lang w:eastAsia="pt-PT"/>
-        </w:rPr>
-        <w:t>LocalDB</w:t>
-      </w:r>
-      <w:proofErr w:type="spellEnd"/>
-      <w:r>
-        <w:rPr>
-          <w:rFonts w:ascii="Arial" w:eastAsia="Times New Roman" w:hAnsi="Arial" w:cs="Arial"/>
-          <w:sz w:val="24"/>
-          <w:szCs w:val="24"/>
-          <w:lang w:eastAsia="pt-PT"/>
-        </w:rPr>
-        <w:t>;</w:t>
+        <w:t>SQL Server LocalDB;</w:t>
       </w:r>
     </w:p>
     <w:p>
@@ -5262,25 +4548,14 @@
           <w:lang w:eastAsia="pt-PT"/>
         </w:rPr>
       </w:pPr>
-      <w:proofErr w:type="spellStart"/>
-      <w:r>
-        <w:rPr>
-          <w:rFonts w:ascii="Arial" w:eastAsia="Times New Roman" w:hAnsi="Arial" w:cs="Arial"/>
-          <w:sz w:val="24"/>
-          <w:szCs w:val="24"/>
-          <w:lang w:eastAsia="pt-PT"/>
-        </w:rPr>
-        <w:t>Entity</w:t>
-      </w:r>
-      <w:proofErr w:type="spellEnd"/>
-      <w:r>
-        <w:rPr>
-          <w:rFonts w:ascii="Arial" w:eastAsia="Times New Roman" w:hAnsi="Arial" w:cs="Arial"/>
-          <w:sz w:val="24"/>
-          <w:szCs w:val="24"/>
-          <w:lang w:eastAsia="pt-PT"/>
-        </w:rPr>
-        <w:t xml:space="preserve"> Framework 6.5.2.</w:t>
+      <w:r>
+        <w:rPr>
+          <w:rFonts w:ascii="Arial" w:eastAsia="Times New Roman" w:hAnsi="Arial" w:cs="Arial"/>
+          <w:sz w:val="24"/>
+          <w:szCs w:val="24"/>
+          <w:lang w:eastAsia="pt-PT"/>
+        </w:rPr>
+        <w:t>Entity Framework 6.5.2.</w:t>
       </w:r>
     </w:p>
     <w:p>
@@ -5385,27 +4660,7 @@
           <w:szCs w:val="24"/>
           <w:lang w:eastAsia="pt-PT"/>
         </w:rPr>
-        <w:t xml:space="preserve"> no Visual </w:t>
-      </w:r>
-      <w:proofErr w:type="spellStart"/>
-      <w:r>
-        <w:rPr>
-          <w:rFonts w:ascii="Arial" w:eastAsia="Times New Roman" w:hAnsi="Arial" w:cs="Arial"/>
-          <w:sz w:val="24"/>
-          <w:szCs w:val="24"/>
-          <w:lang w:eastAsia="pt-PT"/>
-        </w:rPr>
-        <w:t>Studio</w:t>
-      </w:r>
-      <w:proofErr w:type="spellEnd"/>
-      <w:r>
-        <w:rPr>
-          <w:rFonts w:ascii="Arial" w:eastAsia="Times New Roman" w:hAnsi="Arial" w:cs="Arial"/>
-          <w:sz w:val="24"/>
-          <w:szCs w:val="24"/>
-          <w:lang w:eastAsia="pt-PT"/>
-        </w:rPr>
-        <w:t>;</w:t>
+        <w:t xml:space="preserve"> no Visual Studio;</w:t>
       </w:r>
     </w:p>
     <w:p>
@@ -5429,47 +4684,7 @@
           <w:szCs w:val="24"/>
           <w:lang w:eastAsia="pt-PT"/>
         </w:rPr>
-        <w:t xml:space="preserve">Compilar a solução através da opção </w:t>
-      </w:r>
-      <w:proofErr w:type="spellStart"/>
-      <w:r>
-        <w:rPr>
-          <w:rFonts w:ascii="Arial" w:eastAsia="Times New Roman" w:hAnsi="Arial" w:cs="Arial"/>
-          <w:sz w:val="24"/>
-          <w:szCs w:val="24"/>
-          <w:lang w:eastAsia="pt-PT"/>
-        </w:rPr>
-        <w:t>Build</w:t>
-      </w:r>
-      <w:proofErr w:type="spellEnd"/>
-      <w:r>
-        <w:rPr>
-          <w:rFonts w:ascii="Arial" w:eastAsia="Times New Roman" w:hAnsi="Arial" w:cs="Arial"/>
-          <w:sz w:val="24"/>
-          <w:szCs w:val="24"/>
-          <w:lang w:eastAsia="pt-PT"/>
-        </w:rPr>
-        <w:t xml:space="preserve"> </w:t>
-      </w:r>
-      <w:proofErr w:type="spellStart"/>
-      <w:r>
-        <w:rPr>
-          <w:rFonts w:ascii="Arial" w:eastAsia="Times New Roman" w:hAnsi="Arial" w:cs="Arial"/>
-          <w:sz w:val="24"/>
-          <w:szCs w:val="24"/>
-          <w:lang w:eastAsia="pt-PT"/>
-        </w:rPr>
-        <w:t>Solution</w:t>
-      </w:r>
-      <w:proofErr w:type="spellEnd"/>
-      <w:r>
-        <w:rPr>
-          <w:rFonts w:ascii="Arial" w:eastAsia="Times New Roman" w:hAnsi="Arial" w:cs="Arial"/>
-          <w:sz w:val="24"/>
-          <w:szCs w:val="24"/>
-          <w:lang w:eastAsia="pt-PT"/>
-        </w:rPr>
-        <w:t>;</w:t>
+        <w:t>Compilar a solução através da opção Build Solution;</w:t>
       </w:r>
     </w:p>
     <w:p>
@@ -5581,80 +4796,7 @@
         </w:rPr>
         <w:t>Login</w:t>
       </w:r>
-    </w:p>
-    <w:p>
-      <w:pPr>
-        <w:spacing w:before="100" w:beforeAutospacing="1" w:after="100" w:afterAutospacing="1" w:line="240" w:lineRule="auto"/>
-        <w:rPr>
-          <w:rFonts w:ascii="Arial" w:eastAsia="Times New Roman" w:hAnsi="Arial" w:cs="Arial"/>
-          <w:sz w:val="24"/>
-          <w:szCs w:val="24"/>
-          <w:lang w:eastAsia="pt-PT"/>
-        </w:rPr>
-      </w:pPr>
-      <w:r>
-        <w:rPr>
-          <w:rFonts w:ascii="Arial" w:eastAsia="Times New Roman" w:hAnsi="Arial" w:cs="Arial"/>
-          <w:sz w:val="24"/>
-          <w:szCs w:val="24"/>
-          <w:lang w:eastAsia="pt-PT"/>
-        </w:rPr>
-        <w:t>O utilizador deve introduzir</w:t>
-      </w:r>
-      <w:r>
-        <w:rPr>
-          <w:rFonts w:ascii="Arial" w:eastAsia="Times New Roman" w:hAnsi="Arial" w:cs="Arial"/>
-          <w:sz w:val="24"/>
-          <w:szCs w:val="24"/>
-          <w:lang w:eastAsia="pt-PT"/>
-        </w:rPr>
-        <w:t xml:space="preserve"> </w:t>
-      </w:r>
-      <w:proofErr w:type="spellStart"/>
-      <w:r>
-        <w:rPr>
-          <w:rFonts w:ascii="Arial" w:eastAsia="Times New Roman" w:hAnsi="Arial" w:cs="Arial"/>
-          <w:sz w:val="24"/>
-          <w:szCs w:val="24"/>
-          <w:lang w:eastAsia="pt-PT"/>
-        </w:rPr>
-        <w:t>username</w:t>
-      </w:r>
-      <w:proofErr w:type="spellEnd"/>
-      <w:r>
-        <w:rPr>
-          <w:rFonts w:ascii="Arial" w:eastAsia="Times New Roman" w:hAnsi="Arial" w:cs="Arial"/>
-          <w:sz w:val="24"/>
-          <w:szCs w:val="24"/>
-          <w:lang w:eastAsia="pt-PT"/>
-        </w:rPr>
-        <w:t xml:space="preserve"> e password.</w:t>
-      </w:r>
-    </w:p>
-    <w:p>
-      <w:pPr>
-        <w:spacing w:before="100" w:beforeAutospacing="1" w:after="100" w:afterAutospacing="1" w:line="240" w:lineRule="auto"/>
-        <w:rPr>
-          <w:rFonts w:ascii="Arial" w:eastAsia="Times New Roman" w:hAnsi="Arial" w:cs="Arial"/>
-          <w:sz w:val="24"/>
-          <w:szCs w:val="24"/>
-          <w:lang w:eastAsia="pt-PT"/>
-        </w:rPr>
-      </w:pPr>
-      <w:r>
-        <w:rPr>
-          <w:rFonts w:ascii="Arial" w:eastAsia="Times New Roman" w:hAnsi="Arial" w:cs="Arial"/>
-          <w:sz w:val="24"/>
-          <w:szCs w:val="24"/>
-          <w:lang w:eastAsia="pt-PT"/>
-        </w:rPr>
-        <w:t>Após validação das credenciais é apresentada a janela principal.</w:t>
-      </w:r>
-    </w:p>
-    <w:p>
-      <w:pPr>
-        <w:spacing w:before="100" w:beforeAutospacing="1" w:after="100" w:afterAutospacing="1" w:line="240" w:lineRule="auto"/>
-        <w:outlineLvl w:val="2"/>
+      <w:r>
         <w:rPr>
           <w:rFonts w:ascii="Arial" w:eastAsia="Times New Roman" w:hAnsi="Arial" w:cs="Arial"/>
           <w:b/>
@@ -5663,7 +4805,26 @@
           <w:szCs w:val="27"/>
           <w:lang w:eastAsia="pt-PT"/>
         </w:rPr>
-      </w:pPr>
+        <w:t xml:space="preserve">: </w:t>
+      </w:r>
+      <w:r>
+        <w:rPr>
+          <w:rFonts w:ascii="Arial" w:eastAsia="Times New Roman" w:hAnsi="Arial" w:cs="Arial"/>
+          <w:sz w:val="24"/>
+          <w:szCs w:val="24"/>
+          <w:lang w:eastAsia="pt-PT"/>
+        </w:rPr>
+        <w:t>O utilizador deve introduzir</w:t>
+      </w:r>
+      <w:r>
+        <w:rPr>
+          <w:rFonts w:ascii="Arial" w:eastAsia="Times New Roman" w:hAnsi="Arial" w:cs="Arial"/>
+          <w:sz w:val="24"/>
+          <w:szCs w:val="24"/>
+          <w:lang w:eastAsia="pt-PT"/>
+        </w:rPr>
+        <w:t xml:space="preserve"> username e password.</w:t>
+      </w:r>
       <w:r>
         <w:rPr>
           <w:rFonts w:ascii="Arial" w:eastAsia="Times New Roman" w:hAnsi="Arial" w:cs="Arial"/>
@@ -5673,19 +4834,53 @@
           <w:szCs w:val="27"/>
           <w:lang w:eastAsia="pt-PT"/>
         </w:rPr>
+        <w:t xml:space="preserve"> </w:t>
+      </w:r>
+      <w:r>
+        <w:rPr>
+          <w:rFonts w:ascii="Arial" w:eastAsia="Times New Roman" w:hAnsi="Arial" w:cs="Arial"/>
+          <w:sz w:val="24"/>
+          <w:szCs w:val="24"/>
+          <w:lang w:eastAsia="pt-PT"/>
+        </w:rPr>
+        <w:t>Após validação das credenciais é apresentada a janela principal.</w:t>
+      </w:r>
+    </w:p>
+    <w:p>
+      <w:pPr>
+        <w:spacing w:before="100" w:beforeAutospacing="1" w:after="100" w:afterAutospacing="1" w:line="240" w:lineRule="auto"/>
+        <w:outlineLvl w:val="2"/>
+        <w:rPr>
+          <w:rFonts w:ascii="Arial" w:eastAsia="Times New Roman" w:hAnsi="Arial" w:cs="Arial"/>
+          <w:b/>
+          <w:bCs/>
+          <w:sz w:val="27"/>
+          <w:szCs w:val="27"/>
+          <w:lang w:eastAsia="pt-PT"/>
+        </w:rPr>
+      </w:pPr>
+      <w:r>
+        <w:rPr>
+          <w:rFonts w:ascii="Arial" w:eastAsia="Times New Roman" w:hAnsi="Arial" w:cs="Arial"/>
+          <w:b/>
+          <w:bCs/>
+          <w:sz w:val="27"/>
+          <w:szCs w:val="27"/>
+          <w:lang w:eastAsia="pt-PT"/>
+        </w:rPr>
         <w:t>Registo</w:t>
       </w:r>
-    </w:p>
-    <w:p>
-      <w:pPr>
-        <w:spacing w:before="100" w:beforeAutospacing="1" w:after="100" w:afterAutospacing="1" w:line="240" w:lineRule="auto"/>
-        <w:rPr>
-          <w:rFonts w:ascii="Arial" w:eastAsia="Times New Roman" w:hAnsi="Arial" w:cs="Arial"/>
-          <w:sz w:val="24"/>
-          <w:szCs w:val="24"/>
-          <w:lang w:eastAsia="pt-PT"/>
-        </w:rPr>
-      </w:pPr>
+      <w:r>
+        <w:rPr>
+          <w:rFonts w:ascii="Arial" w:eastAsia="Times New Roman" w:hAnsi="Arial" w:cs="Arial"/>
+          <w:b/>
+          <w:bCs/>
+          <w:sz w:val="27"/>
+          <w:szCs w:val="27"/>
+          <w:lang w:eastAsia="pt-PT"/>
+        </w:rPr>
+        <w:t xml:space="preserve">: </w:t>
+      </w:r>
       <w:r>
         <w:rPr>
           <w:rFonts w:ascii="Arial" w:eastAsia="Times New Roman" w:hAnsi="Arial" w:cs="Arial"/>
@@ -5720,17 +4915,7 @@
           <w:szCs w:val="24"/>
           <w:lang w:eastAsia="pt-PT"/>
         </w:rPr>
-        <w:t xml:space="preserve">, o </w:t>
-      </w:r>
-      <w:proofErr w:type="spellStart"/>
-      <w:r>
-        <w:rPr>
-          <w:rFonts w:ascii="Arial" w:eastAsia="Times New Roman" w:hAnsi="Arial" w:cs="Arial"/>
-          <w:sz w:val="24"/>
-          <w:szCs w:val="24"/>
-          <w:lang w:eastAsia="pt-PT"/>
-        </w:rPr>
-        <w:t>u</w:t>
+        <w:t>, o u</w:t>
       </w:r>
       <w:r>
         <w:rPr>
@@ -5741,7 +4926,6 @@
         </w:rPr>
         <w:t>sername</w:t>
       </w:r>
-      <w:proofErr w:type="spellEnd"/>
       <w:r>
         <w:rPr>
           <w:rFonts w:ascii="Arial" w:eastAsia="Times New Roman" w:hAnsi="Arial" w:cs="Arial"/>
@@ -5832,22 +5016,31 @@
     <w:p>
       <w:pPr>
         <w:spacing w:before="100" w:beforeAutospacing="1" w:after="100" w:afterAutospacing="1" w:line="240" w:lineRule="auto"/>
-        <w:rPr>
-          <w:rFonts w:ascii="Arial" w:eastAsia="Times New Roman" w:hAnsi="Arial" w:cs="Arial"/>
-          <w:sz w:val="24"/>
-          <w:szCs w:val="24"/>
-          <w:lang w:eastAsia="pt-PT"/>
-        </w:rPr>
-      </w:pPr>
-      <w:r>
-        <w:rPr>
-          <w:rFonts w:ascii="Arial" w:eastAsia="Times New Roman" w:hAnsi="Arial" w:cs="Arial"/>
-          <w:sz w:val="24"/>
-          <w:szCs w:val="24"/>
-          <w:lang w:eastAsia="pt-PT"/>
-        </w:rPr>
-        <w:lastRenderedPageBreak/>
-        <w:t>Na janela principal podemos ver:</w:t>
+        <w:outlineLvl w:val="1"/>
+        <w:rPr>
+          <w:rFonts w:ascii="Arial" w:eastAsia="Times New Roman" w:hAnsi="Arial" w:cs="Arial"/>
+          <w:sz w:val="24"/>
+          <w:szCs w:val="24"/>
+          <w:lang w:eastAsia="pt-PT"/>
+        </w:rPr>
+      </w:pPr>
+      <w:r>
+        <w:rPr>
+          <w:rFonts w:ascii="Arial" w:eastAsia="Times New Roman" w:hAnsi="Arial" w:cs="Arial"/>
+          <w:sz w:val="24"/>
+          <w:szCs w:val="24"/>
+          <w:lang w:eastAsia="pt-PT"/>
+        </w:rPr>
+        <w:t>Abrange</w:t>
+      </w:r>
+      <w:r>
+        <w:rPr>
+          <w:rFonts w:ascii="Arial" w:eastAsia="Times New Roman" w:hAnsi="Arial" w:cs="Arial"/>
+          <w:sz w:val="24"/>
+          <w:szCs w:val="24"/>
+          <w:lang w:eastAsia="pt-PT"/>
+        </w:rPr>
+        <w:t>:</w:t>
       </w:r>
     </w:p>
     <w:p>
@@ -5890,27 +5083,7 @@
           <w:szCs w:val="27"/>
           <w:lang w:eastAsia="pt-PT"/>
         </w:rPr>
-        <w:t xml:space="preserve">com 4 </w:t>
-      </w:r>
-      <w:proofErr w:type="spellStart"/>
-      <w:r>
-        <w:rPr>
-          <w:rFonts w:ascii="Arial" w:eastAsia="Times New Roman" w:hAnsi="Arial" w:cs="Arial"/>
-          <w:sz w:val="27"/>
-          <w:szCs w:val="27"/>
-          <w:lang w:eastAsia="pt-PT"/>
-        </w:rPr>
-        <w:t>tabs</w:t>
-      </w:r>
-      <w:proofErr w:type="spellEnd"/>
-      <w:r>
-        <w:rPr>
-          <w:rFonts w:ascii="Arial" w:eastAsia="Times New Roman" w:hAnsi="Arial" w:cs="Arial"/>
-          <w:sz w:val="27"/>
-          <w:szCs w:val="27"/>
-          <w:lang w:eastAsia="pt-PT"/>
-        </w:rPr>
-        <w:t>:</w:t>
+        <w:t>com 4 tabs:</w:t>
       </w:r>
     </w:p>
     <w:p>
@@ -6067,6 +5240,7 @@
           <w:szCs w:val="24"/>
           <w:lang w:eastAsia="pt-PT"/>
         </w:rPr>
+        <w:lastRenderedPageBreak/>
         <w:t xml:space="preserve">2 - </w:t>
       </w:r>
       <w:r>
@@ -6447,17 +5621,15 @@
         </w:rPr>
         <w:t>liminar utilizadores.</w:t>
       </w:r>
-    </w:p>
-    <w:p>
-      <w:pPr>
-        <w:spacing w:before="100" w:beforeAutospacing="1" w:after="100" w:afterAutospacing="1" w:line="240" w:lineRule="auto"/>
-        <w:rPr>
-          <w:rFonts w:ascii="Arial" w:eastAsia="Times New Roman" w:hAnsi="Arial" w:cs="Arial"/>
-          <w:sz w:val="24"/>
-          <w:szCs w:val="24"/>
-          <w:lang w:eastAsia="pt-PT"/>
-        </w:rPr>
-      </w:pPr>
+      <w:r>
+        <w:rPr>
+          <w:rFonts w:ascii="Arial" w:eastAsia="Times New Roman" w:hAnsi="Arial" w:cs="Arial"/>
+          <w:sz w:val="24"/>
+          <w:szCs w:val="24"/>
+          <w:lang w:eastAsia="pt-PT"/>
+        </w:rPr>
+        <w:t xml:space="preserve"> </w:t>
+      </w:r>
       <w:r>
         <w:rPr>
           <w:rFonts w:ascii="Arial" w:eastAsia="Times New Roman" w:hAnsi="Arial" w:cs="Arial"/>
@@ -6510,17 +5682,7 @@
           <w:szCs w:val="24"/>
           <w:lang w:eastAsia="pt-PT"/>
         </w:rPr>
-        <w:t xml:space="preserve">, </w:t>
-      </w:r>
-      <w:proofErr w:type="spellStart"/>
-      <w:r>
-        <w:rPr>
-          <w:rFonts w:ascii="Arial" w:eastAsia="Times New Roman" w:hAnsi="Arial" w:cs="Arial"/>
-          <w:sz w:val="24"/>
-          <w:szCs w:val="24"/>
-          <w:lang w:eastAsia="pt-PT"/>
-        </w:rPr>
-        <w:t>u</w:t>
+        <w:t>, u</w:t>
       </w:r>
       <w:r>
         <w:rPr>
@@ -6531,7 +5693,6 @@
         </w:rPr>
         <w:t>sername</w:t>
       </w:r>
-      <w:proofErr w:type="spellEnd"/>
       <w:r>
         <w:rPr>
           <w:rFonts w:ascii="Arial" w:eastAsia="Times New Roman" w:hAnsi="Arial" w:cs="Arial"/>
@@ -6609,111 +5770,17 @@
           <w:szCs w:val="24"/>
           <w:lang w:eastAsia="pt-PT"/>
         </w:rPr>
-        <w:t>Permite criar categorias para organização dos artigos.</w:t>
-      </w:r>
-    </w:p>
-    <w:p>
-      <w:pPr>
-        <w:spacing w:before="100" w:beforeAutospacing="1" w:after="100" w:afterAutospacing="1" w:line="240" w:lineRule="auto"/>
-        <w:rPr>
-          <w:rFonts w:ascii="Arial" w:eastAsia="Times New Roman" w:hAnsi="Arial" w:cs="Arial"/>
-          <w:sz w:val="24"/>
-          <w:szCs w:val="24"/>
-          <w:lang w:eastAsia="pt-PT"/>
-        </w:rPr>
-      </w:pPr>
-      <w:r>
-        <w:rPr>
-          <w:rFonts w:ascii="Arial" w:eastAsia="Times New Roman" w:hAnsi="Arial" w:cs="Arial"/>
-          <w:sz w:val="24"/>
-          <w:szCs w:val="24"/>
-          <w:lang w:eastAsia="pt-PT"/>
-        </w:rPr>
-        <w:t>Exemplos:</w:t>
-      </w:r>
-    </w:p>
-    <w:p>
-      <w:pPr>
-        <w:numPr>
-          <w:ilvl w:val="0"/>
-          <w:numId w:val="24"/>
-        </w:numPr>
-        <w:spacing w:before="100" w:beforeAutospacing="1" w:after="100" w:afterAutospacing="1" w:line="240" w:lineRule="auto"/>
-        <w:rPr>
-          <w:rFonts w:ascii="Arial" w:eastAsia="Times New Roman" w:hAnsi="Arial" w:cs="Arial"/>
-          <w:sz w:val="24"/>
-          <w:szCs w:val="24"/>
-          <w:lang w:eastAsia="pt-PT"/>
-        </w:rPr>
-      </w:pPr>
-      <w:r>
-        <w:rPr>
-          <w:rFonts w:ascii="Arial" w:eastAsia="Times New Roman" w:hAnsi="Arial" w:cs="Arial"/>
-          <w:sz w:val="24"/>
-          <w:szCs w:val="24"/>
-          <w:lang w:eastAsia="pt-PT"/>
-        </w:rPr>
-        <w:t>Alimentação;</w:t>
-      </w:r>
-    </w:p>
-    <w:p>
-      <w:pPr>
-        <w:numPr>
-          <w:ilvl w:val="0"/>
-          <w:numId w:val="24"/>
-        </w:numPr>
-        <w:spacing w:before="100" w:beforeAutospacing="1" w:after="100" w:afterAutospacing="1" w:line="240" w:lineRule="auto"/>
-        <w:rPr>
-          <w:rFonts w:ascii="Arial" w:eastAsia="Times New Roman" w:hAnsi="Arial" w:cs="Arial"/>
-          <w:sz w:val="24"/>
-          <w:szCs w:val="24"/>
-          <w:lang w:eastAsia="pt-PT"/>
-        </w:rPr>
-      </w:pPr>
-      <w:r>
-        <w:rPr>
-          <w:rFonts w:ascii="Arial" w:eastAsia="Times New Roman" w:hAnsi="Arial" w:cs="Arial"/>
-          <w:sz w:val="24"/>
-          <w:szCs w:val="24"/>
-          <w:lang w:eastAsia="pt-PT"/>
-        </w:rPr>
-        <w:t>Limpeza;</w:t>
-      </w:r>
-    </w:p>
-    <w:p>
-      <w:pPr>
-        <w:numPr>
-          <w:ilvl w:val="0"/>
-          <w:numId w:val="24"/>
-        </w:numPr>
-        <w:spacing w:before="100" w:beforeAutospacing="1" w:after="100" w:afterAutospacing="1" w:line="240" w:lineRule="auto"/>
-        <w:rPr>
-          <w:rFonts w:ascii="Arial" w:eastAsia="Times New Roman" w:hAnsi="Arial" w:cs="Arial"/>
-          <w:sz w:val="24"/>
-          <w:szCs w:val="24"/>
-          <w:lang w:eastAsia="pt-PT"/>
-        </w:rPr>
-      </w:pPr>
-      <w:r>
-        <w:rPr>
-          <w:rFonts w:ascii="Arial" w:eastAsia="Times New Roman" w:hAnsi="Arial" w:cs="Arial"/>
-          <w:sz w:val="24"/>
-          <w:szCs w:val="24"/>
-          <w:lang w:eastAsia="pt-PT"/>
-        </w:rPr>
-        <w:t>Higiene.</w:t>
-      </w:r>
-    </w:p>
-    <w:p>
-      <w:pPr>
-        <w:spacing w:before="100" w:beforeAutospacing="1" w:after="100" w:afterAutospacing="1" w:line="240" w:lineRule="auto"/>
-        <w:rPr>
-          <w:rFonts w:ascii="Arial" w:eastAsia="Times New Roman" w:hAnsi="Arial" w:cs="Arial"/>
-          <w:sz w:val="24"/>
-          <w:szCs w:val="24"/>
-          <w:lang w:eastAsia="pt-PT"/>
-        </w:rPr>
-      </w:pPr>
+        <w:t>Permite criar categorias para organização dos artigos</w:t>
+      </w:r>
+      <w:r>
+        <w:rPr>
+          <w:rFonts w:ascii="Arial" w:eastAsia="Times New Roman" w:hAnsi="Arial" w:cs="Arial"/>
+          <w:sz w:val="24"/>
+          <w:szCs w:val="24"/>
+          <w:lang w:eastAsia="pt-PT"/>
+        </w:rPr>
+        <w:t xml:space="preserve">, como alimentação, limpeza, higiene, etc. </w:t>
+      </w:r>
       <w:r>
         <w:rPr>
           <w:rFonts w:ascii="Arial" w:eastAsia="Times New Roman" w:hAnsi="Arial" w:cs="Arial"/>
@@ -6959,16 +6026,36 @@
           <w:szCs w:val="24"/>
           <w:lang w:eastAsia="pt-PT"/>
         </w:rPr>
-        <w:t>Permite definir o valor máximo disponível para cada mês.</w:t>
-      </w:r>
-    </w:p>
-    <w:p>
-      <w:pPr>
-        <w:spacing w:before="100" w:beforeAutospacing="1" w:after="100" w:afterAutospacing="1" w:line="240" w:lineRule="auto"/>
-        <w:rPr>
-          <w:rFonts w:ascii="Arial" w:eastAsia="Times New Roman" w:hAnsi="Arial" w:cs="Arial"/>
-          <w:sz w:val="24"/>
-          <w:szCs w:val="24"/>
+        <w:lastRenderedPageBreak/>
+        <w:t>Permite definir o valor máximo disponível para cada mês</w:t>
+      </w:r>
+      <w:r>
+        <w:rPr>
+          <w:rFonts w:ascii="Arial" w:eastAsia="Times New Roman" w:hAnsi="Arial" w:cs="Arial"/>
+          <w:sz w:val="24"/>
+          <w:szCs w:val="24"/>
+          <w:lang w:eastAsia="pt-PT"/>
+        </w:rPr>
+        <w:t xml:space="preserve"> e </w:t>
+      </w:r>
+      <w:r>
+        <w:rPr>
+          <w:rFonts w:ascii="Arial" w:eastAsia="Times New Roman" w:hAnsi="Arial" w:cs="Arial"/>
+          <w:sz w:val="24"/>
+          <w:szCs w:val="24"/>
+          <w:lang w:eastAsia="pt-PT"/>
+        </w:rPr>
+        <w:t>impede a duplicação de orçamentos para o mesmo período.</w:t>
+      </w:r>
+    </w:p>
+    <w:p>
+      <w:pPr>
+        <w:spacing w:before="100" w:beforeAutospacing="1" w:after="100" w:afterAutospacing="1" w:line="240" w:lineRule="auto"/>
+        <w:rPr>
+          <w:rFonts w:ascii="Arial" w:eastAsia="Times New Roman" w:hAnsi="Arial" w:cs="Arial"/>
+          <w:sz w:val="24"/>
+          <w:szCs w:val="24"/>
+          <w:u w:val="single"/>
           <w:lang w:eastAsia="pt-PT"/>
         </w:rPr>
       </w:pPr>
@@ -6981,69 +6068,51 @@
         </w:rPr>
         <w:t>Informação registada:</w:t>
       </w:r>
-    </w:p>
-    <w:p>
-      <w:pPr>
-        <w:numPr>
-          <w:ilvl w:val="0"/>
-          <w:numId w:val="26"/>
-        </w:numPr>
-        <w:spacing w:before="100" w:beforeAutospacing="1" w:after="100" w:afterAutospacing="1" w:line="240" w:lineRule="auto"/>
-        <w:rPr>
-          <w:rFonts w:ascii="Arial" w:eastAsia="Times New Roman" w:hAnsi="Arial" w:cs="Arial"/>
-          <w:sz w:val="24"/>
-          <w:szCs w:val="24"/>
-          <w:lang w:eastAsia="pt-PT"/>
-        </w:rPr>
-      </w:pPr>
-      <w:r>
-        <w:rPr>
-          <w:rFonts w:ascii="Arial" w:eastAsia="Times New Roman" w:hAnsi="Arial" w:cs="Arial"/>
-          <w:sz w:val="24"/>
-          <w:szCs w:val="24"/>
-          <w:lang w:eastAsia="pt-PT"/>
-        </w:rPr>
-        <w:t>Mês;</w:t>
-      </w:r>
-    </w:p>
-    <w:p>
-      <w:pPr>
-        <w:numPr>
-          <w:ilvl w:val="0"/>
-          <w:numId w:val="26"/>
-        </w:numPr>
-        <w:spacing w:before="100" w:beforeAutospacing="1" w:after="100" w:afterAutospacing="1" w:line="240" w:lineRule="auto"/>
-        <w:rPr>
-          <w:rFonts w:ascii="Arial" w:eastAsia="Times New Roman" w:hAnsi="Arial" w:cs="Arial"/>
-          <w:sz w:val="24"/>
-          <w:szCs w:val="24"/>
-          <w:lang w:eastAsia="pt-PT"/>
-        </w:rPr>
-      </w:pPr>
-      <w:r>
-        <w:rPr>
-          <w:rFonts w:ascii="Arial" w:eastAsia="Times New Roman" w:hAnsi="Arial" w:cs="Arial"/>
-          <w:sz w:val="24"/>
-          <w:szCs w:val="24"/>
-          <w:lang w:eastAsia="pt-PT"/>
-        </w:rPr>
-        <w:t>Ano;</w:t>
-      </w:r>
-    </w:p>
-    <w:p>
-      <w:pPr>
-        <w:numPr>
-          <w:ilvl w:val="0"/>
-          <w:numId w:val="26"/>
-        </w:numPr>
-        <w:spacing w:before="100" w:beforeAutospacing="1" w:after="100" w:afterAutospacing="1" w:line="240" w:lineRule="auto"/>
-        <w:rPr>
-          <w:rFonts w:ascii="Arial" w:eastAsia="Times New Roman" w:hAnsi="Arial" w:cs="Arial"/>
-          <w:sz w:val="24"/>
-          <w:szCs w:val="24"/>
-          <w:lang w:eastAsia="pt-PT"/>
-        </w:rPr>
-      </w:pPr>
+      <w:r>
+        <w:rPr>
+          <w:rFonts w:ascii="Arial" w:eastAsia="Times New Roman" w:hAnsi="Arial" w:cs="Arial"/>
+          <w:sz w:val="24"/>
+          <w:szCs w:val="24"/>
+          <w:lang w:eastAsia="pt-PT"/>
+        </w:rPr>
+        <w:t xml:space="preserve"> </w:t>
+      </w:r>
+      <w:r>
+        <w:rPr>
+          <w:rFonts w:ascii="Arial" w:eastAsia="Times New Roman" w:hAnsi="Arial" w:cs="Arial"/>
+          <w:sz w:val="24"/>
+          <w:szCs w:val="24"/>
+          <w:lang w:eastAsia="pt-PT"/>
+        </w:rPr>
+        <w:t>Mês</w:t>
+      </w:r>
+      <w:r>
+        <w:rPr>
+          <w:rFonts w:ascii="Arial" w:eastAsia="Times New Roman" w:hAnsi="Arial" w:cs="Arial"/>
+          <w:sz w:val="24"/>
+          <w:szCs w:val="24"/>
+          <w:lang w:eastAsia="pt-PT"/>
+        </w:rPr>
+        <w:t xml:space="preserve">, </w:t>
+      </w:r>
+      <w:r>
+        <w:rPr>
+          <w:rFonts w:ascii="Arial" w:eastAsia="Times New Roman" w:hAnsi="Arial" w:cs="Arial"/>
+          <w:sz w:val="24"/>
+          <w:szCs w:val="24"/>
+          <w:lang w:eastAsia="pt-PT"/>
+        </w:rPr>
+        <w:t>Ano</w:t>
+      </w:r>
+      <w:r>
+        <w:rPr>
+          <w:rFonts w:ascii="Arial" w:eastAsia="Times New Roman" w:hAnsi="Arial" w:cs="Arial"/>
+          <w:sz w:val="24"/>
+          <w:szCs w:val="24"/>
+          <w:lang w:eastAsia="pt-PT"/>
+        </w:rPr>
+        <w:t xml:space="preserve"> e </w:t>
+      </w:r>
       <w:r>
         <w:rPr>
           <w:rFonts w:ascii="Arial" w:eastAsia="Times New Roman" w:hAnsi="Arial" w:cs="Arial"/>
@@ -7053,37 +6122,6 @@
         </w:rPr>
         <w:t>Valor.</w:t>
       </w:r>
-    </w:p>
-    <w:p>
-      <w:pPr>
-        <w:spacing w:before="100" w:beforeAutospacing="1" w:after="100" w:afterAutospacing="1" w:line="240" w:lineRule="auto"/>
-        <w:rPr>
-          <w:rFonts w:ascii="Arial" w:eastAsia="Times New Roman" w:hAnsi="Arial" w:cs="Arial"/>
-          <w:sz w:val="24"/>
-          <w:szCs w:val="24"/>
-          <w:lang w:eastAsia="pt-PT"/>
-        </w:rPr>
-      </w:pPr>
-      <w:r>
-        <w:rPr>
-          <w:rFonts w:ascii="Arial" w:eastAsia="Times New Roman" w:hAnsi="Arial" w:cs="Arial"/>
-          <w:sz w:val="24"/>
-          <w:szCs w:val="24"/>
-          <w:lang w:eastAsia="pt-PT"/>
-        </w:rPr>
-        <w:t>A aplicação impede a duplicação de orçamentos para o mesmo período.</w:t>
-      </w:r>
-    </w:p>
-    <w:p>
-      <w:pPr>
-        <w:spacing w:after="0" w:line="240" w:lineRule="auto"/>
-        <w:rPr>
-          <w:rFonts w:ascii="Arial" w:eastAsia="Times New Roman" w:hAnsi="Arial" w:cs="Arial"/>
-          <w:sz w:val="24"/>
-          <w:szCs w:val="24"/>
-          <w:lang w:eastAsia="pt-PT"/>
-        </w:rPr>
-      </w:pPr>
     </w:p>
     <w:p>
       <w:pPr>
@@ -7272,7 +6310,34 @@
           <w:szCs w:val="24"/>
           <w:lang w:eastAsia="pt-PT"/>
         </w:rPr>
-        <w:t>Filtros disponíveis:</w:t>
+        <w:t>Com f</w:t>
+      </w:r>
+      <w:r>
+        <w:rPr>
+          <w:rFonts w:ascii="Arial" w:eastAsia="Times New Roman" w:hAnsi="Arial" w:cs="Arial"/>
+          <w:sz w:val="24"/>
+          <w:szCs w:val="24"/>
+          <w:lang w:eastAsia="pt-PT"/>
+        </w:rPr>
+        <w:t>iltros disponíveis</w:t>
+      </w:r>
+      <w:r>
+        <w:rPr>
+          <w:rFonts w:ascii="Arial" w:eastAsia="Times New Roman" w:hAnsi="Arial" w:cs="Arial"/>
+          <w:sz w:val="24"/>
+          <w:szCs w:val="24"/>
+          <w:lang w:eastAsia="pt-PT"/>
+        </w:rPr>
+        <w:t xml:space="preserve"> para melhor eficiência</w:t>
+      </w:r>
+      <w:r>
+        <w:rPr>
+          <w:rFonts w:ascii="Arial" w:eastAsia="Times New Roman" w:hAnsi="Arial" w:cs="Arial"/>
+          <w:sz w:val="24"/>
+          <w:szCs w:val="24"/>
+          <w:lang w:eastAsia="pt-PT"/>
+        </w:rPr>
+        <w:t>:</w:t>
       </w:r>
     </w:p>
     <w:p>
@@ -7333,17 +6398,6 @@
           <w:lang w:eastAsia="pt-PT"/>
         </w:rPr>
       </w:pPr>
-      <w:r>
-        <w:rPr>
-          <w:rFonts w:ascii="Arial" w:eastAsia="Times New Roman" w:hAnsi="Arial" w:cs="Arial"/>
-          <w:sz w:val="24"/>
-          <w:szCs w:val="24"/>
-          <w:lang w:eastAsia="pt-PT"/>
-        </w:rPr>
-        <w:pict>
-          <v:rect id="_x0000_i1046" style="width:0;height:1.5pt" o:hralign="center" o:hrstd="t" o:hr="t" fillcolor="#a0a0a0" stroked="f"/>
-        </w:pict>
-      </w:r>
     </w:p>
     <w:p>
       <w:pPr>
@@ -7392,7 +6446,6 @@
           <w:szCs w:val="24"/>
           <w:lang w:eastAsia="pt-PT"/>
         </w:rPr>
-        <w:lastRenderedPageBreak/>
         <w:t>Durante a edição é possível:</w:t>
       </w:r>
     </w:p>
@@ -7420,25 +6473,43 @@
         </w:rPr>
         <w:t>Adicionar Itens</w:t>
       </w:r>
-    </w:p>
-    <w:p>
-      <w:pPr>
-        <w:spacing w:before="100" w:beforeAutospacing="1" w:after="100" w:afterAutospacing="1" w:line="240" w:lineRule="auto"/>
-        <w:rPr>
-          <w:rFonts w:ascii="Arial" w:eastAsia="Times New Roman" w:hAnsi="Arial" w:cs="Arial"/>
-          <w:sz w:val="24"/>
-          <w:szCs w:val="24"/>
-          <w:lang w:eastAsia="pt-PT"/>
-        </w:rPr>
-      </w:pPr>
-      <w:r>
-        <w:rPr>
-          <w:rFonts w:ascii="Arial" w:eastAsia="Times New Roman" w:hAnsi="Arial" w:cs="Arial"/>
-          <w:sz w:val="24"/>
-          <w:szCs w:val="24"/>
-          <w:lang w:eastAsia="pt-PT"/>
-        </w:rPr>
-        <w:t>Selecionar:</w:t>
+      <w:r>
+        <w:rPr>
+          <w:rFonts w:ascii="Arial" w:eastAsia="Times New Roman" w:hAnsi="Arial" w:cs="Arial"/>
+          <w:b/>
+          <w:bCs/>
+          <w:sz w:val="27"/>
+          <w:szCs w:val="27"/>
+          <w:lang w:eastAsia="pt-PT"/>
+        </w:rPr>
+        <w:t xml:space="preserve"> </w:t>
+      </w:r>
+      <w:r>
+        <w:rPr>
+          <w:rFonts w:ascii="Arial" w:eastAsia="Times New Roman" w:hAnsi="Arial" w:cs="Arial"/>
+          <w:sz w:val="24"/>
+          <w:szCs w:val="24"/>
+          <w:lang w:eastAsia="pt-PT"/>
+        </w:rPr>
+        <w:t>Seleciona</w:t>
+      </w:r>
+      <w:r>
+        <w:rPr>
+          <w:rFonts w:ascii="Arial" w:eastAsia="Times New Roman" w:hAnsi="Arial" w:cs="Arial"/>
+          <w:sz w:val="24"/>
+          <w:szCs w:val="24"/>
+          <w:lang w:eastAsia="pt-PT"/>
+        </w:rPr>
+        <w:t>ndo</w:t>
+      </w:r>
+      <w:r>
+        <w:rPr>
+          <w:rFonts w:ascii="Arial" w:eastAsia="Times New Roman" w:hAnsi="Arial" w:cs="Arial"/>
+          <w:sz w:val="24"/>
+          <w:szCs w:val="24"/>
+          <w:lang w:eastAsia="pt-PT"/>
+        </w:rPr>
+        <w:t>:</w:t>
       </w:r>
     </w:p>
     <w:p>
@@ -7537,31 +6608,7 @@
         </w:rPr>
         <w:t>Editar Itens</w:t>
       </w:r>
-    </w:p>
-    <w:p>
-      <w:pPr>
-        <w:spacing w:before="100" w:beforeAutospacing="1" w:after="100" w:afterAutospacing="1" w:line="240" w:lineRule="auto"/>
-        <w:rPr>
-          <w:rFonts w:ascii="Arial" w:eastAsia="Times New Roman" w:hAnsi="Arial" w:cs="Arial"/>
-          <w:sz w:val="24"/>
-          <w:szCs w:val="24"/>
-          <w:lang w:eastAsia="pt-PT"/>
-        </w:rPr>
-      </w:pPr>
-      <w:r>
-        <w:rPr>
-          <w:rFonts w:ascii="Arial" w:eastAsia="Times New Roman" w:hAnsi="Arial" w:cs="Arial"/>
-          <w:sz w:val="24"/>
-          <w:szCs w:val="24"/>
-          <w:lang w:eastAsia="pt-PT"/>
-        </w:rPr>
-        <w:t>Alterar os dados previamente registados.</w:t>
-      </w:r>
-    </w:p>
-    <w:p>
-      <w:pPr>
-        <w:spacing w:before="100" w:beforeAutospacing="1" w:after="100" w:afterAutospacing="1" w:line="240" w:lineRule="auto"/>
-        <w:outlineLvl w:val="2"/>
+      <w:r>
         <w:rPr>
           <w:rFonts w:ascii="Arial" w:eastAsia="Times New Roman" w:hAnsi="Arial" w:cs="Arial"/>
           <w:b/>
@@ -7570,8 +6617,40 @@
           <w:szCs w:val="27"/>
           <w:lang w:eastAsia="pt-PT"/>
         </w:rPr>
-      </w:pPr>
-      <w:r>
+        <w:t xml:space="preserve">: </w:t>
+      </w:r>
+      <w:r>
+        <w:rPr>
+          <w:rFonts w:ascii="Arial" w:eastAsia="Times New Roman" w:hAnsi="Arial" w:cs="Arial"/>
+          <w:sz w:val="24"/>
+          <w:szCs w:val="24"/>
+          <w:lang w:eastAsia="pt-PT"/>
+        </w:rPr>
+        <w:t xml:space="preserve">Alterar os dados </w:t>
+      </w:r>
+      <w:r>
+        <w:rPr>
+          <w:rFonts w:ascii="Arial" w:eastAsia="Times New Roman" w:hAnsi="Arial" w:cs="Arial"/>
+          <w:sz w:val="24"/>
+          <w:szCs w:val="24"/>
+          <w:lang w:eastAsia="pt-PT"/>
+        </w:rPr>
+        <w:t>anteriormente</w:t>
+      </w:r>
+      <w:r>
+        <w:rPr>
+          <w:rFonts w:ascii="Arial" w:eastAsia="Times New Roman" w:hAnsi="Arial" w:cs="Arial"/>
+          <w:sz w:val="24"/>
+          <w:szCs w:val="24"/>
+          <w:lang w:eastAsia="pt-PT"/>
+        </w:rPr>
+        <w:t xml:space="preserve"> registados.</w:t>
+      </w:r>
+    </w:p>
+    <w:p>
+      <w:pPr>
+        <w:spacing w:before="100" w:beforeAutospacing="1" w:after="100" w:afterAutospacing="1" w:line="240" w:lineRule="auto"/>
+        <w:outlineLvl w:val="2"/>
         <w:rPr>
           <w:rFonts w:ascii="Arial" w:eastAsia="Times New Roman" w:hAnsi="Arial" w:cs="Arial"/>
           <w:b/>
@@ -7580,19 +6659,29 @@
           <w:szCs w:val="27"/>
           <w:lang w:eastAsia="pt-PT"/>
         </w:rPr>
+      </w:pPr>
+      <w:r>
+        <w:rPr>
+          <w:rFonts w:ascii="Arial" w:eastAsia="Times New Roman" w:hAnsi="Arial" w:cs="Arial"/>
+          <w:b/>
+          <w:bCs/>
+          <w:sz w:val="27"/>
+          <w:szCs w:val="27"/>
+          <w:lang w:eastAsia="pt-PT"/>
+        </w:rPr>
         <w:t>Remover Itens</w:t>
       </w:r>
-    </w:p>
-    <w:p>
-      <w:pPr>
-        <w:spacing w:before="100" w:beforeAutospacing="1" w:after="100" w:afterAutospacing="1" w:line="240" w:lineRule="auto"/>
-        <w:rPr>
-          <w:rFonts w:ascii="Arial" w:eastAsia="Times New Roman" w:hAnsi="Arial" w:cs="Arial"/>
-          <w:sz w:val="24"/>
-          <w:szCs w:val="24"/>
-          <w:lang w:eastAsia="pt-PT"/>
-        </w:rPr>
-      </w:pPr>
+      <w:r>
+        <w:rPr>
+          <w:rFonts w:ascii="Arial" w:eastAsia="Times New Roman" w:hAnsi="Arial" w:cs="Arial"/>
+          <w:b/>
+          <w:bCs/>
+          <w:sz w:val="27"/>
+          <w:szCs w:val="27"/>
+          <w:lang w:eastAsia="pt-PT"/>
+        </w:rPr>
+        <w:t xml:space="preserve">: </w:t>
+      </w:r>
       <w:r>
         <w:rPr>
           <w:rFonts w:ascii="Arial" w:eastAsia="Times New Roman" w:hAnsi="Arial" w:cs="Arial"/>
@@ -7661,79 +6750,79 @@
           <w:szCs w:val="24"/>
           <w:lang w:eastAsia="pt-PT"/>
         </w:rPr>
-        <w:t>Durante a execução da compra são apresentados:</w:t>
-      </w:r>
-    </w:p>
-    <w:p>
-      <w:pPr>
-        <w:numPr>
-          <w:ilvl w:val="0"/>
-          <w:numId w:val="30"/>
-        </w:numPr>
-        <w:spacing w:before="100" w:beforeAutospacing="1" w:after="100" w:afterAutospacing="1" w:line="240" w:lineRule="auto"/>
-        <w:rPr>
-          <w:rFonts w:ascii="Arial" w:eastAsia="Times New Roman" w:hAnsi="Arial" w:cs="Arial"/>
-          <w:sz w:val="24"/>
-          <w:szCs w:val="24"/>
-          <w:lang w:eastAsia="pt-PT"/>
-        </w:rPr>
-      </w:pPr>
-      <w:r>
-        <w:rPr>
-          <w:rFonts w:ascii="Arial" w:eastAsia="Times New Roman" w:hAnsi="Arial" w:cs="Arial"/>
-          <w:sz w:val="24"/>
-          <w:szCs w:val="24"/>
-          <w:lang w:eastAsia="pt-PT"/>
-        </w:rPr>
-        <w:t>Orçamento mensal disponível;</w:t>
-      </w:r>
-    </w:p>
-    <w:p>
-      <w:pPr>
-        <w:numPr>
-          <w:ilvl w:val="0"/>
-          <w:numId w:val="30"/>
-        </w:numPr>
-        <w:spacing w:before="100" w:beforeAutospacing="1" w:after="100" w:afterAutospacing="1" w:line="240" w:lineRule="auto"/>
-        <w:rPr>
-          <w:rFonts w:ascii="Arial" w:eastAsia="Times New Roman" w:hAnsi="Arial" w:cs="Arial"/>
-          <w:sz w:val="24"/>
-          <w:szCs w:val="24"/>
-          <w:lang w:eastAsia="pt-PT"/>
-        </w:rPr>
-      </w:pPr>
-      <w:r>
-        <w:rPr>
-          <w:rFonts w:ascii="Arial" w:eastAsia="Times New Roman" w:hAnsi="Arial" w:cs="Arial"/>
-          <w:sz w:val="24"/>
-          <w:szCs w:val="24"/>
-          <w:lang w:eastAsia="pt-PT"/>
-        </w:rPr>
-        <w:t>Valor já gasto;</w:t>
-      </w:r>
-    </w:p>
-    <w:p>
-      <w:pPr>
-        <w:numPr>
-          <w:ilvl w:val="0"/>
-          <w:numId w:val="30"/>
-        </w:numPr>
-        <w:spacing w:before="100" w:beforeAutospacing="1" w:after="100" w:afterAutospacing="1" w:line="240" w:lineRule="auto"/>
-        <w:rPr>
-          <w:rFonts w:ascii="Arial" w:eastAsia="Times New Roman" w:hAnsi="Arial" w:cs="Arial"/>
-          <w:sz w:val="24"/>
-          <w:szCs w:val="24"/>
-          <w:lang w:eastAsia="pt-PT"/>
-        </w:rPr>
-      </w:pPr>
-      <w:r>
-        <w:rPr>
-          <w:rFonts w:ascii="Arial" w:eastAsia="Times New Roman" w:hAnsi="Arial" w:cs="Arial"/>
-          <w:sz w:val="24"/>
-          <w:szCs w:val="24"/>
-          <w:lang w:eastAsia="pt-PT"/>
-        </w:rPr>
-        <w:t>Valor restante.</w:t>
+        <w:t xml:space="preserve">Durante a execução da compra </w:t>
+      </w:r>
+      <w:r>
+        <w:rPr>
+          <w:rFonts w:ascii="Arial" w:eastAsia="Times New Roman" w:hAnsi="Arial" w:cs="Arial"/>
+          <w:sz w:val="24"/>
+          <w:szCs w:val="24"/>
+          <w:lang w:eastAsia="pt-PT"/>
+        </w:rPr>
+        <w:t>é</w:t>
+      </w:r>
+      <w:r>
+        <w:rPr>
+          <w:rFonts w:ascii="Arial" w:eastAsia="Times New Roman" w:hAnsi="Arial" w:cs="Arial"/>
+          <w:sz w:val="24"/>
+          <w:szCs w:val="24"/>
+          <w:lang w:eastAsia="pt-PT"/>
+        </w:rPr>
+        <w:t xml:space="preserve"> apresentado</w:t>
+      </w:r>
+      <w:r>
+        <w:rPr>
+          <w:rFonts w:ascii="Arial" w:eastAsia="Times New Roman" w:hAnsi="Arial" w:cs="Arial"/>
+          <w:sz w:val="24"/>
+          <w:szCs w:val="24"/>
+          <w:lang w:eastAsia="pt-PT"/>
+        </w:rPr>
+        <w:t xml:space="preserve">: o </w:t>
+      </w:r>
+      <w:r>
+        <w:rPr>
+          <w:rFonts w:ascii="Arial" w:eastAsia="Times New Roman" w:hAnsi="Arial" w:cs="Arial"/>
+          <w:sz w:val="24"/>
+          <w:szCs w:val="24"/>
+          <w:lang w:eastAsia="pt-PT"/>
+        </w:rPr>
+        <w:t>Orçamento mensal disponível</w:t>
+      </w:r>
+      <w:r>
+        <w:rPr>
+          <w:rFonts w:ascii="Arial" w:eastAsia="Times New Roman" w:hAnsi="Arial" w:cs="Arial"/>
+          <w:sz w:val="24"/>
+          <w:szCs w:val="24"/>
+          <w:lang w:eastAsia="pt-PT"/>
+        </w:rPr>
+        <w:t>, o v</w:t>
+      </w:r>
+      <w:r>
+        <w:rPr>
+          <w:rFonts w:ascii="Arial" w:eastAsia="Times New Roman" w:hAnsi="Arial" w:cs="Arial"/>
+          <w:sz w:val="24"/>
+          <w:szCs w:val="24"/>
+          <w:lang w:eastAsia="pt-PT"/>
+        </w:rPr>
+        <w:t>alor já gasto</w:t>
+      </w:r>
+      <w:r>
+        <w:rPr>
+          <w:rFonts w:ascii="Arial" w:eastAsia="Times New Roman" w:hAnsi="Arial" w:cs="Arial"/>
+          <w:sz w:val="24"/>
+          <w:szCs w:val="24"/>
+          <w:lang w:eastAsia="pt-PT"/>
+        </w:rPr>
+        <w:t xml:space="preserve"> e o v</w:t>
+      </w:r>
+      <w:r>
+        <w:rPr>
+          <w:rFonts w:ascii="Arial" w:eastAsia="Times New Roman" w:hAnsi="Arial" w:cs="Arial"/>
+          <w:sz w:val="24"/>
+          <w:szCs w:val="24"/>
+          <w:lang w:eastAsia="pt-PT"/>
+        </w:rPr>
+        <w:t>alor restante.</w:t>
       </w:r>
     </w:p>
     <w:p>
@@ -7803,55 +6892,44 @@
           <w:szCs w:val="24"/>
           <w:lang w:eastAsia="pt-PT"/>
         </w:rPr>
-        <w:t>Permite registar:</w:t>
-      </w:r>
-    </w:p>
-    <w:p>
-      <w:pPr>
-        <w:numPr>
-          <w:ilvl w:val="0"/>
-          <w:numId w:val="31"/>
-        </w:numPr>
-        <w:spacing w:before="100" w:beforeAutospacing="1" w:after="100" w:afterAutospacing="1" w:line="240" w:lineRule="auto"/>
-        <w:rPr>
-          <w:rFonts w:ascii="Arial" w:eastAsia="Times New Roman" w:hAnsi="Arial" w:cs="Arial"/>
-          <w:sz w:val="24"/>
-          <w:szCs w:val="24"/>
-          <w:lang w:eastAsia="pt-PT"/>
-        </w:rPr>
-      </w:pPr>
-      <w:r>
-        <w:rPr>
-          <w:rFonts w:ascii="Arial" w:eastAsia="Times New Roman" w:hAnsi="Arial" w:cs="Arial"/>
-          <w:sz w:val="24"/>
-          <w:szCs w:val="24"/>
-          <w:lang w:eastAsia="pt-PT"/>
-        </w:rPr>
-        <w:t>Quantidade adquirida;</w:t>
-      </w:r>
-    </w:p>
-    <w:p>
-      <w:pPr>
-        <w:numPr>
-          <w:ilvl w:val="0"/>
-          <w:numId w:val="31"/>
-        </w:numPr>
-        <w:spacing w:before="100" w:beforeAutospacing="1" w:after="100" w:afterAutospacing="1" w:line="240" w:lineRule="auto"/>
-        <w:rPr>
-          <w:rFonts w:ascii="Arial" w:eastAsia="Times New Roman" w:hAnsi="Arial" w:cs="Arial"/>
-          <w:sz w:val="24"/>
-          <w:szCs w:val="24"/>
-          <w:lang w:eastAsia="pt-PT"/>
-        </w:rPr>
-      </w:pPr>
-      <w:r>
-        <w:rPr>
-          <w:rFonts w:ascii="Arial" w:eastAsia="Times New Roman" w:hAnsi="Arial" w:cs="Arial"/>
-          <w:sz w:val="24"/>
-          <w:szCs w:val="24"/>
-          <w:lang w:eastAsia="pt-PT"/>
-        </w:rPr>
-        <w:t>Preço unitário.</w:t>
+        <w:lastRenderedPageBreak/>
+        <w:t>Permite registar</w:t>
+      </w:r>
+      <w:r>
+        <w:rPr>
+          <w:rFonts w:ascii="Arial" w:eastAsia="Times New Roman" w:hAnsi="Arial" w:cs="Arial"/>
+          <w:sz w:val="24"/>
+          <w:szCs w:val="24"/>
+          <w:lang w:eastAsia="pt-PT"/>
+        </w:rPr>
+        <w:t xml:space="preserve"> a q</w:t>
+      </w:r>
+      <w:r>
+        <w:rPr>
+          <w:rFonts w:ascii="Arial" w:eastAsia="Times New Roman" w:hAnsi="Arial" w:cs="Arial"/>
+          <w:sz w:val="24"/>
+          <w:szCs w:val="24"/>
+          <w:lang w:eastAsia="pt-PT"/>
+        </w:rPr>
+        <w:t>uantidade adquirida</w:t>
+      </w:r>
+      <w:r>
+        <w:rPr>
+          <w:rFonts w:ascii="Arial" w:eastAsia="Times New Roman" w:hAnsi="Arial" w:cs="Arial"/>
+          <w:sz w:val="24"/>
+          <w:szCs w:val="24"/>
+          <w:lang w:eastAsia="pt-PT"/>
+        </w:rPr>
+        <w:t xml:space="preserve"> e o p</w:t>
+      </w:r>
+      <w:r>
+        <w:rPr>
+          <w:rFonts w:ascii="Arial" w:eastAsia="Times New Roman" w:hAnsi="Arial" w:cs="Arial"/>
+          <w:sz w:val="24"/>
+          <w:szCs w:val="24"/>
+          <w:lang w:eastAsia="pt-PT"/>
+        </w:rPr>
+        <w:t>reço unitário.</w:t>
       </w:r>
     </w:p>
     <w:p>
@@ -7941,76 +7019,79 @@
           <w:szCs w:val="24"/>
           <w:lang w:eastAsia="pt-PT"/>
         </w:rPr>
-        <w:t>Finaliza a compra e regista:</w:t>
-      </w:r>
-    </w:p>
-    <w:p>
-      <w:pPr>
-        <w:numPr>
-          <w:ilvl w:val="0"/>
-          <w:numId w:val="32"/>
-        </w:numPr>
-        <w:spacing w:before="100" w:beforeAutospacing="1" w:after="100" w:afterAutospacing="1" w:line="240" w:lineRule="auto"/>
-        <w:rPr>
-          <w:rFonts w:ascii="Arial" w:eastAsia="Times New Roman" w:hAnsi="Arial" w:cs="Arial"/>
-          <w:sz w:val="24"/>
-          <w:szCs w:val="24"/>
-          <w:lang w:eastAsia="pt-PT"/>
-        </w:rPr>
-      </w:pPr>
-      <w:r>
-        <w:rPr>
-          <w:rFonts w:ascii="Arial" w:eastAsia="Times New Roman" w:hAnsi="Arial" w:cs="Arial"/>
-          <w:sz w:val="24"/>
-          <w:szCs w:val="24"/>
-          <w:lang w:eastAsia="pt-PT"/>
-        </w:rPr>
-        <w:t>Data e hora de fecho;</w:t>
-      </w:r>
-    </w:p>
-    <w:p>
-      <w:pPr>
-        <w:numPr>
-          <w:ilvl w:val="0"/>
-          <w:numId w:val="32"/>
-        </w:numPr>
-        <w:spacing w:before="100" w:beforeAutospacing="1" w:after="100" w:afterAutospacing="1" w:line="240" w:lineRule="auto"/>
-        <w:rPr>
-          <w:rFonts w:ascii="Arial" w:eastAsia="Times New Roman" w:hAnsi="Arial" w:cs="Arial"/>
-          <w:sz w:val="24"/>
-          <w:szCs w:val="24"/>
-          <w:lang w:eastAsia="pt-PT"/>
-        </w:rPr>
-      </w:pPr>
-      <w:r>
-        <w:rPr>
-          <w:rFonts w:ascii="Arial" w:eastAsia="Times New Roman" w:hAnsi="Arial" w:cs="Arial"/>
-          <w:sz w:val="24"/>
-          <w:szCs w:val="24"/>
-          <w:lang w:eastAsia="pt-PT"/>
-        </w:rPr>
-        <w:t>Utilizador responsável.</w:t>
-      </w:r>
-    </w:p>
-    <w:p>
-      <w:pPr>
-        <w:spacing w:before="100" w:beforeAutospacing="1" w:after="100" w:afterAutospacing="1" w:line="240" w:lineRule="auto"/>
-        <w:rPr>
-          <w:rFonts w:ascii="Arial" w:eastAsia="Times New Roman" w:hAnsi="Arial" w:cs="Arial"/>
-          <w:sz w:val="24"/>
-          <w:szCs w:val="24"/>
-          <w:lang w:eastAsia="pt-PT"/>
-        </w:rPr>
-      </w:pPr>
-      <w:r>
-        <w:rPr>
-          <w:rFonts w:ascii="Arial" w:eastAsia="Times New Roman" w:hAnsi="Arial" w:cs="Arial"/>
-          <w:sz w:val="24"/>
-          <w:szCs w:val="24"/>
-          <w:lang w:eastAsia="pt-PT"/>
-        </w:rPr>
-        <w:lastRenderedPageBreak/>
-        <w:t>Quando o orçamento é ultrapassado, a aplicação apresenta um aviso visual e uma mensagem de alerta.</w:t>
+        <w:t>Finaliza a compra e regista</w:t>
+      </w:r>
+      <w:r>
+        <w:rPr>
+          <w:rFonts w:ascii="Arial" w:eastAsia="Times New Roman" w:hAnsi="Arial" w:cs="Arial"/>
+          <w:sz w:val="24"/>
+          <w:szCs w:val="24"/>
+          <w:lang w:eastAsia="pt-PT"/>
+        </w:rPr>
+        <w:t xml:space="preserve"> a d</w:t>
+      </w:r>
+      <w:r>
+        <w:rPr>
+          <w:rFonts w:ascii="Arial" w:eastAsia="Times New Roman" w:hAnsi="Arial" w:cs="Arial"/>
+          <w:sz w:val="24"/>
+          <w:szCs w:val="24"/>
+          <w:lang w:eastAsia="pt-PT"/>
+        </w:rPr>
+        <w:t>ata e hora de fecho</w:t>
+      </w:r>
+      <w:r>
+        <w:rPr>
+          <w:rFonts w:ascii="Arial" w:eastAsia="Times New Roman" w:hAnsi="Arial" w:cs="Arial"/>
+          <w:sz w:val="24"/>
+          <w:szCs w:val="24"/>
+          <w:lang w:eastAsia="pt-PT"/>
+        </w:rPr>
+        <w:t xml:space="preserve"> e o u</w:t>
+      </w:r>
+      <w:r>
+        <w:rPr>
+          <w:rFonts w:ascii="Arial" w:eastAsia="Times New Roman" w:hAnsi="Arial" w:cs="Arial"/>
+          <w:sz w:val="24"/>
+          <w:szCs w:val="24"/>
+          <w:lang w:eastAsia="pt-PT"/>
+        </w:rPr>
+        <w:t>tilizador responsável</w:t>
+      </w:r>
+      <w:r>
+        <w:rPr>
+          <w:rFonts w:ascii="Arial" w:eastAsia="Times New Roman" w:hAnsi="Arial" w:cs="Arial"/>
+          <w:sz w:val="24"/>
+          <w:szCs w:val="24"/>
+          <w:lang w:eastAsia="pt-PT"/>
+        </w:rPr>
+        <w:t xml:space="preserve"> pelo mesmo</w:t>
+      </w:r>
+      <w:r>
+        <w:rPr>
+          <w:rFonts w:ascii="Arial" w:eastAsia="Times New Roman" w:hAnsi="Arial" w:cs="Arial"/>
+          <w:sz w:val="24"/>
+          <w:szCs w:val="24"/>
+          <w:lang w:eastAsia="pt-PT"/>
+        </w:rPr>
+        <w:t>.</w:t>
+      </w:r>
+      <w:r>
+        <w:rPr>
+          <w:rFonts w:ascii="Arial" w:eastAsia="Times New Roman" w:hAnsi="Arial" w:cs="Arial"/>
+          <w:sz w:val="24"/>
+          <w:szCs w:val="24"/>
+          <w:lang w:eastAsia="pt-PT"/>
+        </w:rPr>
+        <w:t xml:space="preserve"> </w:t>
+      </w:r>
+      <w:r>
+        <w:rPr>
+          <w:rFonts w:ascii="Arial" w:eastAsia="Times New Roman" w:hAnsi="Arial" w:cs="Arial"/>
+          <w:sz w:val="24"/>
+          <w:szCs w:val="24"/>
+          <w:lang w:eastAsia="pt-PT"/>
+        </w:rPr>
+        <w:t>Quando o orçamento é ultrapassado, a aplicação apresenta um aviso e uma mensagem de alerta.</w:t>
       </w:r>
     </w:p>
     <w:p>
@@ -8096,103 +7177,79 @@
           <w:szCs w:val="24"/>
           <w:lang w:eastAsia="pt-PT"/>
         </w:rPr>
-        <w:t>Disponibiliza:</w:t>
-      </w:r>
-    </w:p>
-    <w:p>
-      <w:pPr>
-        <w:numPr>
-          <w:ilvl w:val="0"/>
-          <w:numId w:val="33"/>
-        </w:numPr>
-        <w:spacing w:before="100" w:beforeAutospacing="1" w:after="100" w:afterAutospacing="1" w:line="240" w:lineRule="auto"/>
-        <w:rPr>
-          <w:rFonts w:ascii="Arial" w:eastAsia="Times New Roman" w:hAnsi="Arial" w:cs="Arial"/>
-          <w:sz w:val="24"/>
-          <w:szCs w:val="24"/>
-          <w:lang w:eastAsia="pt-PT"/>
-        </w:rPr>
-      </w:pPr>
-      <w:r>
-        <w:rPr>
-          <w:rFonts w:ascii="Arial" w:eastAsia="Times New Roman" w:hAnsi="Arial" w:cs="Arial"/>
-          <w:sz w:val="24"/>
-          <w:szCs w:val="24"/>
-          <w:lang w:eastAsia="pt-PT"/>
-        </w:rPr>
-        <w:t>Orçamento definido;</w:t>
-      </w:r>
-    </w:p>
-    <w:p>
-      <w:pPr>
-        <w:numPr>
-          <w:ilvl w:val="0"/>
-          <w:numId w:val="33"/>
-        </w:numPr>
-        <w:spacing w:before="100" w:beforeAutospacing="1" w:after="100" w:afterAutospacing="1" w:line="240" w:lineRule="auto"/>
-        <w:rPr>
-          <w:rFonts w:ascii="Arial" w:eastAsia="Times New Roman" w:hAnsi="Arial" w:cs="Arial"/>
-          <w:sz w:val="24"/>
-          <w:szCs w:val="24"/>
-          <w:lang w:eastAsia="pt-PT"/>
-        </w:rPr>
-      </w:pPr>
-      <w:r>
-        <w:rPr>
-          <w:rFonts w:ascii="Arial" w:eastAsia="Times New Roman" w:hAnsi="Arial" w:cs="Arial"/>
-          <w:sz w:val="24"/>
-          <w:szCs w:val="24"/>
-          <w:lang w:eastAsia="pt-PT"/>
-        </w:rPr>
-        <w:t>Total gasto;</w:t>
-      </w:r>
-    </w:p>
-    <w:p>
-      <w:pPr>
-        <w:numPr>
-          <w:ilvl w:val="0"/>
-          <w:numId w:val="33"/>
-        </w:numPr>
-        <w:spacing w:before="100" w:beforeAutospacing="1" w:after="100" w:afterAutospacing="1" w:line="240" w:lineRule="auto"/>
-        <w:rPr>
-          <w:rFonts w:ascii="Arial" w:eastAsia="Times New Roman" w:hAnsi="Arial" w:cs="Arial"/>
-          <w:sz w:val="24"/>
-          <w:szCs w:val="24"/>
-          <w:lang w:eastAsia="pt-PT"/>
-        </w:rPr>
-      </w:pPr>
-      <w:r>
-        <w:rPr>
-          <w:rFonts w:ascii="Arial" w:eastAsia="Times New Roman" w:hAnsi="Arial" w:cs="Arial"/>
-          <w:sz w:val="24"/>
-          <w:szCs w:val="24"/>
-          <w:lang w:eastAsia="pt-PT"/>
-        </w:rPr>
-        <w:t>Diferença entre ambos;</w:t>
-      </w:r>
-    </w:p>
-    <w:p>
-      <w:pPr>
-        <w:numPr>
-          <w:ilvl w:val="0"/>
-          <w:numId w:val="33"/>
-        </w:numPr>
-        <w:spacing w:before="100" w:beforeAutospacing="1" w:after="100" w:afterAutospacing="1" w:line="240" w:lineRule="auto"/>
-        <w:rPr>
-          <w:rFonts w:ascii="Arial" w:eastAsia="Times New Roman" w:hAnsi="Arial" w:cs="Arial"/>
-          <w:sz w:val="24"/>
-          <w:szCs w:val="24"/>
-          <w:lang w:eastAsia="pt-PT"/>
-        </w:rPr>
-      </w:pPr>
-      <w:r>
-        <w:rPr>
-          <w:rFonts w:ascii="Arial" w:eastAsia="Times New Roman" w:hAnsi="Arial" w:cs="Arial"/>
-          <w:sz w:val="24"/>
-          <w:szCs w:val="24"/>
-          <w:lang w:eastAsia="pt-PT"/>
-        </w:rPr>
-        <w:t>Percentagem de artigos previstos e não previstos.</w:t>
+        <w:t>Disponibiliza</w:t>
+      </w:r>
+      <w:r>
+        <w:rPr>
+          <w:rFonts w:ascii="Arial" w:eastAsia="Times New Roman" w:hAnsi="Arial" w:cs="Arial"/>
+          <w:sz w:val="24"/>
+          <w:szCs w:val="24"/>
+          <w:lang w:eastAsia="pt-PT"/>
+        </w:rPr>
+        <w:t>m o o</w:t>
+      </w:r>
+      <w:r>
+        <w:rPr>
+          <w:rFonts w:ascii="Arial" w:eastAsia="Times New Roman" w:hAnsi="Arial" w:cs="Arial"/>
+          <w:sz w:val="24"/>
+          <w:szCs w:val="24"/>
+          <w:lang w:eastAsia="pt-PT"/>
+        </w:rPr>
+        <w:t>rçamento definido</w:t>
+      </w:r>
+      <w:r>
+        <w:rPr>
+          <w:rFonts w:ascii="Arial" w:eastAsia="Times New Roman" w:hAnsi="Arial" w:cs="Arial"/>
+          <w:sz w:val="24"/>
+          <w:szCs w:val="24"/>
+          <w:lang w:eastAsia="pt-PT"/>
+        </w:rPr>
+        <w:t>, o t</w:t>
+      </w:r>
+      <w:r>
+        <w:rPr>
+          <w:rFonts w:ascii="Arial" w:eastAsia="Times New Roman" w:hAnsi="Arial" w:cs="Arial"/>
+          <w:sz w:val="24"/>
+          <w:szCs w:val="24"/>
+          <w:lang w:eastAsia="pt-PT"/>
+        </w:rPr>
+        <w:t>otal gasto</w:t>
+      </w:r>
+      <w:r>
+        <w:rPr>
+          <w:rFonts w:ascii="Arial" w:eastAsia="Times New Roman" w:hAnsi="Arial" w:cs="Arial"/>
+          <w:sz w:val="24"/>
+          <w:szCs w:val="24"/>
+          <w:lang w:eastAsia="pt-PT"/>
+        </w:rPr>
+        <w:t>, a d</w:t>
+      </w:r>
+      <w:r>
+        <w:rPr>
+          <w:rFonts w:ascii="Arial" w:eastAsia="Times New Roman" w:hAnsi="Arial" w:cs="Arial"/>
+          <w:sz w:val="24"/>
+          <w:szCs w:val="24"/>
+          <w:lang w:eastAsia="pt-PT"/>
+        </w:rPr>
+        <w:t>iferença entre ambos</w:t>
+      </w:r>
+      <w:r>
+        <w:rPr>
+          <w:rFonts w:ascii="Arial" w:eastAsia="Times New Roman" w:hAnsi="Arial" w:cs="Arial"/>
+          <w:sz w:val="24"/>
+          <w:szCs w:val="24"/>
+          <w:lang w:eastAsia="pt-PT"/>
+        </w:rPr>
+        <w:t xml:space="preserve"> e a p</w:t>
+      </w:r>
+      <w:r>
+        <w:rPr>
+          <w:rFonts w:ascii="Arial" w:eastAsia="Times New Roman" w:hAnsi="Arial" w:cs="Arial"/>
+          <w:sz w:val="24"/>
+          <w:szCs w:val="24"/>
+          <w:lang w:eastAsia="pt-PT"/>
+        </w:rPr>
+        <w:t>ercentagem de artigos previstos e não previstos.</w:t>
       </w:r>
     </w:p>
     <w:p>
@@ -8237,55 +7294,52 @@
           <w:szCs w:val="24"/>
           <w:lang w:eastAsia="pt-PT"/>
         </w:rPr>
-        <w:t>Disponibiliza:</w:t>
-      </w:r>
-    </w:p>
-    <w:p>
-      <w:pPr>
-        <w:numPr>
-          <w:ilvl w:val="0"/>
-          <w:numId w:val="34"/>
-        </w:numPr>
-        <w:spacing w:before="100" w:beforeAutospacing="1" w:after="100" w:afterAutospacing="1" w:line="240" w:lineRule="auto"/>
-        <w:rPr>
-          <w:rFonts w:ascii="Arial" w:eastAsia="Times New Roman" w:hAnsi="Arial" w:cs="Arial"/>
-          <w:sz w:val="24"/>
-          <w:szCs w:val="24"/>
-          <w:lang w:eastAsia="pt-PT"/>
-        </w:rPr>
-      </w:pPr>
-      <w:r>
-        <w:rPr>
-          <w:rFonts w:ascii="Arial" w:eastAsia="Times New Roman" w:hAnsi="Arial" w:cs="Arial"/>
-          <w:sz w:val="24"/>
-          <w:szCs w:val="24"/>
-          <w:lang w:eastAsia="pt-PT"/>
-        </w:rPr>
-        <w:t>Orçamento recomendado para o próximo mês;</w:t>
-      </w:r>
-    </w:p>
-    <w:p>
-      <w:pPr>
-        <w:numPr>
-          <w:ilvl w:val="0"/>
-          <w:numId w:val="34"/>
-        </w:numPr>
-        <w:spacing w:before="100" w:beforeAutospacing="1" w:after="100" w:afterAutospacing="1" w:line="240" w:lineRule="auto"/>
-        <w:rPr>
-          <w:rFonts w:ascii="Arial" w:eastAsia="Times New Roman" w:hAnsi="Arial" w:cs="Arial"/>
-          <w:sz w:val="24"/>
-          <w:szCs w:val="24"/>
-          <w:lang w:eastAsia="pt-PT"/>
-        </w:rPr>
-      </w:pPr>
-      <w:r>
-        <w:rPr>
-          <w:rFonts w:ascii="Arial" w:eastAsia="Times New Roman" w:hAnsi="Arial" w:cs="Arial"/>
-          <w:sz w:val="24"/>
-          <w:szCs w:val="24"/>
-          <w:lang w:eastAsia="pt-PT"/>
-        </w:rPr>
-        <w:t>Sugestões automáticas de compras com base no histórico.</w:t>
+        <w:t>Disponibiliza</w:t>
+      </w:r>
+      <w:r>
+        <w:rPr>
+          <w:rFonts w:ascii="Arial" w:eastAsia="Times New Roman" w:hAnsi="Arial" w:cs="Arial"/>
+          <w:sz w:val="24"/>
+          <w:szCs w:val="24"/>
+          <w:lang w:eastAsia="pt-PT"/>
+        </w:rPr>
+        <w:t>m o o</w:t>
+      </w:r>
+      <w:r>
+        <w:rPr>
+          <w:rFonts w:ascii="Arial" w:eastAsia="Times New Roman" w:hAnsi="Arial" w:cs="Arial"/>
+          <w:sz w:val="24"/>
+          <w:szCs w:val="24"/>
+          <w:lang w:eastAsia="pt-PT"/>
+        </w:rPr>
+        <w:t>rçamento recomendado para o próximo mês</w:t>
+      </w:r>
+      <w:r>
+        <w:rPr>
+          <w:rFonts w:ascii="Arial" w:eastAsia="Times New Roman" w:hAnsi="Arial" w:cs="Arial"/>
+          <w:sz w:val="24"/>
+          <w:szCs w:val="24"/>
+          <w:lang w:eastAsia="pt-PT"/>
+        </w:rPr>
+        <w:t xml:space="preserve"> e também </w:t>
+      </w:r>
+      <w:r>
+        <w:rPr>
+          <w:rFonts w:ascii="Arial" w:eastAsia="Times New Roman" w:hAnsi="Arial" w:cs="Arial"/>
+          <w:sz w:val="24"/>
+          <w:szCs w:val="24"/>
+          <w:lang w:eastAsia="pt-PT"/>
+        </w:rPr>
+        <w:t>s</w:t>
+      </w:r>
+      <w:r>
+        <w:rPr>
+          <w:rFonts w:ascii="Arial" w:eastAsia="Times New Roman" w:hAnsi="Arial" w:cs="Arial"/>
+          <w:sz w:val="24"/>
+          <w:szCs w:val="24"/>
+          <w:lang w:eastAsia="pt-PT"/>
+        </w:rPr>
+        <w:t>ugestões automáticas de compras com base no histórico.</w:t>
       </w:r>
     </w:p>
     <w:p>
@@ -8346,19 +7400,17 @@
           <w:szCs w:val="24"/>
           <w:lang w:eastAsia="pt-PT"/>
         </w:rPr>
-        <w:t>As compras fechadas podem ser exportadas para ficheiro CSV.</w:t>
-      </w:r>
-    </w:p>
-    <w:p>
-      <w:pPr>
-        <w:spacing w:before="100" w:beforeAutospacing="1" w:after="100" w:afterAutospacing="1" w:line="240" w:lineRule="auto"/>
-        <w:rPr>
-          <w:rFonts w:ascii="Arial" w:eastAsia="Times New Roman" w:hAnsi="Arial" w:cs="Arial"/>
-          <w:sz w:val="24"/>
-          <w:szCs w:val="24"/>
-          <w:lang w:eastAsia="pt-PT"/>
-        </w:rPr>
-      </w:pPr>
+        <w:t>As compras fechadas podem ser exportadas para ficheiro CSV</w:t>
+      </w:r>
+      <w:r>
+        <w:rPr>
+          <w:rFonts w:ascii="Arial" w:eastAsia="Times New Roman" w:hAnsi="Arial" w:cs="Arial"/>
+          <w:sz w:val="24"/>
+          <w:szCs w:val="24"/>
+          <w:lang w:eastAsia="pt-PT"/>
+        </w:rPr>
+        <w:t xml:space="preserve"> através do botão correspondente “Exportar para CSV”. </w:t>
+      </w:r>
       <w:r>
         <w:rPr>
           <w:rFonts w:ascii="Arial" w:eastAsia="Times New Roman" w:hAnsi="Arial" w:cs="Arial"/>
@@ -8383,7 +7435,6 @@
           <w:lang w:eastAsia="pt-PT"/>
         </w:rPr>
       </w:pPr>
-      <w:proofErr w:type="spellStart"/>
       <w:r>
         <w:rPr>
           <w:rFonts w:ascii="Arial" w:eastAsia="Times New Roman" w:hAnsi="Arial" w:cs="Arial"/>
@@ -8393,7 +7444,6 @@
         </w:rPr>
         <w:t>NomeCompra</w:t>
       </w:r>
-      <w:proofErr w:type="spellEnd"/>
     </w:p>
     <w:p>
       <w:pPr>
@@ -8409,7 +7459,6 @@
           <w:lang w:eastAsia="pt-PT"/>
         </w:rPr>
       </w:pPr>
-      <w:proofErr w:type="spellStart"/>
       <w:r>
         <w:rPr>
           <w:rFonts w:ascii="Arial" w:eastAsia="Times New Roman" w:hAnsi="Arial" w:cs="Arial"/>
@@ -8419,7 +7468,6 @@
         </w:rPr>
         <w:t>DataCriacao</w:t>
       </w:r>
-      <w:proofErr w:type="spellEnd"/>
     </w:p>
     <w:p>
       <w:pPr>
@@ -8435,7 +7483,6 @@
           <w:lang w:eastAsia="pt-PT"/>
         </w:rPr>
       </w:pPr>
-      <w:proofErr w:type="spellStart"/>
       <w:r>
         <w:rPr>
           <w:rFonts w:ascii="Arial" w:eastAsia="Times New Roman" w:hAnsi="Arial" w:cs="Arial"/>
@@ -8445,7 +7492,6 @@
         </w:rPr>
         <w:t>DataFechada</w:t>
       </w:r>
-      <w:proofErr w:type="spellEnd"/>
     </w:p>
     <w:p>
       <w:pPr>
@@ -8461,7 +7507,6 @@
           <w:lang w:eastAsia="pt-PT"/>
         </w:rPr>
       </w:pPr>
-      <w:proofErr w:type="spellStart"/>
       <w:r>
         <w:rPr>
           <w:rFonts w:ascii="Arial" w:eastAsia="Times New Roman" w:hAnsi="Arial" w:cs="Arial"/>
@@ -8471,7 +7516,6 @@
         </w:rPr>
         <w:t>NomeArtigo</w:t>
       </w:r>
-      <w:proofErr w:type="spellEnd"/>
     </w:p>
     <w:p>
       <w:pPr>
@@ -8487,7 +7531,6 @@
           <w:lang w:eastAsia="pt-PT"/>
         </w:rPr>
       </w:pPr>
-      <w:proofErr w:type="spellStart"/>
       <w:r>
         <w:rPr>
           <w:rFonts w:ascii="Arial" w:eastAsia="Times New Roman" w:hAnsi="Arial" w:cs="Arial"/>
@@ -8497,7 +7540,6 @@
         </w:rPr>
         <w:t>ArtigoPrevisto</w:t>
       </w:r>
-      <w:proofErr w:type="spellEnd"/>
     </w:p>
     <w:p>
       <w:pPr>
@@ -8513,7 +7555,6 @@
           <w:lang w:eastAsia="pt-PT"/>
         </w:rPr>
       </w:pPr>
-      <w:proofErr w:type="spellStart"/>
       <w:r>
         <w:rPr>
           <w:rFonts w:ascii="Arial" w:eastAsia="Times New Roman" w:hAnsi="Arial" w:cs="Arial"/>
@@ -8523,7 +7564,6 @@
         </w:rPr>
         <w:t>ArtigoNaoPrevisto</w:t>
       </w:r>
-      <w:proofErr w:type="spellEnd"/>
     </w:p>
     <w:p>
       <w:pPr>
@@ -8539,7 +7579,6 @@
           <w:lang w:eastAsia="pt-PT"/>
         </w:rPr>
       </w:pPr>
-      <w:proofErr w:type="spellStart"/>
       <w:r>
         <w:rPr>
           <w:rFonts w:ascii="Arial" w:eastAsia="Times New Roman" w:hAnsi="Arial" w:cs="Arial"/>
@@ -8549,7 +7588,6 @@
         </w:rPr>
         <w:t>QuantidadePrevista</w:t>
       </w:r>
-      <w:proofErr w:type="spellEnd"/>
     </w:p>
     <w:p>
       <w:pPr>
@@ -8565,7 +7603,6 @@
           <w:lang w:eastAsia="pt-PT"/>
         </w:rPr>
       </w:pPr>
-      <w:proofErr w:type="spellStart"/>
       <w:r>
         <w:rPr>
           <w:rFonts w:ascii="Arial" w:eastAsia="Times New Roman" w:hAnsi="Arial" w:cs="Arial"/>
@@ -8575,7 +7612,6 @@
         </w:rPr>
         <w:t>QuantidadeAdquirida</w:t>
       </w:r>
-      <w:proofErr w:type="spellEnd"/>
     </w:p>
     <w:p>
       <w:pPr>
@@ -8591,7 +7627,6 @@
           <w:lang w:eastAsia="pt-PT"/>
         </w:rPr>
       </w:pPr>
-      <w:proofErr w:type="spellStart"/>
       <w:r>
         <w:rPr>
           <w:rFonts w:ascii="Arial" w:eastAsia="Times New Roman" w:hAnsi="Arial" w:cs="Arial"/>
@@ -8601,26 +7636,34 @@
         </w:rPr>
         <w:t>PrecoUnitario</w:t>
       </w:r>
-      <w:proofErr w:type="spellEnd"/>
-    </w:p>
-    <w:p>
-      <w:pPr>
-        <w:spacing w:before="100" w:beforeAutospacing="1" w:after="100" w:afterAutospacing="1" w:line="240" w:lineRule="auto"/>
-        <w:rPr>
-          <w:rFonts w:ascii="Arial" w:eastAsia="Times New Roman" w:hAnsi="Arial" w:cs="Arial"/>
-          <w:sz w:val="24"/>
-          <w:szCs w:val="24"/>
-          <w:lang w:eastAsia="pt-PT"/>
-        </w:rPr>
-      </w:pPr>
-      <w:r>
-        <w:rPr>
-          <w:rFonts w:ascii="Arial" w:eastAsia="Times New Roman" w:hAnsi="Arial" w:cs="Arial"/>
-          <w:sz w:val="24"/>
-          <w:szCs w:val="24"/>
-          <w:lang w:eastAsia="pt-PT"/>
-        </w:rPr>
-        <w:t>Esta funcionalidade facilita a análise dos dados em aplicações externas, como Microsoft Excel.</w:t>
+    </w:p>
+    <w:p>
+      <w:pPr>
+        <w:spacing w:before="100" w:beforeAutospacing="1" w:after="100" w:afterAutospacing="1" w:line="240" w:lineRule="auto"/>
+        <w:rPr>
+          <w:rFonts w:ascii="Arial" w:eastAsia="Times New Roman" w:hAnsi="Arial" w:cs="Arial"/>
+          <w:sz w:val="24"/>
+          <w:szCs w:val="24"/>
+          <w:lang w:eastAsia="pt-PT"/>
+        </w:rPr>
+      </w:pPr>
+      <w:r>
+        <w:rPr>
+          <w:rFonts w:ascii="Arial" w:eastAsia="Times New Roman" w:hAnsi="Arial" w:cs="Arial"/>
+          <w:sz w:val="24"/>
+          <w:szCs w:val="24"/>
+          <w:lang w:eastAsia="pt-PT"/>
+        </w:rPr>
+        <w:t>Esta funcionalidade facilita a análise dos dados em aplicações externas</w:t>
+      </w:r>
+      <w:r>
+        <w:rPr>
+          <w:rFonts w:ascii="Arial" w:eastAsia="Times New Roman" w:hAnsi="Arial" w:cs="Arial"/>
+          <w:sz w:val="24"/>
+          <w:szCs w:val="24"/>
+          <w:lang w:eastAsia="pt-PT"/>
+        </w:rPr>
+        <w:t>.</w:t>
       </w:r>
     </w:p>
     <w:p/>

</xml_diff>

<commit_message>
Commit correção Estatisticas + comentários
</commit_message>
<xml_diff>
--- a/iShoppingKelly/Relatório.docx
+++ b/iShoppingKelly/Relatório.docx
@@ -16,6 +16,7 @@
           <w:lang w:eastAsia="pt-PT"/>
         </w:rPr>
       </w:pPr>
+      <w:proofErr w:type="spellStart"/>
       <w:r>
         <w:rPr>
           <w:rFonts w:ascii="Arial" w:eastAsia="Times New Roman" w:hAnsi="Arial" w:cs="Arial"/>
@@ -28,6 +29,7 @@
         </w:rPr>
         <w:t>iShoppingKelly</w:t>
       </w:r>
+      <w:proofErr w:type="spellEnd"/>
     </w:p>
     <w:p>
       <w:pPr>
@@ -363,8 +365,19 @@
                 <w:szCs w:val="24"/>
                 <w:lang w:eastAsia="pt-PT"/>
               </w:rPr>
-              <w:t>Bianca Maluf Bigolin</w:t>
+              <w:t xml:space="preserve">Bianca Maluf </w:t>
             </w:r>
+            <w:proofErr w:type="spellStart"/>
+            <w:r>
+              <w:rPr>
+                <w:rFonts w:ascii="Arial" w:eastAsia="Times New Roman" w:hAnsi="Arial" w:cs="Arial"/>
+                <w:sz w:val="24"/>
+                <w:szCs w:val="24"/>
+                <w:lang w:eastAsia="pt-PT"/>
+              </w:rPr>
+              <w:t>Bigolin</w:t>
+            </w:r>
+            <w:proofErr w:type="spellEnd"/>
           </w:p>
         </w:tc>
         <w:tc>
@@ -381,7 +394,6 @@
                 <w:rFonts w:ascii="Arial" w:eastAsia="Times New Roman" w:hAnsi="Arial" w:cs="Arial"/>
                 <w:sz w:val="20"/>
                 <w:szCs w:val="20"/>
-                <w:u w:val="single"/>
                 <w:lang w:eastAsia="pt-PT"/>
               </w:rPr>
             </w:pPr>
@@ -390,7 +402,6 @@
                 <w:rFonts w:ascii="Arial" w:eastAsia="Times New Roman" w:hAnsi="Arial" w:cs="Arial"/>
                 <w:sz w:val="24"/>
                 <w:szCs w:val="24"/>
-                <w:u w:val="single"/>
                 <w:lang w:eastAsia="pt-PT"/>
               </w:rPr>
               <w:t>2025165248</w:t>
@@ -513,6 +524,7 @@
           <w:lang w:eastAsia="pt-PT"/>
         </w:rPr>
       </w:pPr>
+      <w:proofErr w:type="spellStart"/>
       <w:r>
         <w:rPr>
           <w:rFonts w:ascii="Arial" w:eastAsia="Times New Roman" w:hAnsi="Arial" w:cs="Arial"/>
@@ -522,6 +534,7 @@
         </w:rPr>
         <w:t>TipoArtigo</w:t>
       </w:r>
+      <w:proofErr w:type="spellEnd"/>
     </w:p>
     <w:p>
       <w:pPr>
@@ -585,6 +598,7 @@
           <w:lang w:eastAsia="pt-PT"/>
         </w:rPr>
       </w:pPr>
+      <w:proofErr w:type="spellStart"/>
       <w:r>
         <w:rPr>
           <w:rFonts w:ascii="Arial" w:eastAsia="Times New Roman" w:hAnsi="Arial" w:cs="Arial"/>
@@ -594,6 +608,7 @@
         </w:rPr>
         <w:t>ItemCompra</w:t>
       </w:r>
+      <w:proofErr w:type="spellEnd"/>
     </w:p>
     <w:p>
       <w:pPr>
@@ -609,6 +624,7 @@
           <w:lang w:eastAsia="pt-PT"/>
         </w:rPr>
       </w:pPr>
+      <w:proofErr w:type="spellStart"/>
       <w:r>
         <w:rPr>
           <w:rFonts w:ascii="Arial" w:eastAsia="Times New Roman" w:hAnsi="Arial" w:cs="Arial"/>
@@ -618,6 +634,7 @@
         </w:rPr>
         <w:t>Orcamento</w:t>
       </w:r>
+      <w:proofErr w:type="spellEnd"/>
     </w:p>
     <w:p>
       <w:pPr>
@@ -767,7 +784,27 @@
                 <w:szCs w:val="24"/>
                 <w:lang w:eastAsia="pt-PT"/>
               </w:rPr>
-              <w:t>Compra (CriadaPor)</w:t>
+              <w:t>Compra (</w:t>
+            </w:r>
+            <w:proofErr w:type="spellStart"/>
+            <w:r>
+              <w:rPr>
+                <w:rFonts w:ascii="Arial" w:eastAsia="Times New Roman" w:hAnsi="Arial" w:cs="Arial"/>
+                <w:sz w:val="24"/>
+                <w:szCs w:val="24"/>
+                <w:lang w:eastAsia="pt-PT"/>
+              </w:rPr>
+              <w:t>CriadaPor</w:t>
+            </w:r>
+            <w:proofErr w:type="spellEnd"/>
+            <w:r>
+              <w:rPr>
+                <w:rFonts w:ascii="Arial" w:eastAsia="Times New Roman" w:hAnsi="Arial" w:cs="Arial"/>
+                <w:sz w:val="24"/>
+                <w:szCs w:val="24"/>
+                <w:lang w:eastAsia="pt-PT"/>
+              </w:rPr>
+              <w:t>)</w:t>
             </w:r>
           </w:p>
         </w:tc>
@@ -880,7 +917,27 @@
                 <w:szCs w:val="24"/>
                 <w:lang w:eastAsia="pt-PT"/>
               </w:rPr>
-              <w:t>Compra (FechadaPor)</w:t>
+              <w:t>Compra (</w:t>
+            </w:r>
+            <w:proofErr w:type="spellStart"/>
+            <w:r>
+              <w:rPr>
+                <w:rFonts w:ascii="Arial" w:eastAsia="Times New Roman" w:hAnsi="Arial" w:cs="Arial"/>
+                <w:sz w:val="24"/>
+                <w:szCs w:val="24"/>
+                <w:lang w:eastAsia="pt-PT"/>
+              </w:rPr>
+              <w:t>FechadaPor</w:t>
+            </w:r>
+            <w:proofErr w:type="spellEnd"/>
+            <w:r>
+              <w:rPr>
+                <w:rFonts w:ascii="Arial" w:eastAsia="Times New Roman" w:hAnsi="Arial" w:cs="Arial"/>
+                <w:sz w:val="24"/>
+                <w:szCs w:val="24"/>
+                <w:lang w:eastAsia="pt-PT"/>
+              </w:rPr>
+              <w:t>)</w:t>
             </w:r>
           </w:p>
         </w:tc>
@@ -986,6 +1043,7 @@
                 <w:lang w:eastAsia="pt-PT"/>
               </w:rPr>
             </w:pPr>
+            <w:proofErr w:type="spellStart"/>
             <w:r>
               <w:rPr>
                 <w:rFonts w:ascii="Arial" w:eastAsia="Times New Roman" w:hAnsi="Arial" w:cs="Arial"/>
@@ -993,7 +1051,37 @@
                 <w:szCs w:val="24"/>
                 <w:lang w:eastAsia="pt-PT"/>
               </w:rPr>
-              <w:t>ItemCompra (CriadoPor)</w:t>
+              <w:t>ItemCompra</w:t>
+            </w:r>
+            <w:proofErr w:type="spellEnd"/>
+            <w:r>
+              <w:rPr>
+                <w:rFonts w:ascii="Arial" w:eastAsia="Times New Roman" w:hAnsi="Arial" w:cs="Arial"/>
+                <w:sz w:val="24"/>
+                <w:szCs w:val="24"/>
+                <w:lang w:eastAsia="pt-PT"/>
+              </w:rPr>
+              <w:t xml:space="preserve"> (</w:t>
+            </w:r>
+            <w:proofErr w:type="spellStart"/>
+            <w:r>
+              <w:rPr>
+                <w:rFonts w:ascii="Arial" w:eastAsia="Times New Roman" w:hAnsi="Arial" w:cs="Arial"/>
+                <w:sz w:val="24"/>
+                <w:szCs w:val="24"/>
+                <w:lang w:eastAsia="pt-PT"/>
+              </w:rPr>
+              <w:t>CriadoPor</w:t>
+            </w:r>
+            <w:proofErr w:type="spellEnd"/>
+            <w:r>
+              <w:rPr>
+                <w:rFonts w:ascii="Arial" w:eastAsia="Times New Roman" w:hAnsi="Arial" w:cs="Arial"/>
+                <w:sz w:val="24"/>
+                <w:szCs w:val="24"/>
+                <w:lang w:eastAsia="pt-PT"/>
+              </w:rPr>
+              <w:t>)</w:t>
             </w:r>
           </w:p>
         </w:tc>
@@ -1099,6 +1187,7 @@
                 <w:lang w:eastAsia="pt-PT"/>
               </w:rPr>
             </w:pPr>
+            <w:proofErr w:type="spellStart"/>
             <w:r>
               <w:rPr>
                 <w:rFonts w:ascii="Arial" w:eastAsia="Times New Roman" w:hAnsi="Arial" w:cs="Arial"/>
@@ -1106,7 +1195,37 @@
                 <w:szCs w:val="24"/>
                 <w:lang w:eastAsia="pt-PT"/>
               </w:rPr>
-              <w:t>ItemCompra (AlteradoPor)</w:t>
+              <w:t>ItemCompra</w:t>
+            </w:r>
+            <w:proofErr w:type="spellEnd"/>
+            <w:r>
+              <w:rPr>
+                <w:rFonts w:ascii="Arial" w:eastAsia="Times New Roman" w:hAnsi="Arial" w:cs="Arial"/>
+                <w:sz w:val="24"/>
+                <w:szCs w:val="24"/>
+                <w:lang w:eastAsia="pt-PT"/>
+              </w:rPr>
+              <w:t xml:space="preserve"> (</w:t>
+            </w:r>
+            <w:proofErr w:type="spellStart"/>
+            <w:r>
+              <w:rPr>
+                <w:rFonts w:ascii="Arial" w:eastAsia="Times New Roman" w:hAnsi="Arial" w:cs="Arial"/>
+                <w:sz w:val="24"/>
+                <w:szCs w:val="24"/>
+                <w:lang w:eastAsia="pt-PT"/>
+              </w:rPr>
+              <w:t>AlteradoPor</w:t>
+            </w:r>
+            <w:proofErr w:type="spellEnd"/>
+            <w:r>
+              <w:rPr>
+                <w:rFonts w:ascii="Arial" w:eastAsia="Times New Roman" w:hAnsi="Arial" w:cs="Arial"/>
+                <w:sz w:val="24"/>
+                <w:szCs w:val="24"/>
+                <w:lang w:eastAsia="pt-PT"/>
+              </w:rPr>
+              <w:t>)</w:t>
             </w:r>
           </w:p>
         </w:tc>
@@ -1213,6 +1332,7 @@
                 <w:lang w:eastAsia="pt-PT"/>
               </w:rPr>
             </w:pPr>
+            <w:proofErr w:type="spellStart"/>
             <w:r>
               <w:rPr>
                 <w:rFonts w:ascii="Arial" w:eastAsia="Times New Roman" w:hAnsi="Arial" w:cs="Arial"/>
@@ -1220,7 +1340,37 @@
                 <w:szCs w:val="24"/>
                 <w:lang w:eastAsia="pt-PT"/>
               </w:rPr>
-              <w:t>Orcamento (CriadoPor)</w:t>
+              <w:t>Orcamento</w:t>
+            </w:r>
+            <w:proofErr w:type="spellEnd"/>
+            <w:r>
+              <w:rPr>
+                <w:rFonts w:ascii="Arial" w:eastAsia="Times New Roman" w:hAnsi="Arial" w:cs="Arial"/>
+                <w:sz w:val="24"/>
+                <w:szCs w:val="24"/>
+                <w:lang w:eastAsia="pt-PT"/>
+              </w:rPr>
+              <w:t xml:space="preserve"> (</w:t>
+            </w:r>
+            <w:proofErr w:type="spellStart"/>
+            <w:r>
+              <w:rPr>
+                <w:rFonts w:ascii="Arial" w:eastAsia="Times New Roman" w:hAnsi="Arial" w:cs="Arial"/>
+                <w:sz w:val="24"/>
+                <w:szCs w:val="24"/>
+                <w:lang w:eastAsia="pt-PT"/>
+              </w:rPr>
+              <w:t>CriadoPor</w:t>
+            </w:r>
+            <w:proofErr w:type="spellEnd"/>
+            <w:r>
+              <w:rPr>
+                <w:rFonts w:ascii="Arial" w:eastAsia="Times New Roman" w:hAnsi="Arial" w:cs="Arial"/>
+                <w:sz w:val="24"/>
+                <w:szCs w:val="24"/>
+                <w:lang w:eastAsia="pt-PT"/>
+              </w:rPr>
+              <w:t>)</w:t>
             </w:r>
           </w:p>
         </w:tc>
@@ -1326,6 +1476,7 @@
                 <w:lang w:eastAsia="pt-PT"/>
               </w:rPr>
             </w:pPr>
+            <w:proofErr w:type="spellStart"/>
             <w:r>
               <w:rPr>
                 <w:rFonts w:ascii="Arial" w:eastAsia="Times New Roman" w:hAnsi="Arial" w:cs="Arial"/>
@@ -1333,7 +1484,37 @@
                 <w:szCs w:val="24"/>
                 <w:lang w:eastAsia="pt-PT"/>
               </w:rPr>
-              <w:t>Orcamento (AlteradoPor)</w:t>
+              <w:t>Orcamento</w:t>
+            </w:r>
+            <w:proofErr w:type="spellEnd"/>
+            <w:r>
+              <w:rPr>
+                <w:rFonts w:ascii="Arial" w:eastAsia="Times New Roman" w:hAnsi="Arial" w:cs="Arial"/>
+                <w:sz w:val="24"/>
+                <w:szCs w:val="24"/>
+                <w:lang w:eastAsia="pt-PT"/>
+              </w:rPr>
+              <w:t xml:space="preserve"> (</w:t>
+            </w:r>
+            <w:proofErr w:type="spellStart"/>
+            <w:r>
+              <w:rPr>
+                <w:rFonts w:ascii="Arial" w:eastAsia="Times New Roman" w:hAnsi="Arial" w:cs="Arial"/>
+                <w:sz w:val="24"/>
+                <w:szCs w:val="24"/>
+                <w:lang w:eastAsia="pt-PT"/>
+              </w:rPr>
+              <w:t>AlteradoPor</w:t>
+            </w:r>
+            <w:proofErr w:type="spellEnd"/>
+            <w:r>
+              <w:rPr>
+                <w:rFonts w:ascii="Arial" w:eastAsia="Times New Roman" w:hAnsi="Arial" w:cs="Arial"/>
+                <w:sz w:val="24"/>
+                <w:szCs w:val="24"/>
+                <w:lang w:eastAsia="pt-PT"/>
+              </w:rPr>
+              <w:t>)</w:t>
             </w:r>
           </w:p>
         </w:tc>
@@ -1385,6 +1566,7 @@
                 <w:lang w:eastAsia="pt-PT"/>
               </w:rPr>
             </w:pPr>
+            <w:proofErr w:type="spellStart"/>
             <w:r>
               <w:rPr>
                 <w:rFonts w:ascii="Arial" w:eastAsia="Times New Roman" w:hAnsi="Arial" w:cs="Arial"/>
@@ -1394,6 +1576,7 @@
               </w:rPr>
               <w:t>TipoArtigo</w:t>
             </w:r>
+            <w:proofErr w:type="spellEnd"/>
           </w:p>
         </w:tc>
         <w:tc>
@@ -1552,6 +1735,7 @@
                 <w:lang w:eastAsia="pt-PT"/>
               </w:rPr>
             </w:pPr>
+            <w:proofErr w:type="spellStart"/>
             <w:r>
               <w:rPr>
                 <w:rFonts w:ascii="Arial" w:eastAsia="Times New Roman" w:hAnsi="Arial" w:cs="Arial"/>
@@ -1561,6 +1745,7 @@
               </w:rPr>
               <w:t>ItemCompra</w:t>
             </w:r>
+            <w:proofErr w:type="spellEnd"/>
           </w:p>
         </w:tc>
         <w:tc>
@@ -1665,6 +1850,7 @@
                 <w:lang w:eastAsia="pt-PT"/>
               </w:rPr>
             </w:pPr>
+            <w:proofErr w:type="spellStart"/>
             <w:r>
               <w:rPr>
                 <w:rFonts w:ascii="Arial" w:eastAsia="Times New Roman" w:hAnsi="Arial" w:cs="Arial"/>
@@ -1674,6 +1860,7 @@
               </w:rPr>
               <w:t>ItemCompra</w:t>
             </w:r>
+            <w:proofErr w:type="spellEnd"/>
           </w:p>
         </w:tc>
         <w:tc>
@@ -1796,7 +1983,27 @@
           <w:szCs w:val="24"/>
           <w:lang w:eastAsia="pt-PT"/>
         </w:rPr>
-        <w:t>O desenvolvimento da aplicação foi realizado segundo o padrão arquitetural MVC (Model-View-Controller)</w:t>
+        <w:t>O desenvolvimento da aplicação foi realizado segundo o padrão arquitetural MVC (</w:t>
+      </w:r>
+      <w:proofErr w:type="spellStart"/>
+      <w:r>
+        <w:rPr>
+          <w:rFonts w:ascii="Arial" w:eastAsia="Times New Roman" w:hAnsi="Arial" w:cs="Arial"/>
+          <w:sz w:val="24"/>
+          <w:szCs w:val="24"/>
+          <w:lang w:eastAsia="pt-PT"/>
+        </w:rPr>
+        <w:t>Model-View-Controller</w:t>
+      </w:r>
+      <w:proofErr w:type="spellEnd"/>
+      <w:r>
+        <w:rPr>
+          <w:rFonts w:ascii="Arial" w:eastAsia="Times New Roman" w:hAnsi="Arial" w:cs="Arial"/>
+          <w:sz w:val="24"/>
+          <w:szCs w:val="24"/>
+          <w:lang w:eastAsia="pt-PT"/>
+        </w:rPr>
+        <w:t>)</w:t>
       </w:r>
       <w:r>
         <w:rPr>
@@ -1848,6 +2055,7 @@
           <w:lang w:eastAsia="pt-PT"/>
         </w:rPr>
       </w:pPr>
+      <w:proofErr w:type="spellStart"/>
       <w:r>
         <w:rPr>
           <w:rFonts w:ascii="Arial" w:eastAsia="Times New Roman" w:hAnsi="Arial" w:cs="Arial"/>
@@ -1859,6 +2067,7 @@
         </w:rPr>
         <w:t>Model</w:t>
       </w:r>
+      <w:proofErr w:type="spellEnd"/>
       <w:r>
         <w:rPr>
           <w:rFonts w:ascii="Arial" w:eastAsia="Times New Roman" w:hAnsi="Arial" w:cs="Arial"/>
@@ -1918,6 +2127,7 @@
           <w:lang w:eastAsia="pt-PT"/>
         </w:rPr>
       </w:pPr>
+      <w:proofErr w:type="spellStart"/>
       <w:r>
         <w:rPr>
           <w:rFonts w:ascii="Arial" w:eastAsia="Times New Roman" w:hAnsi="Arial" w:cs="Arial"/>
@@ -1927,6 +2137,7 @@
         </w:rPr>
         <w:t>TipoArtigo</w:t>
       </w:r>
+      <w:proofErr w:type="spellEnd"/>
     </w:p>
     <w:p>
       <w:pPr>
@@ -1990,6 +2201,7 @@
           <w:lang w:eastAsia="pt-PT"/>
         </w:rPr>
       </w:pPr>
+      <w:proofErr w:type="spellStart"/>
       <w:r>
         <w:rPr>
           <w:rFonts w:ascii="Arial" w:eastAsia="Times New Roman" w:hAnsi="Arial" w:cs="Arial"/>
@@ -1999,6 +2211,7 @@
         </w:rPr>
         <w:t>ItemCompra</w:t>
       </w:r>
+      <w:proofErr w:type="spellEnd"/>
     </w:p>
     <w:p>
       <w:pPr>
@@ -2014,6 +2227,7 @@
           <w:lang w:eastAsia="pt-PT"/>
         </w:rPr>
       </w:pPr>
+      <w:proofErr w:type="spellStart"/>
       <w:r>
         <w:rPr>
           <w:rFonts w:ascii="Arial" w:eastAsia="Times New Roman" w:hAnsi="Arial" w:cs="Arial"/>
@@ -2023,6 +2237,7 @@
         </w:rPr>
         <w:t>Orcamento</w:t>
       </w:r>
+      <w:proofErr w:type="spellEnd"/>
     </w:p>
     <w:p>
       <w:pPr>
@@ -2057,6 +2272,7 @@
           <w:lang w:eastAsia="pt-PT"/>
         </w:rPr>
       </w:pPr>
+      <w:proofErr w:type="spellStart"/>
       <w:r>
         <w:rPr>
           <w:rFonts w:ascii="Arial" w:eastAsia="Times New Roman" w:hAnsi="Arial" w:cs="Arial"/>
@@ -2068,6 +2284,7 @@
         </w:rPr>
         <w:t>View</w:t>
       </w:r>
+      <w:proofErr w:type="spellEnd"/>
       <w:r>
         <w:rPr>
           <w:rFonts w:ascii="Arial" w:eastAsia="Times New Roman" w:hAnsi="Arial" w:cs="Arial"/>
@@ -2086,7 +2303,47 @@
           <w:szCs w:val="24"/>
           <w:lang w:eastAsia="pt-PT"/>
         </w:rPr>
-        <w:t>As Views correspondem aos formulários Windows Forms utilizados para interação com o utilizador, permitindo visualizar e introduzir informação.</w:t>
+        <w:t xml:space="preserve">As </w:t>
+      </w:r>
+      <w:proofErr w:type="spellStart"/>
+      <w:r>
+        <w:rPr>
+          <w:rFonts w:ascii="Arial" w:eastAsia="Times New Roman" w:hAnsi="Arial" w:cs="Arial"/>
+          <w:sz w:val="24"/>
+          <w:szCs w:val="24"/>
+          <w:lang w:eastAsia="pt-PT"/>
+        </w:rPr>
+        <w:t>Views</w:t>
+      </w:r>
+      <w:proofErr w:type="spellEnd"/>
+      <w:r>
+        <w:rPr>
+          <w:rFonts w:ascii="Arial" w:eastAsia="Times New Roman" w:hAnsi="Arial" w:cs="Arial"/>
+          <w:sz w:val="24"/>
+          <w:szCs w:val="24"/>
+          <w:lang w:eastAsia="pt-PT"/>
+        </w:rPr>
+        <w:t xml:space="preserve"> correspondem aos formulários Windows </w:t>
+      </w:r>
+      <w:proofErr w:type="spellStart"/>
+      <w:r>
+        <w:rPr>
+          <w:rFonts w:ascii="Arial" w:eastAsia="Times New Roman" w:hAnsi="Arial" w:cs="Arial"/>
+          <w:sz w:val="24"/>
+          <w:szCs w:val="24"/>
+          <w:lang w:eastAsia="pt-PT"/>
+        </w:rPr>
+        <w:t>Forms</w:t>
+      </w:r>
+      <w:proofErr w:type="spellEnd"/>
+      <w:r>
+        <w:rPr>
+          <w:rFonts w:ascii="Arial" w:eastAsia="Times New Roman" w:hAnsi="Arial" w:cs="Arial"/>
+          <w:sz w:val="24"/>
+          <w:szCs w:val="24"/>
+          <w:lang w:eastAsia="pt-PT"/>
+        </w:rPr>
+        <w:t xml:space="preserve"> utilizados para interação com o utilizador, permitindo visualizar e introduzir informação.</w:t>
       </w:r>
     </w:p>
     <w:p>
@@ -2102,6 +2359,7 @@
           <w:lang w:eastAsia="pt-PT"/>
         </w:rPr>
       </w:pPr>
+      <w:proofErr w:type="spellStart"/>
       <w:r>
         <w:rPr>
           <w:rFonts w:ascii="Arial" w:eastAsia="Times New Roman" w:hAnsi="Arial" w:cs="Arial"/>
@@ -2113,6 +2371,7 @@
         </w:rPr>
         <w:t>Controller</w:t>
       </w:r>
+      <w:proofErr w:type="spellEnd"/>
       <w:r>
         <w:rPr>
           <w:rFonts w:ascii="Arial" w:eastAsia="Times New Roman" w:hAnsi="Arial" w:cs="Arial"/>
@@ -2131,7 +2390,27 @@
           <w:szCs w:val="24"/>
           <w:lang w:eastAsia="pt-PT"/>
         </w:rPr>
-        <w:t>Os Controllers são responsáveis pela lógica de negócio e pelo acesso aos dados. Cada entidade possui um controlador específico que centraliza todas as operações relacionadas.</w:t>
+        <w:t xml:space="preserve">Os </w:t>
+      </w:r>
+      <w:proofErr w:type="spellStart"/>
+      <w:r>
+        <w:rPr>
+          <w:rFonts w:ascii="Arial" w:eastAsia="Times New Roman" w:hAnsi="Arial" w:cs="Arial"/>
+          <w:sz w:val="24"/>
+          <w:szCs w:val="24"/>
+          <w:lang w:eastAsia="pt-PT"/>
+        </w:rPr>
+        <w:t>Controllers</w:t>
+      </w:r>
+      <w:proofErr w:type="spellEnd"/>
+      <w:r>
+        <w:rPr>
+          <w:rFonts w:ascii="Arial" w:eastAsia="Times New Roman" w:hAnsi="Arial" w:cs="Arial"/>
+          <w:sz w:val="24"/>
+          <w:szCs w:val="24"/>
+          <w:lang w:eastAsia="pt-PT"/>
+        </w:rPr>
+        <w:t xml:space="preserve"> são responsáveis pela lógica de negócio e pelo acesso aos dados. Cada entidade possui um controlador específico que centraliza todas as operações relacionadas.</w:t>
       </w:r>
     </w:p>
     <w:p>
@@ -2168,211 +2447,10 @@
           <w:szCs w:val="36"/>
           <w:lang w:eastAsia="pt-PT"/>
         </w:rPr>
-        <w:t xml:space="preserve"> Entity Framework 6</w:t>
-      </w:r>
-    </w:p>
-    <w:p>
-      <w:pPr>
-        <w:spacing w:before="100" w:beforeAutospacing="1" w:after="100" w:afterAutospacing="1" w:line="240" w:lineRule="auto"/>
-        <w:rPr>
-          <w:rFonts w:ascii="Arial" w:eastAsia="Times New Roman" w:hAnsi="Arial" w:cs="Arial"/>
-          <w:sz w:val="24"/>
-          <w:szCs w:val="24"/>
-          <w:lang w:eastAsia="pt-PT"/>
-        </w:rPr>
-      </w:pPr>
-      <w:r>
-        <w:rPr>
-          <w:rFonts w:ascii="Arial" w:eastAsia="Times New Roman" w:hAnsi="Arial" w:cs="Arial"/>
-          <w:sz w:val="24"/>
-          <w:szCs w:val="24"/>
-          <w:lang w:eastAsia="pt-PT"/>
-        </w:rPr>
-        <w:lastRenderedPageBreak/>
-        <w:t>O acesso à base de dados foi implementado através do Entity Framework 6</w:t>
-      </w:r>
-      <w:r>
-        <w:rPr>
-          <w:rFonts w:ascii="Arial" w:eastAsia="Times New Roman" w:hAnsi="Arial" w:cs="Arial"/>
-          <w:sz w:val="24"/>
-          <w:szCs w:val="24"/>
-          <w:lang w:eastAsia="pt-PT"/>
-        </w:rPr>
         <w:t xml:space="preserve"> </w:t>
       </w:r>
-      <w:r>
-        <w:rPr>
-          <w:rFonts w:ascii="Arial" w:eastAsia="Times New Roman" w:hAnsi="Arial" w:cs="Arial"/>
-          <w:sz w:val="24"/>
-          <w:szCs w:val="24"/>
-          <w:lang w:eastAsia="pt-PT"/>
-        </w:rPr>
-        <w:t>utilizando SQL Server LocalDB.</w:t>
-      </w:r>
-    </w:p>
-    <w:p>
-      <w:pPr>
-        <w:spacing w:before="100" w:beforeAutospacing="1" w:after="100" w:afterAutospacing="1" w:line="240" w:lineRule="auto"/>
-        <w:rPr>
-          <w:rFonts w:ascii="Arial" w:eastAsia="Times New Roman" w:hAnsi="Arial" w:cs="Arial"/>
-          <w:sz w:val="24"/>
-          <w:szCs w:val="24"/>
-          <w:lang w:eastAsia="pt-PT"/>
-        </w:rPr>
-      </w:pPr>
-      <w:r>
-        <w:rPr>
-          <w:rFonts w:ascii="Arial" w:eastAsia="Times New Roman" w:hAnsi="Arial" w:cs="Arial"/>
-          <w:sz w:val="24"/>
-          <w:szCs w:val="24"/>
-          <w:lang w:eastAsia="pt-PT"/>
-        </w:rPr>
-        <w:t>Esta tecnologia permit</w:t>
-      </w:r>
-      <w:r>
-        <w:rPr>
-          <w:rFonts w:ascii="Arial" w:eastAsia="Times New Roman" w:hAnsi="Arial" w:cs="Arial"/>
-          <w:sz w:val="24"/>
-          <w:szCs w:val="24"/>
-          <w:lang w:eastAsia="pt-PT"/>
-        </w:rPr>
-        <w:t>e s</w:t>
-      </w:r>
-      <w:r>
-        <w:rPr>
-          <w:rFonts w:ascii="Arial" w:eastAsia="Times New Roman" w:hAnsi="Arial" w:cs="Arial"/>
-          <w:sz w:val="24"/>
-          <w:szCs w:val="24"/>
-          <w:lang w:eastAsia="pt-PT"/>
-        </w:rPr>
-        <w:t>implificar operações CRUD;</w:t>
-      </w:r>
-      <w:r>
-        <w:rPr>
-          <w:rFonts w:ascii="Arial" w:eastAsia="Times New Roman" w:hAnsi="Arial" w:cs="Arial"/>
-          <w:sz w:val="24"/>
-          <w:szCs w:val="24"/>
-          <w:lang w:eastAsia="pt-PT"/>
-        </w:rPr>
-        <w:t xml:space="preserve"> </w:t>
-      </w:r>
-      <w:r>
-        <w:rPr>
-          <w:rFonts w:ascii="Arial" w:eastAsia="Times New Roman" w:hAnsi="Arial" w:cs="Arial"/>
-          <w:sz w:val="24"/>
-          <w:szCs w:val="24"/>
-          <w:lang w:eastAsia="pt-PT"/>
-        </w:rPr>
-        <w:t>Reduzir código SQL manual;</w:t>
-      </w:r>
-      <w:r>
-        <w:rPr>
-          <w:rFonts w:ascii="Arial" w:eastAsia="Times New Roman" w:hAnsi="Arial" w:cs="Arial"/>
-          <w:sz w:val="24"/>
-          <w:szCs w:val="24"/>
-          <w:lang w:eastAsia="pt-PT"/>
-        </w:rPr>
-        <w:t xml:space="preserve"> </w:t>
-      </w:r>
-      <w:r>
-        <w:rPr>
-          <w:rFonts w:ascii="Arial" w:eastAsia="Times New Roman" w:hAnsi="Arial" w:cs="Arial"/>
-          <w:sz w:val="24"/>
-          <w:szCs w:val="24"/>
-          <w:lang w:eastAsia="pt-PT"/>
-        </w:rPr>
-        <w:t>Utilizar LINQ para consultas</w:t>
-      </w:r>
-      <w:r>
-        <w:rPr>
-          <w:rFonts w:ascii="Arial" w:eastAsia="Times New Roman" w:hAnsi="Arial" w:cs="Arial"/>
-          <w:sz w:val="24"/>
-          <w:szCs w:val="24"/>
-          <w:lang w:eastAsia="pt-PT"/>
-        </w:rPr>
-        <w:t xml:space="preserve"> e </w:t>
-      </w:r>
-      <w:r>
-        <w:rPr>
-          <w:rFonts w:ascii="Arial" w:eastAsia="Times New Roman" w:hAnsi="Arial" w:cs="Arial"/>
-          <w:sz w:val="24"/>
-          <w:szCs w:val="24"/>
-          <w:lang w:eastAsia="pt-PT"/>
-        </w:rPr>
-        <w:t>Gerar automaticamente a base de dados através do modelo.</w:t>
-      </w:r>
-    </w:p>
-    <w:p>
-      <w:pPr>
-        <w:spacing w:before="100" w:beforeAutospacing="1" w:after="100" w:afterAutospacing="1" w:line="240" w:lineRule="auto"/>
-        <w:rPr>
-          <w:rFonts w:ascii="Arial" w:eastAsia="Times New Roman" w:hAnsi="Arial" w:cs="Arial"/>
-          <w:sz w:val="24"/>
-          <w:szCs w:val="24"/>
-          <w:lang w:eastAsia="pt-PT"/>
-        </w:rPr>
-      </w:pPr>
-      <w:r>
-        <w:rPr>
-          <w:rFonts w:ascii="Arial" w:eastAsia="Times New Roman" w:hAnsi="Arial" w:cs="Arial"/>
-          <w:sz w:val="24"/>
-          <w:szCs w:val="24"/>
-          <w:lang w:eastAsia="pt-PT"/>
-        </w:rPr>
-        <w:t>A escolha do LocalDB deve-se ao facto de</w:t>
-      </w:r>
-      <w:r>
-        <w:rPr>
-          <w:rFonts w:ascii="Arial" w:eastAsia="Times New Roman" w:hAnsi="Arial" w:cs="Arial"/>
-          <w:sz w:val="24"/>
-          <w:szCs w:val="24"/>
-          <w:lang w:eastAsia="pt-PT"/>
-        </w:rPr>
-        <w:t>, além de ser assim pedido no enunciado,</w:t>
-      </w:r>
-      <w:r>
-        <w:rPr>
-          <w:rFonts w:ascii="Arial" w:eastAsia="Times New Roman" w:hAnsi="Arial" w:cs="Arial"/>
-          <w:sz w:val="24"/>
-          <w:szCs w:val="24"/>
-          <w:lang w:eastAsia="pt-PT"/>
-        </w:rPr>
-        <w:t xml:space="preserve"> ser </w:t>
-      </w:r>
-      <w:r>
-        <w:rPr>
-          <w:rFonts w:ascii="Arial" w:eastAsia="Times New Roman" w:hAnsi="Arial" w:cs="Arial"/>
-          <w:sz w:val="24"/>
-          <w:szCs w:val="24"/>
-          <w:lang w:eastAsia="pt-PT"/>
-        </w:rPr>
-        <w:t xml:space="preserve">também </w:t>
-      </w:r>
-      <w:r>
-        <w:rPr>
-          <w:rFonts w:ascii="Arial" w:eastAsia="Times New Roman" w:hAnsi="Arial" w:cs="Arial"/>
-          <w:sz w:val="24"/>
-          <w:szCs w:val="24"/>
-          <w:lang w:eastAsia="pt-PT"/>
-        </w:rPr>
-        <w:t>uma solução leve e adequada para aplicações académicas e protótipos.</w:t>
-      </w:r>
-    </w:p>
-    <w:p>
-      <w:pPr>
-        <w:spacing w:after="0" w:line="240" w:lineRule="auto"/>
-        <w:rPr>
-          <w:rFonts w:ascii="Arial" w:eastAsia="Times New Roman" w:hAnsi="Arial" w:cs="Arial"/>
-          <w:sz w:val="24"/>
-          <w:szCs w:val="24"/>
-          <w:lang w:eastAsia="pt-PT"/>
-        </w:rPr>
-      </w:pPr>
-    </w:p>
-    <w:p>
-      <w:pPr>
-        <w:spacing w:before="100" w:beforeAutospacing="1" w:after="100" w:afterAutospacing="1" w:line="240" w:lineRule="auto"/>
-        <w:outlineLvl w:val="1"/>
+      <w:proofErr w:type="spellStart"/>
+      <w:r>
         <w:rPr>
           <w:rFonts w:ascii="Arial" w:eastAsia="Times New Roman" w:hAnsi="Arial" w:cs="Arial"/>
           <w:b/>
@@ -2381,7 +2459,9 @@
           <w:szCs w:val="36"/>
           <w:lang w:eastAsia="pt-PT"/>
         </w:rPr>
-      </w:pPr>
+        <w:t>Entity</w:t>
+      </w:r>
+      <w:proofErr w:type="spellEnd"/>
       <w:r>
         <w:rPr>
           <w:rFonts w:ascii="Arial" w:eastAsia="Times New Roman" w:hAnsi="Arial" w:cs="Arial"/>
@@ -2391,9 +2471,282 @@
           <w:szCs w:val="36"/>
           <w:lang w:eastAsia="pt-PT"/>
         </w:rPr>
-        <w:t>3.</w:t>
-      </w:r>
-      <w:r>
+        <w:t xml:space="preserve"> Framework 6</w:t>
+      </w:r>
+    </w:p>
+    <w:p>
+      <w:pPr>
+        <w:spacing w:before="100" w:beforeAutospacing="1" w:after="100" w:afterAutospacing="1" w:line="240" w:lineRule="auto"/>
+        <w:rPr>
+          <w:rFonts w:ascii="Arial" w:eastAsia="Times New Roman" w:hAnsi="Arial" w:cs="Arial"/>
+          <w:sz w:val="24"/>
+          <w:szCs w:val="24"/>
+          <w:lang w:eastAsia="pt-PT"/>
+        </w:rPr>
+      </w:pPr>
+      <w:r>
+        <w:rPr>
+          <w:rFonts w:ascii="Arial" w:eastAsia="Times New Roman" w:hAnsi="Arial" w:cs="Arial"/>
+          <w:sz w:val="24"/>
+          <w:szCs w:val="24"/>
+          <w:lang w:eastAsia="pt-PT"/>
+        </w:rPr>
+        <w:lastRenderedPageBreak/>
+        <w:t xml:space="preserve">O acesso à base de dados foi implementado através do </w:t>
+      </w:r>
+      <w:proofErr w:type="spellStart"/>
+      <w:r>
+        <w:rPr>
+          <w:rFonts w:ascii="Arial" w:eastAsia="Times New Roman" w:hAnsi="Arial" w:cs="Arial"/>
+          <w:sz w:val="24"/>
+          <w:szCs w:val="24"/>
+          <w:lang w:eastAsia="pt-PT"/>
+        </w:rPr>
+        <w:t>Entity</w:t>
+      </w:r>
+      <w:proofErr w:type="spellEnd"/>
+      <w:r>
+        <w:rPr>
+          <w:rFonts w:ascii="Arial" w:eastAsia="Times New Roman" w:hAnsi="Arial" w:cs="Arial"/>
+          <w:sz w:val="24"/>
+          <w:szCs w:val="24"/>
+          <w:lang w:eastAsia="pt-PT"/>
+        </w:rPr>
+        <w:t xml:space="preserve"> Framework 6</w:t>
+      </w:r>
+      <w:r>
+        <w:rPr>
+          <w:rFonts w:ascii="Arial" w:eastAsia="Times New Roman" w:hAnsi="Arial" w:cs="Arial"/>
+          <w:sz w:val="24"/>
+          <w:szCs w:val="24"/>
+          <w:lang w:eastAsia="pt-PT"/>
+        </w:rPr>
+        <w:t xml:space="preserve"> </w:t>
+      </w:r>
+      <w:r>
+        <w:rPr>
+          <w:rFonts w:ascii="Arial" w:eastAsia="Times New Roman" w:hAnsi="Arial" w:cs="Arial"/>
+          <w:sz w:val="24"/>
+          <w:szCs w:val="24"/>
+          <w:lang w:eastAsia="pt-PT"/>
+        </w:rPr>
+        <w:t xml:space="preserve">utilizando SQL Server </w:t>
+      </w:r>
+      <w:proofErr w:type="spellStart"/>
+      <w:r>
+        <w:rPr>
+          <w:rFonts w:ascii="Arial" w:eastAsia="Times New Roman" w:hAnsi="Arial" w:cs="Arial"/>
+          <w:sz w:val="24"/>
+          <w:szCs w:val="24"/>
+          <w:lang w:eastAsia="pt-PT"/>
+        </w:rPr>
+        <w:t>LocalDB</w:t>
+      </w:r>
+      <w:proofErr w:type="spellEnd"/>
+      <w:r>
+        <w:rPr>
+          <w:rFonts w:ascii="Arial" w:eastAsia="Times New Roman" w:hAnsi="Arial" w:cs="Arial"/>
+          <w:sz w:val="24"/>
+          <w:szCs w:val="24"/>
+          <w:lang w:eastAsia="pt-PT"/>
+        </w:rPr>
+        <w:t>.</w:t>
+      </w:r>
+    </w:p>
+    <w:p>
+      <w:pPr>
+        <w:spacing w:before="100" w:beforeAutospacing="1" w:after="100" w:afterAutospacing="1" w:line="240" w:lineRule="auto"/>
+        <w:rPr>
+          <w:rFonts w:ascii="Arial" w:eastAsia="Times New Roman" w:hAnsi="Arial" w:cs="Arial"/>
+          <w:sz w:val="24"/>
+          <w:szCs w:val="24"/>
+          <w:lang w:eastAsia="pt-PT"/>
+        </w:rPr>
+      </w:pPr>
+      <w:r>
+        <w:rPr>
+          <w:rFonts w:ascii="Arial" w:eastAsia="Times New Roman" w:hAnsi="Arial" w:cs="Arial"/>
+          <w:sz w:val="24"/>
+          <w:szCs w:val="24"/>
+          <w:lang w:eastAsia="pt-PT"/>
+        </w:rPr>
+        <w:t>Esta tecnologia permit</w:t>
+      </w:r>
+      <w:r>
+        <w:rPr>
+          <w:rFonts w:ascii="Arial" w:eastAsia="Times New Roman" w:hAnsi="Arial" w:cs="Arial"/>
+          <w:sz w:val="24"/>
+          <w:szCs w:val="24"/>
+          <w:lang w:eastAsia="pt-PT"/>
+        </w:rPr>
+        <w:t>e s</w:t>
+      </w:r>
+      <w:r>
+        <w:rPr>
+          <w:rFonts w:ascii="Arial" w:eastAsia="Times New Roman" w:hAnsi="Arial" w:cs="Arial"/>
+          <w:sz w:val="24"/>
+          <w:szCs w:val="24"/>
+          <w:lang w:eastAsia="pt-PT"/>
+        </w:rPr>
+        <w:t>implificar operações CRUD;</w:t>
+      </w:r>
+      <w:r>
+        <w:rPr>
+          <w:rFonts w:ascii="Arial" w:eastAsia="Times New Roman" w:hAnsi="Arial" w:cs="Arial"/>
+          <w:sz w:val="24"/>
+          <w:szCs w:val="24"/>
+          <w:lang w:eastAsia="pt-PT"/>
+        </w:rPr>
+        <w:t xml:space="preserve"> </w:t>
+      </w:r>
+      <w:proofErr w:type="gramStart"/>
+      <w:r>
+        <w:rPr>
+          <w:rFonts w:ascii="Arial" w:eastAsia="Times New Roman" w:hAnsi="Arial" w:cs="Arial"/>
+          <w:sz w:val="24"/>
+          <w:szCs w:val="24"/>
+          <w:lang w:eastAsia="pt-PT"/>
+        </w:rPr>
+        <w:t>Reduzir</w:t>
+      </w:r>
+      <w:proofErr w:type="gramEnd"/>
+      <w:r>
+        <w:rPr>
+          <w:rFonts w:ascii="Arial" w:eastAsia="Times New Roman" w:hAnsi="Arial" w:cs="Arial"/>
+          <w:sz w:val="24"/>
+          <w:szCs w:val="24"/>
+          <w:lang w:eastAsia="pt-PT"/>
+        </w:rPr>
+        <w:t xml:space="preserve"> código SQL manual;</w:t>
+      </w:r>
+      <w:r>
+        <w:rPr>
+          <w:rFonts w:ascii="Arial" w:eastAsia="Times New Roman" w:hAnsi="Arial" w:cs="Arial"/>
+          <w:sz w:val="24"/>
+          <w:szCs w:val="24"/>
+          <w:lang w:eastAsia="pt-PT"/>
+        </w:rPr>
+        <w:t xml:space="preserve"> </w:t>
+      </w:r>
+      <w:r>
+        <w:rPr>
+          <w:rFonts w:ascii="Arial" w:eastAsia="Times New Roman" w:hAnsi="Arial" w:cs="Arial"/>
+          <w:sz w:val="24"/>
+          <w:szCs w:val="24"/>
+          <w:lang w:eastAsia="pt-PT"/>
+        </w:rPr>
+        <w:t>Utilizar LINQ para consultas</w:t>
+      </w:r>
+      <w:r>
+        <w:rPr>
+          <w:rFonts w:ascii="Arial" w:eastAsia="Times New Roman" w:hAnsi="Arial" w:cs="Arial"/>
+          <w:sz w:val="24"/>
+          <w:szCs w:val="24"/>
+          <w:lang w:eastAsia="pt-PT"/>
+        </w:rPr>
+        <w:t xml:space="preserve"> e </w:t>
+      </w:r>
+      <w:r>
+        <w:rPr>
+          <w:rFonts w:ascii="Arial" w:eastAsia="Times New Roman" w:hAnsi="Arial" w:cs="Arial"/>
+          <w:sz w:val="24"/>
+          <w:szCs w:val="24"/>
+          <w:lang w:eastAsia="pt-PT"/>
+        </w:rPr>
+        <w:t>Gerar automaticamente a base de dados através do modelo.</w:t>
+      </w:r>
+    </w:p>
+    <w:p>
+      <w:pPr>
+        <w:spacing w:before="100" w:beforeAutospacing="1" w:after="100" w:afterAutospacing="1" w:line="240" w:lineRule="auto"/>
+        <w:rPr>
+          <w:rFonts w:ascii="Arial" w:eastAsia="Times New Roman" w:hAnsi="Arial" w:cs="Arial"/>
+          <w:sz w:val="24"/>
+          <w:szCs w:val="24"/>
+          <w:lang w:eastAsia="pt-PT"/>
+        </w:rPr>
+      </w:pPr>
+      <w:r>
+        <w:rPr>
+          <w:rFonts w:ascii="Arial" w:eastAsia="Times New Roman" w:hAnsi="Arial" w:cs="Arial"/>
+          <w:sz w:val="24"/>
+          <w:szCs w:val="24"/>
+          <w:lang w:eastAsia="pt-PT"/>
+        </w:rPr>
+        <w:t xml:space="preserve">A escolha do </w:t>
+      </w:r>
+      <w:proofErr w:type="spellStart"/>
+      <w:r>
+        <w:rPr>
+          <w:rFonts w:ascii="Arial" w:eastAsia="Times New Roman" w:hAnsi="Arial" w:cs="Arial"/>
+          <w:sz w:val="24"/>
+          <w:szCs w:val="24"/>
+          <w:lang w:eastAsia="pt-PT"/>
+        </w:rPr>
+        <w:t>LocalDB</w:t>
+      </w:r>
+      <w:proofErr w:type="spellEnd"/>
+      <w:r>
+        <w:rPr>
+          <w:rFonts w:ascii="Arial" w:eastAsia="Times New Roman" w:hAnsi="Arial" w:cs="Arial"/>
+          <w:sz w:val="24"/>
+          <w:szCs w:val="24"/>
+          <w:lang w:eastAsia="pt-PT"/>
+        </w:rPr>
+        <w:t xml:space="preserve"> deve-se ao facto de</w:t>
+      </w:r>
+      <w:r>
+        <w:rPr>
+          <w:rFonts w:ascii="Arial" w:eastAsia="Times New Roman" w:hAnsi="Arial" w:cs="Arial"/>
+          <w:sz w:val="24"/>
+          <w:szCs w:val="24"/>
+          <w:lang w:eastAsia="pt-PT"/>
+        </w:rPr>
+        <w:t>, além de ser assim pedido no enunciado,</w:t>
+      </w:r>
+      <w:r>
+        <w:rPr>
+          <w:rFonts w:ascii="Arial" w:eastAsia="Times New Roman" w:hAnsi="Arial" w:cs="Arial"/>
+          <w:sz w:val="24"/>
+          <w:szCs w:val="24"/>
+          <w:lang w:eastAsia="pt-PT"/>
+        </w:rPr>
+        <w:t xml:space="preserve"> ser </w:t>
+      </w:r>
+      <w:r>
+        <w:rPr>
+          <w:rFonts w:ascii="Arial" w:eastAsia="Times New Roman" w:hAnsi="Arial" w:cs="Arial"/>
+          <w:sz w:val="24"/>
+          <w:szCs w:val="24"/>
+          <w:lang w:eastAsia="pt-PT"/>
+        </w:rPr>
+        <w:t xml:space="preserve">também </w:t>
+      </w:r>
+      <w:r>
+        <w:rPr>
+          <w:rFonts w:ascii="Arial" w:eastAsia="Times New Roman" w:hAnsi="Arial" w:cs="Arial"/>
+          <w:sz w:val="24"/>
+          <w:szCs w:val="24"/>
+          <w:lang w:eastAsia="pt-PT"/>
+        </w:rPr>
+        <w:t>uma solução leve e adequada para aplicações académicas e protótipos.</w:t>
+      </w:r>
+    </w:p>
+    <w:p>
+      <w:pPr>
+        <w:spacing w:after="0" w:line="240" w:lineRule="auto"/>
+        <w:rPr>
+          <w:rFonts w:ascii="Arial" w:eastAsia="Times New Roman" w:hAnsi="Arial" w:cs="Arial"/>
+          <w:sz w:val="24"/>
+          <w:szCs w:val="24"/>
+          <w:lang w:eastAsia="pt-PT"/>
+        </w:rPr>
+      </w:pPr>
+    </w:p>
+    <w:p>
+      <w:pPr>
+        <w:spacing w:before="100" w:beforeAutospacing="1" w:after="100" w:afterAutospacing="1" w:line="240" w:lineRule="auto"/>
+        <w:outlineLvl w:val="1"/>
         <w:rPr>
           <w:rFonts w:ascii="Arial" w:eastAsia="Times New Roman" w:hAnsi="Arial" w:cs="Arial"/>
           <w:b/>
@@ -2402,136 +2755,8 @@
           <w:szCs w:val="36"/>
           <w:lang w:eastAsia="pt-PT"/>
         </w:rPr>
-        <w:t xml:space="preserve"> LINQ Method Syntax</w:t>
-      </w:r>
-    </w:p>
-    <w:p>
-      <w:pPr>
-        <w:spacing w:before="100" w:beforeAutospacing="1" w:after="100" w:afterAutospacing="1" w:line="240" w:lineRule="auto"/>
-        <w:rPr>
-          <w:rFonts w:ascii="Arial" w:eastAsia="Times New Roman" w:hAnsi="Arial" w:cs="Arial"/>
-          <w:sz w:val="24"/>
-          <w:szCs w:val="24"/>
-          <w:lang w:eastAsia="pt-PT"/>
-        </w:rPr>
-      </w:pPr>
-      <w:r>
-        <w:rPr>
-          <w:rFonts w:ascii="Arial" w:eastAsia="Times New Roman" w:hAnsi="Arial" w:cs="Arial"/>
-          <w:sz w:val="24"/>
-          <w:szCs w:val="24"/>
-          <w:lang w:eastAsia="pt-PT"/>
-        </w:rPr>
-        <w:t xml:space="preserve">Todas as consultas foram </w:t>
-      </w:r>
-      <w:r>
-        <w:rPr>
-          <w:rFonts w:ascii="Arial" w:eastAsia="Times New Roman" w:hAnsi="Arial" w:cs="Arial"/>
-          <w:sz w:val="24"/>
-          <w:szCs w:val="24"/>
-          <w:lang w:eastAsia="pt-PT"/>
-        </w:rPr>
-        <w:t>feitas</w:t>
-      </w:r>
-      <w:r>
-        <w:rPr>
-          <w:rFonts w:ascii="Arial" w:eastAsia="Times New Roman" w:hAnsi="Arial" w:cs="Arial"/>
-          <w:sz w:val="24"/>
-          <w:szCs w:val="24"/>
-          <w:lang w:eastAsia="pt-PT"/>
-        </w:rPr>
-        <w:t xml:space="preserve"> utilizando a sintaxe Method Syntax.</w:t>
-      </w:r>
-    </w:p>
-    <w:p>
-      <w:pPr>
-        <w:spacing w:before="100" w:beforeAutospacing="1" w:after="100" w:afterAutospacing="1" w:line="240" w:lineRule="auto"/>
-        <w:rPr>
-          <w:rFonts w:ascii="Arial" w:eastAsia="Times New Roman" w:hAnsi="Arial" w:cs="Arial"/>
-          <w:sz w:val="24"/>
-          <w:szCs w:val="24"/>
-          <w:lang w:eastAsia="pt-PT"/>
-        </w:rPr>
-      </w:pPr>
-      <w:r>
-        <w:rPr>
-          <w:rFonts w:ascii="Arial" w:eastAsia="Times New Roman" w:hAnsi="Arial" w:cs="Arial"/>
-          <w:sz w:val="24"/>
-          <w:szCs w:val="24"/>
-          <w:lang w:eastAsia="pt-PT"/>
-        </w:rPr>
-        <w:t xml:space="preserve">Esta abordagem </w:t>
-      </w:r>
-      <w:r>
-        <w:rPr>
-          <w:rFonts w:ascii="Arial" w:eastAsia="Times New Roman" w:hAnsi="Arial" w:cs="Arial"/>
-          <w:sz w:val="24"/>
-          <w:szCs w:val="24"/>
-          <w:lang w:eastAsia="pt-PT"/>
-        </w:rPr>
-        <w:t>é muito</w:t>
-      </w:r>
-      <w:r>
-        <w:rPr>
-          <w:rFonts w:ascii="Arial" w:eastAsia="Times New Roman" w:hAnsi="Arial" w:cs="Arial"/>
-          <w:sz w:val="24"/>
-          <w:szCs w:val="24"/>
-          <w:lang w:eastAsia="pt-PT"/>
-        </w:rPr>
-        <w:t xml:space="preserve"> </w:t>
-      </w:r>
-      <w:r>
-        <w:rPr>
-          <w:rFonts w:ascii="Arial" w:eastAsia="Times New Roman" w:hAnsi="Arial" w:cs="Arial"/>
-          <w:sz w:val="24"/>
-          <w:szCs w:val="24"/>
-          <w:lang w:eastAsia="pt-PT"/>
-        </w:rPr>
-        <w:t>flexivel</w:t>
-      </w:r>
-      <w:r>
-        <w:rPr>
-          <w:rFonts w:ascii="Arial" w:eastAsia="Times New Roman" w:hAnsi="Arial" w:cs="Arial"/>
-          <w:sz w:val="24"/>
-          <w:szCs w:val="24"/>
-          <w:lang w:eastAsia="pt-PT"/>
-        </w:rPr>
-        <w:t xml:space="preserve">, é amplamente utilizada em contexto profissional e foi a metodologia </w:t>
-      </w:r>
-      <w:r>
-        <w:rPr>
-          <w:rFonts w:ascii="Arial" w:eastAsia="Times New Roman" w:hAnsi="Arial" w:cs="Arial"/>
-          <w:sz w:val="24"/>
-          <w:szCs w:val="24"/>
-          <w:lang w:eastAsia="pt-PT"/>
-        </w:rPr>
-        <w:t>estudada</w:t>
-      </w:r>
-      <w:r>
-        <w:rPr>
-          <w:rFonts w:ascii="Arial" w:eastAsia="Times New Roman" w:hAnsi="Arial" w:cs="Arial"/>
-          <w:sz w:val="24"/>
-          <w:szCs w:val="24"/>
-          <w:lang w:eastAsia="pt-PT"/>
-        </w:rPr>
-        <w:t xml:space="preserve"> ao longo das aulas práticas.</w:t>
-      </w:r>
-    </w:p>
-    <w:p>
-      <w:pPr>
-        <w:spacing w:after="0" w:line="240" w:lineRule="auto"/>
-        <w:rPr>
-          <w:rFonts w:ascii="Arial" w:eastAsia="Times New Roman" w:hAnsi="Arial" w:cs="Arial"/>
-          <w:sz w:val="24"/>
-          <w:szCs w:val="24"/>
-          <w:lang w:eastAsia="pt-PT"/>
-        </w:rPr>
-      </w:pPr>
-    </w:p>
-    <w:p>
-      <w:pPr>
-        <w:spacing w:before="100" w:beforeAutospacing="1" w:after="100" w:afterAutospacing="1" w:line="240" w:lineRule="auto"/>
-        <w:outlineLvl w:val="1"/>
+      </w:pPr>
+      <w:r>
         <w:rPr>
           <w:rFonts w:ascii="Arial" w:eastAsia="Times New Roman" w:hAnsi="Arial" w:cs="Arial"/>
           <w:b/>
@@ -2540,7 +2765,8 @@
           <w:szCs w:val="36"/>
           <w:lang w:eastAsia="pt-PT"/>
         </w:rPr>
-      </w:pPr>
+        <w:t>3.</w:t>
+      </w:r>
       <w:r>
         <w:rPr>
           <w:rFonts w:ascii="Arial" w:eastAsia="Times New Roman" w:hAnsi="Arial" w:cs="Arial"/>
@@ -2550,8 +2776,9 @@
           <w:szCs w:val="36"/>
           <w:lang w:eastAsia="pt-PT"/>
         </w:rPr>
-        <w:t>4.</w:t>
-      </w:r>
+        <w:t xml:space="preserve"> LINQ </w:t>
+      </w:r>
+      <w:proofErr w:type="spellStart"/>
       <w:r>
         <w:rPr>
           <w:rFonts w:ascii="Arial" w:eastAsia="Times New Roman" w:hAnsi="Arial" w:cs="Arial"/>
@@ -2561,6 +2788,232 @@
           <w:szCs w:val="36"/>
           <w:lang w:eastAsia="pt-PT"/>
         </w:rPr>
+        <w:t>Method</w:t>
+      </w:r>
+      <w:proofErr w:type="spellEnd"/>
+      <w:r>
+        <w:rPr>
+          <w:rFonts w:ascii="Arial" w:eastAsia="Times New Roman" w:hAnsi="Arial" w:cs="Arial"/>
+          <w:b/>
+          <w:bCs/>
+          <w:sz w:val="36"/>
+          <w:szCs w:val="36"/>
+          <w:lang w:eastAsia="pt-PT"/>
+        </w:rPr>
+        <w:t xml:space="preserve"> </w:t>
+      </w:r>
+      <w:proofErr w:type="spellStart"/>
+      <w:r>
+        <w:rPr>
+          <w:rFonts w:ascii="Arial" w:eastAsia="Times New Roman" w:hAnsi="Arial" w:cs="Arial"/>
+          <w:b/>
+          <w:bCs/>
+          <w:sz w:val="36"/>
+          <w:szCs w:val="36"/>
+          <w:lang w:eastAsia="pt-PT"/>
+        </w:rPr>
+        <w:t>Syntax</w:t>
+      </w:r>
+      <w:proofErr w:type="spellEnd"/>
+    </w:p>
+    <w:p>
+      <w:pPr>
+        <w:spacing w:before="100" w:beforeAutospacing="1" w:after="100" w:afterAutospacing="1" w:line="240" w:lineRule="auto"/>
+        <w:rPr>
+          <w:rFonts w:ascii="Arial" w:eastAsia="Times New Roman" w:hAnsi="Arial" w:cs="Arial"/>
+          <w:sz w:val="24"/>
+          <w:szCs w:val="24"/>
+          <w:lang w:eastAsia="pt-PT"/>
+        </w:rPr>
+      </w:pPr>
+      <w:r>
+        <w:rPr>
+          <w:rFonts w:ascii="Arial" w:eastAsia="Times New Roman" w:hAnsi="Arial" w:cs="Arial"/>
+          <w:sz w:val="24"/>
+          <w:szCs w:val="24"/>
+          <w:lang w:eastAsia="pt-PT"/>
+        </w:rPr>
+        <w:t xml:space="preserve">Todas as consultas foram </w:t>
+      </w:r>
+      <w:r>
+        <w:rPr>
+          <w:rFonts w:ascii="Arial" w:eastAsia="Times New Roman" w:hAnsi="Arial" w:cs="Arial"/>
+          <w:sz w:val="24"/>
+          <w:szCs w:val="24"/>
+          <w:lang w:eastAsia="pt-PT"/>
+        </w:rPr>
+        <w:t>feitas</w:t>
+      </w:r>
+      <w:r>
+        <w:rPr>
+          <w:rFonts w:ascii="Arial" w:eastAsia="Times New Roman" w:hAnsi="Arial" w:cs="Arial"/>
+          <w:sz w:val="24"/>
+          <w:szCs w:val="24"/>
+          <w:lang w:eastAsia="pt-PT"/>
+        </w:rPr>
+        <w:t xml:space="preserve"> utilizando a sintaxe </w:t>
+      </w:r>
+      <w:proofErr w:type="spellStart"/>
+      <w:r>
+        <w:rPr>
+          <w:rFonts w:ascii="Arial" w:eastAsia="Times New Roman" w:hAnsi="Arial" w:cs="Arial"/>
+          <w:sz w:val="24"/>
+          <w:szCs w:val="24"/>
+          <w:lang w:eastAsia="pt-PT"/>
+        </w:rPr>
+        <w:t>Method</w:t>
+      </w:r>
+      <w:proofErr w:type="spellEnd"/>
+      <w:r>
+        <w:rPr>
+          <w:rFonts w:ascii="Arial" w:eastAsia="Times New Roman" w:hAnsi="Arial" w:cs="Arial"/>
+          <w:sz w:val="24"/>
+          <w:szCs w:val="24"/>
+          <w:lang w:eastAsia="pt-PT"/>
+        </w:rPr>
+        <w:t xml:space="preserve"> </w:t>
+      </w:r>
+      <w:proofErr w:type="spellStart"/>
+      <w:r>
+        <w:rPr>
+          <w:rFonts w:ascii="Arial" w:eastAsia="Times New Roman" w:hAnsi="Arial" w:cs="Arial"/>
+          <w:sz w:val="24"/>
+          <w:szCs w:val="24"/>
+          <w:lang w:eastAsia="pt-PT"/>
+        </w:rPr>
+        <w:t>Syntax</w:t>
+      </w:r>
+      <w:proofErr w:type="spellEnd"/>
+      <w:r>
+        <w:rPr>
+          <w:rFonts w:ascii="Arial" w:eastAsia="Times New Roman" w:hAnsi="Arial" w:cs="Arial"/>
+          <w:sz w:val="24"/>
+          <w:szCs w:val="24"/>
+          <w:lang w:eastAsia="pt-PT"/>
+        </w:rPr>
+        <w:t>.</w:t>
+      </w:r>
+    </w:p>
+    <w:p>
+      <w:pPr>
+        <w:spacing w:before="100" w:beforeAutospacing="1" w:after="100" w:afterAutospacing="1" w:line="240" w:lineRule="auto"/>
+        <w:rPr>
+          <w:rFonts w:ascii="Arial" w:eastAsia="Times New Roman" w:hAnsi="Arial" w:cs="Arial"/>
+          <w:sz w:val="24"/>
+          <w:szCs w:val="24"/>
+          <w:lang w:eastAsia="pt-PT"/>
+        </w:rPr>
+      </w:pPr>
+      <w:r>
+        <w:rPr>
+          <w:rFonts w:ascii="Arial" w:eastAsia="Times New Roman" w:hAnsi="Arial" w:cs="Arial"/>
+          <w:sz w:val="24"/>
+          <w:szCs w:val="24"/>
+          <w:lang w:eastAsia="pt-PT"/>
+        </w:rPr>
+        <w:t xml:space="preserve">Esta abordagem </w:t>
+      </w:r>
+      <w:r>
+        <w:rPr>
+          <w:rFonts w:ascii="Arial" w:eastAsia="Times New Roman" w:hAnsi="Arial" w:cs="Arial"/>
+          <w:sz w:val="24"/>
+          <w:szCs w:val="24"/>
+          <w:lang w:eastAsia="pt-PT"/>
+        </w:rPr>
+        <w:t>é muito</w:t>
+      </w:r>
+      <w:r>
+        <w:rPr>
+          <w:rFonts w:ascii="Arial" w:eastAsia="Times New Roman" w:hAnsi="Arial" w:cs="Arial"/>
+          <w:sz w:val="24"/>
+          <w:szCs w:val="24"/>
+          <w:lang w:eastAsia="pt-PT"/>
+        </w:rPr>
+        <w:t xml:space="preserve"> </w:t>
+      </w:r>
+      <w:proofErr w:type="spellStart"/>
+      <w:r>
+        <w:rPr>
+          <w:rFonts w:ascii="Arial" w:eastAsia="Times New Roman" w:hAnsi="Arial" w:cs="Arial"/>
+          <w:sz w:val="24"/>
+          <w:szCs w:val="24"/>
+          <w:lang w:eastAsia="pt-PT"/>
+        </w:rPr>
+        <w:t>flexivel</w:t>
+      </w:r>
+      <w:proofErr w:type="spellEnd"/>
+      <w:r>
+        <w:rPr>
+          <w:rFonts w:ascii="Arial" w:eastAsia="Times New Roman" w:hAnsi="Arial" w:cs="Arial"/>
+          <w:sz w:val="24"/>
+          <w:szCs w:val="24"/>
+          <w:lang w:eastAsia="pt-PT"/>
+        </w:rPr>
+        <w:t xml:space="preserve">, é amplamente utilizada em contexto profissional e foi a metodologia </w:t>
+      </w:r>
+      <w:r>
+        <w:rPr>
+          <w:rFonts w:ascii="Arial" w:eastAsia="Times New Roman" w:hAnsi="Arial" w:cs="Arial"/>
+          <w:sz w:val="24"/>
+          <w:szCs w:val="24"/>
+          <w:lang w:eastAsia="pt-PT"/>
+        </w:rPr>
+        <w:t>estudada</w:t>
+      </w:r>
+      <w:r>
+        <w:rPr>
+          <w:rFonts w:ascii="Arial" w:eastAsia="Times New Roman" w:hAnsi="Arial" w:cs="Arial"/>
+          <w:sz w:val="24"/>
+          <w:szCs w:val="24"/>
+          <w:lang w:eastAsia="pt-PT"/>
+        </w:rPr>
+        <w:t xml:space="preserve"> ao longo das aulas práticas.</w:t>
+      </w:r>
+    </w:p>
+    <w:p>
+      <w:pPr>
+        <w:spacing w:after="0" w:line="240" w:lineRule="auto"/>
+        <w:rPr>
+          <w:rFonts w:ascii="Arial" w:eastAsia="Times New Roman" w:hAnsi="Arial" w:cs="Arial"/>
+          <w:sz w:val="24"/>
+          <w:szCs w:val="24"/>
+          <w:lang w:eastAsia="pt-PT"/>
+        </w:rPr>
+      </w:pPr>
+    </w:p>
+    <w:p>
+      <w:pPr>
+        <w:spacing w:before="100" w:beforeAutospacing="1" w:after="100" w:afterAutospacing="1" w:line="240" w:lineRule="auto"/>
+        <w:outlineLvl w:val="1"/>
+        <w:rPr>
+          <w:rFonts w:ascii="Arial" w:eastAsia="Times New Roman" w:hAnsi="Arial" w:cs="Arial"/>
+          <w:b/>
+          <w:bCs/>
+          <w:sz w:val="36"/>
+          <w:szCs w:val="36"/>
+          <w:lang w:eastAsia="pt-PT"/>
+        </w:rPr>
+      </w:pPr>
+      <w:r>
+        <w:rPr>
+          <w:rFonts w:ascii="Arial" w:eastAsia="Times New Roman" w:hAnsi="Arial" w:cs="Arial"/>
+          <w:b/>
+          <w:bCs/>
+          <w:sz w:val="36"/>
+          <w:szCs w:val="36"/>
+          <w:lang w:eastAsia="pt-PT"/>
+        </w:rPr>
+        <w:t>4.</w:t>
+      </w:r>
+      <w:r>
+        <w:rPr>
+          <w:rFonts w:ascii="Arial" w:eastAsia="Times New Roman" w:hAnsi="Arial" w:cs="Arial"/>
+          <w:b/>
+          <w:bCs/>
+          <w:sz w:val="36"/>
+          <w:szCs w:val="36"/>
+          <w:lang w:eastAsia="pt-PT"/>
+        </w:rPr>
         <w:t xml:space="preserve"> Exceções</w:t>
       </w:r>
     </w:p>
@@ -2581,7 +3034,47 @@
           <w:szCs w:val="24"/>
           <w:lang w:eastAsia="pt-PT"/>
         </w:rPr>
-        <w:t>Todos os métodos que trabalham com a base de dados estão protegidos por blocos try/catch.</w:t>
+        <w:t xml:space="preserve">Todos os métodos que trabalham com a base de dados estão protegidos por blocos </w:t>
+      </w:r>
+      <w:proofErr w:type="spellStart"/>
+      <w:r>
+        <w:rPr>
+          <w:rFonts w:ascii="Arial" w:eastAsia="Times New Roman" w:hAnsi="Arial" w:cs="Arial"/>
+          <w:sz w:val="24"/>
+          <w:szCs w:val="24"/>
+          <w:lang w:eastAsia="pt-PT"/>
+        </w:rPr>
+        <w:t>try</w:t>
+      </w:r>
+      <w:proofErr w:type="spellEnd"/>
+      <w:r>
+        <w:rPr>
+          <w:rFonts w:ascii="Arial" w:eastAsia="Times New Roman" w:hAnsi="Arial" w:cs="Arial"/>
+          <w:sz w:val="24"/>
+          <w:szCs w:val="24"/>
+          <w:lang w:eastAsia="pt-PT"/>
+        </w:rPr>
+        <w:t>/</w:t>
+      </w:r>
+      <w:proofErr w:type="spellStart"/>
+      <w:r>
+        <w:rPr>
+          <w:rFonts w:ascii="Arial" w:eastAsia="Times New Roman" w:hAnsi="Arial" w:cs="Arial"/>
+          <w:sz w:val="24"/>
+          <w:szCs w:val="24"/>
+          <w:lang w:eastAsia="pt-PT"/>
+        </w:rPr>
+        <w:t>catch</w:t>
+      </w:r>
+      <w:proofErr w:type="spellEnd"/>
+      <w:r>
+        <w:rPr>
+          <w:rFonts w:ascii="Arial" w:eastAsia="Times New Roman" w:hAnsi="Arial" w:cs="Arial"/>
+          <w:sz w:val="24"/>
+          <w:szCs w:val="24"/>
+          <w:lang w:eastAsia="pt-PT"/>
+        </w:rPr>
+        <w:t>.</w:t>
       </w:r>
       <w:r>
         <w:rPr>
@@ -2729,7 +3222,27 @@
           <w:szCs w:val="24"/>
           <w:lang w:eastAsia="pt-PT"/>
         </w:rPr>
-        <w:t>As exceções são comunicadas através de caixas de diálogo (MessageBox).</w:t>
+        <w:t>As exceções são comunicadas através de caixas de diálogo (</w:t>
+      </w:r>
+      <w:proofErr w:type="spellStart"/>
+      <w:r>
+        <w:rPr>
+          <w:rFonts w:ascii="Arial" w:eastAsia="Times New Roman" w:hAnsi="Arial" w:cs="Arial"/>
+          <w:sz w:val="24"/>
+          <w:szCs w:val="24"/>
+          <w:lang w:eastAsia="pt-PT"/>
+        </w:rPr>
+        <w:t>MessageBox</w:t>
+      </w:r>
+      <w:proofErr w:type="spellEnd"/>
+      <w:r>
+        <w:rPr>
+          <w:rFonts w:ascii="Arial" w:eastAsia="Times New Roman" w:hAnsi="Arial" w:cs="Arial"/>
+          <w:sz w:val="24"/>
+          <w:szCs w:val="24"/>
+          <w:lang w:eastAsia="pt-PT"/>
+        </w:rPr>
+        <w:t>).</w:t>
       </w:r>
     </w:p>
     <w:p>
@@ -2812,6 +3325,7 @@
           <w:lang w:eastAsia="pt-PT"/>
         </w:rPr>
       </w:pPr>
+      <w:proofErr w:type="spellStart"/>
       <w:r>
         <w:rPr>
           <w:rFonts w:ascii="Arial" w:eastAsia="Times New Roman" w:hAnsi="Arial" w:cs="Arial"/>
@@ -2823,6 +3337,7 @@
         </w:rPr>
         <w:t>ItemCompra</w:t>
       </w:r>
+      <w:proofErr w:type="spellEnd"/>
     </w:p>
     <w:p>
       <w:pPr>
@@ -2933,6 +3448,7 @@
           <w:lang w:eastAsia="pt-PT"/>
         </w:rPr>
       </w:pPr>
+      <w:proofErr w:type="spellStart"/>
       <w:r>
         <w:rPr>
           <w:rFonts w:ascii="Arial" w:eastAsia="Times New Roman" w:hAnsi="Arial" w:cs="Arial"/>
@@ -2945,6 +3461,7 @@
         <w:lastRenderedPageBreak/>
         <w:t>Orcamento</w:t>
       </w:r>
+      <w:proofErr w:type="spellEnd"/>
     </w:p>
     <w:p>
       <w:pPr>
@@ -4183,7 +4700,27 @@
           <w:szCs w:val="24"/>
           <w:lang w:eastAsia="pt-PT"/>
         </w:rPr>
-        <w:t>O iShopping é uma aplicação desenvolvida para apoiar a gestão de compras domésticas e controlo de orçamento familiar.</w:t>
+        <w:t xml:space="preserve">O </w:t>
+      </w:r>
+      <w:proofErr w:type="spellStart"/>
+      <w:r>
+        <w:rPr>
+          <w:rFonts w:ascii="Arial" w:eastAsia="Times New Roman" w:hAnsi="Arial" w:cs="Arial"/>
+          <w:sz w:val="24"/>
+          <w:szCs w:val="24"/>
+          <w:lang w:eastAsia="pt-PT"/>
+        </w:rPr>
+        <w:t>iShopping</w:t>
+      </w:r>
+      <w:proofErr w:type="spellEnd"/>
+      <w:r>
+        <w:rPr>
+          <w:rFonts w:ascii="Arial" w:eastAsia="Times New Roman" w:hAnsi="Arial" w:cs="Arial"/>
+          <w:sz w:val="24"/>
+          <w:szCs w:val="24"/>
+          <w:lang w:eastAsia="pt-PT"/>
+        </w:rPr>
+        <w:t xml:space="preserve"> é uma aplicação desenvolvida para apoiar a gestão de compras domésticas e controlo de orçamento familiar.</w:t>
       </w:r>
     </w:p>
     <w:p>
@@ -4531,7 +5068,27 @@
           <w:szCs w:val="24"/>
           <w:lang w:eastAsia="pt-PT"/>
         </w:rPr>
-        <w:t>SQL Server LocalDB;</w:t>
+        <w:t xml:space="preserve">SQL Server </w:t>
+      </w:r>
+      <w:proofErr w:type="spellStart"/>
+      <w:r>
+        <w:rPr>
+          <w:rFonts w:ascii="Arial" w:eastAsia="Times New Roman" w:hAnsi="Arial" w:cs="Arial"/>
+          <w:sz w:val="24"/>
+          <w:szCs w:val="24"/>
+          <w:lang w:eastAsia="pt-PT"/>
+        </w:rPr>
+        <w:t>LocalDB</w:t>
+      </w:r>
+      <w:proofErr w:type="spellEnd"/>
+      <w:r>
+        <w:rPr>
+          <w:rFonts w:ascii="Arial" w:eastAsia="Times New Roman" w:hAnsi="Arial" w:cs="Arial"/>
+          <w:sz w:val="24"/>
+          <w:szCs w:val="24"/>
+          <w:lang w:eastAsia="pt-PT"/>
+        </w:rPr>
+        <w:t>;</w:t>
       </w:r>
     </w:p>
     <w:p>
@@ -4548,14 +5105,25 @@
           <w:lang w:eastAsia="pt-PT"/>
         </w:rPr>
       </w:pPr>
-      <w:r>
-        <w:rPr>
-          <w:rFonts w:ascii="Arial" w:eastAsia="Times New Roman" w:hAnsi="Arial" w:cs="Arial"/>
-          <w:sz w:val="24"/>
-          <w:szCs w:val="24"/>
-          <w:lang w:eastAsia="pt-PT"/>
-        </w:rPr>
-        <w:t>Entity Framework 6.5.2.</w:t>
+      <w:proofErr w:type="spellStart"/>
+      <w:r>
+        <w:rPr>
+          <w:rFonts w:ascii="Arial" w:eastAsia="Times New Roman" w:hAnsi="Arial" w:cs="Arial"/>
+          <w:sz w:val="24"/>
+          <w:szCs w:val="24"/>
+          <w:lang w:eastAsia="pt-PT"/>
+        </w:rPr>
+        <w:t>Entity</w:t>
+      </w:r>
+      <w:proofErr w:type="spellEnd"/>
+      <w:r>
+        <w:rPr>
+          <w:rFonts w:ascii="Arial" w:eastAsia="Times New Roman" w:hAnsi="Arial" w:cs="Arial"/>
+          <w:sz w:val="24"/>
+          <w:szCs w:val="24"/>
+          <w:lang w:eastAsia="pt-PT"/>
+        </w:rPr>
+        <w:t xml:space="preserve"> Framework 6.5.2.</w:t>
       </w:r>
     </w:p>
     <w:p>
@@ -4660,7 +5228,27 @@
           <w:szCs w:val="24"/>
           <w:lang w:eastAsia="pt-PT"/>
         </w:rPr>
-        <w:t xml:space="preserve"> no Visual Studio;</w:t>
+        <w:t xml:space="preserve"> no Visual </w:t>
+      </w:r>
+      <w:proofErr w:type="spellStart"/>
+      <w:r>
+        <w:rPr>
+          <w:rFonts w:ascii="Arial" w:eastAsia="Times New Roman" w:hAnsi="Arial" w:cs="Arial"/>
+          <w:sz w:val="24"/>
+          <w:szCs w:val="24"/>
+          <w:lang w:eastAsia="pt-PT"/>
+        </w:rPr>
+        <w:t>Studio</w:t>
+      </w:r>
+      <w:proofErr w:type="spellEnd"/>
+      <w:r>
+        <w:rPr>
+          <w:rFonts w:ascii="Arial" w:eastAsia="Times New Roman" w:hAnsi="Arial" w:cs="Arial"/>
+          <w:sz w:val="24"/>
+          <w:szCs w:val="24"/>
+          <w:lang w:eastAsia="pt-PT"/>
+        </w:rPr>
+        <w:t>;</w:t>
       </w:r>
     </w:p>
     <w:p>
@@ -4684,7 +5272,47 @@
           <w:szCs w:val="24"/>
           <w:lang w:eastAsia="pt-PT"/>
         </w:rPr>
-        <w:t>Compilar a solução através da opção Build Solution;</w:t>
+        <w:t xml:space="preserve">Compilar a solução através da opção </w:t>
+      </w:r>
+      <w:proofErr w:type="spellStart"/>
+      <w:r>
+        <w:rPr>
+          <w:rFonts w:ascii="Arial" w:eastAsia="Times New Roman" w:hAnsi="Arial" w:cs="Arial"/>
+          <w:sz w:val="24"/>
+          <w:szCs w:val="24"/>
+          <w:lang w:eastAsia="pt-PT"/>
+        </w:rPr>
+        <w:t>Build</w:t>
+      </w:r>
+      <w:proofErr w:type="spellEnd"/>
+      <w:r>
+        <w:rPr>
+          <w:rFonts w:ascii="Arial" w:eastAsia="Times New Roman" w:hAnsi="Arial" w:cs="Arial"/>
+          <w:sz w:val="24"/>
+          <w:szCs w:val="24"/>
+          <w:lang w:eastAsia="pt-PT"/>
+        </w:rPr>
+        <w:t xml:space="preserve"> </w:t>
+      </w:r>
+      <w:proofErr w:type="spellStart"/>
+      <w:r>
+        <w:rPr>
+          <w:rFonts w:ascii="Arial" w:eastAsia="Times New Roman" w:hAnsi="Arial" w:cs="Arial"/>
+          <w:sz w:val="24"/>
+          <w:szCs w:val="24"/>
+          <w:lang w:eastAsia="pt-PT"/>
+        </w:rPr>
+        <w:t>Solution</w:t>
+      </w:r>
+      <w:proofErr w:type="spellEnd"/>
+      <w:r>
+        <w:rPr>
+          <w:rFonts w:ascii="Arial" w:eastAsia="Times New Roman" w:hAnsi="Arial" w:cs="Arial"/>
+          <w:sz w:val="24"/>
+          <w:szCs w:val="24"/>
+          <w:lang w:eastAsia="pt-PT"/>
+        </w:rPr>
+        <w:t>;</w:t>
       </w:r>
     </w:p>
     <w:p>
@@ -4823,7 +5451,27 @@
           <w:szCs w:val="24"/>
           <w:lang w:eastAsia="pt-PT"/>
         </w:rPr>
-        <w:t xml:space="preserve"> username e password.</w:t>
+        <w:t xml:space="preserve"> </w:t>
+      </w:r>
+      <w:proofErr w:type="spellStart"/>
+      <w:r>
+        <w:rPr>
+          <w:rFonts w:ascii="Arial" w:eastAsia="Times New Roman" w:hAnsi="Arial" w:cs="Arial"/>
+          <w:sz w:val="24"/>
+          <w:szCs w:val="24"/>
+          <w:lang w:eastAsia="pt-PT"/>
+        </w:rPr>
+        <w:t>username</w:t>
+      </w:r>
+      <w:proofErr w:type="spellEnd"/>
+      <w:r>
+        <w:rPr>
+          <w:rFonts w:ascii="Arial" w:eastAsia="Times New Roman" w:hAnsi="Arial" w:cs="Arial"/>
+          <w:sz w:val="24"/>
+          <w:szCs w:val="24"/>
+          <w:lang w:eastAsia="pt-PT"/>
+        </w:rPr>
+        <w:t xml:space="preserve"> e password.</w:t>
       </w:r>
       <w:r>
         <w:rPr>
@@ -4915,7 +5563,17 @@
           <w:szCs w:val="24"/>
           <w:lang w:eastAsia="pt-PT"/>
         </w:rPr>
-        <w:t>, o u</w:t>
+        <w:t xml:space="preserve">, o </w:t>
+      </w:r>
+      <w:proofErr w:type="spellStart"/>
+      <w:r>
+        <w:rPr>
+          <w:rFonts w:ascii="Arial" w:eastAsia="Times New Roman" w:hAnsi="Arial" w:cs="Arial"/>
+          <w:sz w:val="24"/>
+          <w:szCs w:val="24"/>
+          <w:lang w:eastAsia="pt-PT"/>
+        </w:rPr>
+        <w:t>u</w:t>
       </w:r>
       <w:r>
         <w:rPr>
@@ -4926,6 +5584,7 @@
         </w:rPr>
         <w:t>sername</w:t>
       </w:r>
+      <w:proofErr w:type="spellEnd"/>
       <w:r>
         <w:rPr>
           <w:rFonts w:ascii="Arial" w:eastAsia="Times New Roman" w:hAnsi="Arial" w:cs="Arial"/>
@@ -5083,7 +5742,27 @@
           <w:szCs w:val="27"/>
           <w:lang w:eastAsia="pt-PT"/>
         </w:rPr>
-        <w:t>com 4 tabs:</w:t>
+        <w:t xml:space="preserve">com 4 </w:t>
+      </w:r>
+      <w:proofErr w:type="spellStart"/>
+      <w:r>
+        <w:rPr>
+          <w:rFonts w:ascii="Arial" w:eastAsia="Times New Roman" w:hAnsi="Arial" w:cs="Arial"/>
+          <w:sz w:val="27"/>
+          <w:szCs w:val="27"/>
+          <w:lang w:eastAsia="pt-PT"/>
+        </w:rPr>
+        <w:t>tabs</w:t>
+      </w:r>
+      <w:proofErr w:type="spellEnd"/>
+      <w:r>
+        <w:rPr>
+          <w:rFonts w:ascii="Arial" w:eastAsia="Times New Roman" w:hAnsi="Arial" w:cs="Arial"/>
+          <w:sz w:val="27"/>
+          <w:szCs w:val="27"/>
+          <w:lang w:eastAsia="pt-PT"/>
+        </w:rPr>
+        <w:t>:</w:t>
       </w:r>
     </w:p>
     <w:p>
@@ -5682,7 +6361,17 @@
           <w:szCs w:val="24"/>
           <w:lang w:eastAsia="pt-PT"/>
         </w:rPr>
-        <w:t>, u</w:t>
+        <w:t xml:space="preserve">, </w:t>
+      </w:r>
+      <w:proofErr w:type="spellStart"/>
+      <w:r>
+        <w:rPr>
+          <w:rFonts w:ascii="Arial" w:eastAsia="Times New Roman" w:hAnsi="Arial" w:cs="Arial"/>
+          <w:sz w:val="24"/>
+          <w:szCs w:val="24"/>
+          <w:lang w:eastAsia="pt-PT"/>
+        </w:rPr>
+        <w:t>u</w:t>
       </w:r>
       <w:r>
         <w:rPr>
@@ -5693,6 +6382,7 @@
         </w:rPr>
         <w:t>sername</w:t>
       </w:r>
+      <w:proofErr w:type="spellEnd"/>
       <w:r>
         <w:rPr>
           <w:rFonts w:ascii="Arial" w:eastAsia="Times New Roman" w:hAnsi="Arial" w:cs="Arial"/>
@@ -6730,8 +7420,21 @@
           <w:szCs w:val="36"/>
           <w:lang w:eastAsia="pt-PT"/>
         </w:rPr>
-        <w:t xml:space="preserve"> Modo Compra</w:t>
-      </w:r>
+        <w:t xml:space="preserve"> </w:t>
+      </w:r>
+      <w:proofErr w:type="gramStart"/>
+      <w:r>
+        <w:rPr>
+          <w:rFonts w:ascii="Arial" w:eastAsia="Times New Roman" w:hAnsi="Arial" w:cs="Arial"/>
+          <w:b/>
+          <w:bCs/>
+          <w:sz w:val="36"/>
+          <w:szCs w:val="36"/>
+          <w:lang w:eastAsia="pt-PT"/>
+        </w:rPr>
+        <w:t>Modo Compra</w:t>
+      </w:r>
+      <w:proofErr w:type="gramEnd"/>
     </w:p>
     <w:p>
       <w:pPr>
@@ -6892,68 +7595,68 @@
           <w:szCs w:val="24"/>
           <w:lang w:eastAsia="pt-PT"/>
         </w:rPr>
+        <w:t>Permite registar</w:t>
+      </w:r>
+      <w:r>
+        <w:rPr>
+          <w:rFonts w:ascii="Arial" w:eastAsia="Times New Roman" w:hAnsi="Arial" w:cs="Arial"/>
+          <w:sz w:val="24"/>
+          <w:szCs w:val="24"/>
+          <w:lang w:eastAsia="pt-PT"/>
+        </w:rPr>
+        <w:t xml:space="preserve"> a q</w:t>
+      </w:r>
+      <w:r>
+        <w:rPr>
+          <w:rFonts w:ascii="Arial" w:eastAsia="Times New Roman" w:hAnsi="Arial" w:cs="Arial"/>
+          <w:sz w:val="24"/>
+          <w:szCs w:val="24"/>
+          <w:lang w:eastAsia="pt-PT"/>
+        </w:rPr>
+        <w:t>uantidade adquirida</w:t>
+      </w:r>
+      <w:r>
+        <w:rPr>
+          <w:rFonts w:ascii="Arial" w:eastAsia="Times New Roman" w:hAnsi="Arial" w:cs="Arial"/>
+          <w:sz w:val="24"/>
+          <w:szCs w:val="24"/>
+          <w:lang w:eastAsia="pt-PT"/>
+        </w:rPr>
+        <w:t xml:space="preserve"> e o p</w:t>
+      </w:r>
+      <w:r>
+        <w:rPr>
+          <w:rFonts w:ascii="Arial" w:eastAsia="Times New Roman" w:hAnsi="Arial" w:cs="Arial"/>
+          <w:sz w:val="24"/>
+          <w:szCs w:val="24"/>
+          <w:lang w:eastAsia="pt-PT"/>
+        </w:rPr>
+        <w:t>reço unitário.</w:t>
+      </w:r>
+    </w:p>
+    <w:p>
+      <w:pPr>
+        <w:spacing w:before="100" w:beforeAutospacing="1" w:after="100" w:afterAutospacing="1" w:line="240" w:lineRule="auto"/>
+        <w:outlineLvl w:val="3"/>
+        <w:rPr>
+          <w:rFonts w:ascii="Arial" w:eastAsia="Times New Roman" w:hAnsi="Arial" w:cs="Arial"/>
+          <w:b/>
+          <w:bCs/>
+          <w:sz w:val="24"/>
+          <w:szCs w:val="24"/>
+          <w:lang w:eastAsia="pt-PT"/>
+        </w:rPr>
+      </w:pPr>
+      <w:r>
+        <w:rPr>
+          <w:rFonts w:ascii="Arial" w:eastAsia="Times New Roman" w:hAnsi="Arial" w:cs="Arial"/>
+          <w:b/>
+          <w:bCs/>
+          <w:sz w:val="24"/>
+          <w:szCs w:val="24"/>
+          <w:lang w:eastAsia="pt-PT"/>
+        </w:rPr>
         <w:lastRenderedPageBreak/>
-        <w:t>Permite registar</w:t>
-      </w:r>
-      <w:r>
-        <w:rPr>
-          <w:rFonts w:ascii="Arial" w:eastAsia="Times New Roman" w:hAnsi="Arial" w:cs="Arial"/>
-          <w:sz w:val="24"/>
-          <w:szCs w:val="24"/>
-          <w:lang w:eastAsia="pt-PT"/>
-        </w:rPr>
-        <w:t xml:space="preserve"> a q</w:t>
-      </w:r>
-      <w:r>
-        <w:rPr>
-          <w:rFonts w:ascii="Arial" w:eastAsia="Times New Roman" w:hAnsi="Arial" w:cs="Arial"/>
-          <w:sz w:val="24"/>
-          <w:szCs w:val="24"/>
-          <w:lang w:eastAsia="pt-PT"/>
-        </w:rPr>
-        <w:t>uantidade adquirida</w:t>
-      </w:r>
-      <w:r>
-        <w:rPr>
-          <w:rFonts w:ascii="Arial" w:eastAsia="Times New Roman" w:hAnsi="Arial" w:cs="Arial"/>
-          <w:sz w:val="24"/>
-          <w:szCs w:val="24"/>
-          <w:lang w:eastAsia="pt-PT"/>
-        </w:rPr>
-        <w:t xml:space="preserve"> e o p</w:t>
-      </w:r>
-      <w:r>
-        <w:rPr>
-          <w:rFonts w:ascii="Arial" w:eastAsia="Times New Roman" w:hAnsi="Arial" w:cs="Arial"/>
-          <w:sz w:val="24"/>
-          <w:szCs w:val="24"/>
-          <w:lang w:eastAsia="pt-PT"/>
-        </w:rPr>
-        <w:t>reço unitário.</w:t>
-      </w:r>
-    </w:p>
-    <w:p>
-      <w:pPr>
-        <w:spacing w:before="100" w:beforeAutospacing="1" w:after="100" w:afterAutospacing="1" w:line="240" w:lineRule="auto"/>
-        <w:outlineLvl w:val="3"/>
-        <w:rPr>
-          <w:rFonts w:ascii="Arial" w:eastAsia="Times New Roman" w:hAnsi="Arial" w:cs="Arial"/>
-          <w:b/>
-          <w:bCs/>
-          <w:sz w:val="24"/>
-          <w:szCs w:val="24"/>
-          <w:lang w:eastAsia="pt-PT"/>
-        </w:rPr>
-      </w:pPr>
-      <w:r>
-        <w:rPr>
-          <w:rFonts w:ascii="Arial" w:eastAsia="Times New Roman" w:hAnsi="Arial" w:cs="Arial"/>
-          <w:b/>
-          <w:bCs/>
-          <w:sz w:val="24"/>
-          <w:szCs w:val="24"/>
-          <w:lang w:eastAsia="pt-PT"/>
-        </w:rPr>
         <w:t>Adicionar Artigo Não Previsto</w:t>
       </w:r>
     </w:p>
@@ -7435,6 +8138,7 @@
           <w:lang w:eastAsia="pt-PT"/>
         </w:rPr>
       </w:pPr>
+      <w:proofErr w:type="spellStart"/>
       <w:r>
         <w:rPr>
           <w:rFonts w:ascii="Arial" w:eastAsia="Times New Roman" w:hAnsi="Arial" w:cs="Arial"/>
@@ -7444,6 +8148,7 @@
         </w:rPr>
         <w:t>NomeCompra</w:t>
       </w:r>
+      <w:proofErr w:type="spellEnd"/>
     </w:p>
     <w:p>
       <w:pPr>
@@ -7459,6 +8164,7 @@
           <w:lang w:eastAsia="pt-PT"/>
         </w:rPr>
       </w:pPr>
+      <w:proofErr w:type="spellStart"/>
       <w:r>
         <w:rPr>
           <w:rFonts w:ascii="Arial" w:eastAsia="Times New Roman" w:hAnsi="Arial" w:cs="Arial"/>
@@ -7468,6 +8174,7 @@
         </w:rPr>
         <w:t>DataCriacao</w:t>
       </w:r>
+      <w:proofErr w:type="spellEnd"/>
     </w:p>
     <w:p>
       <w:pPr>
@@ -7483,6 +8190,7 @@
           <w:lang w:eastAsia="pt-PT"/>
         </w:rPr>
       </w:pPr>
+      <w:proofErr w:type="spellStart"/>
       <w:r>
         <w:rPr>
           <w:rFonts w:ascii="Arial" w:eastAsia="Times New Roman" w:hAnsi="Arial" w:cs="Arial"/>
@@ -7492,6 +8200,7 @@
         </w:rPr>
         <w:t>DataFechada</w:t>
       </w:r>
+      <w:proofErr w:type="spellEnd"/>
     </w:p>
     <w:p>
       <w:pPr>
@@ -7507,6 +8216,7 @@
           <w:lang w:eastAsia="pt-PT"/>
         </w:rPr>
       </w:pPr>
+      <w:proofErr w:type="spellStart"/>
       <w:r>
         <w:rPr>
           <w:rFonts w:ascii="Arial" w:eastAsia="Times New Roman" w:hAnsi="Arial" w:cs="Arial"/>
@@ -7516,6 +8226,7 @@
         </w:rPr>
         <w:t>NomeArtigo</w:t>
       </w:r>
+      <w:proofErr w:type="spellEnd"/>
     </w:p>
     <w:p>
       <w:pPr>
@@ -7531,6 +8242,7 @@
           <w:lang w:eastAsia="pt-PT"/>
         </w:rPr>
       </w:pPr>
+      <w:proofErr w:type="spellStart"/>
       <w:r>
         <w:rPr>
           <w:rFonts w:ascii="Arial" w:eastAsia="Times New Roman" w:hAnsi="Arial" w:cs="Arial"/>
@@ -7540,6 +8252,7 @@
         </w:rPr>
         <w:t>ArtigoPrevisto</w:t>
       </w:r>
+      <w:proofErr w:type="spellEnd"/>
     </w:p>
     <w:p>
       <w:pPr>
@@ -7555,6 +8268,7 @@
           <w:lang w:eastAsia="pt-PT"/>
         </w:rPr>
       </w:pPr>
+      <w:proofErr w:type="spellStart"/>
       <w:r>
         <w:rPr>
           <w:rFonts w:ascii="Arial" w:eastAsia="Times New Roman" w:hAnsi="Arial" w:cs="Arial"/>
@@ -7564,6 +8278,7 @@
         </w:rPr>
         <w:t>ArtigoNaoPrevisto</w:t>
       </w:r>
+      <w:proofErr w:type="spellEnd"/>
     </w:p>
     <w:p>
       <w:pPr>
@@ -7579,6 +8294,7 @@
           <w:lang w:eastAsia="pt-PT"/>
         </w:rPr>
       </w:pPr>
+      <w:proofErr w:type="spellStart"/>
       <w:r>
         <w:rPr>
           <w:rFonts w:ascii="Arial" w:eastAsia="Times New Roman" w:hAnsi="Arial" w:cs="Arial"/>
@@ -7588,6 +8304,7 @@
         </w:rPr>
         <w:t>QuantidadePrevista</w:t>
       </w:r>
+      <w:proofErr w:type="spellEnd"/>
     </w:p>
     <w:p>
       <w:pPr>
@@ -7603,6 +8320,7 @@
           <w:lang w:eastAsia="pt-PT"/>
         </w:rPr>
       </w:pPr>
+      <w:proofErr w:type="spellStart"/>
       <w:r>
         <w:rPr>
           <w:rFonts w:ascii="Arial" w:eastAsia="Times New Roman" w:hAnsi="Arial" w:cs="Arial"/>
@@ -7612,6 +8330,7 @@
         </w:rPr>
         <w:t>QuantidadeAdquirida</w:t>
       </w:r>
+      <w:proofErr w:type="spellEnd"/>
     </w:p>
     <w:p>
       <w:pPr>
@@ -7627,6 +8346,7 @@
           <w:lang w:eastAsia="pt-PT"/>
         </w:rPr>
       </w:pPr>
+      <w:proofErr w:type="spellStart"/>
       <w:r>
         <w:rPr>
           <w:rFonts w:ascii="Arial" w:eastAsia="Times New Roman" w:hAnsi="Arial" w:cs="Arial"/>
@@ -7636,6 +8356,7 @@
         </w:rPr>
         <w:t>PrecoUnitario</w:t>
       </w:r>
+      <w:proofErr w:type="spellEnd"/>
     </w:p>
     <w:p>
       <w:pPr>

</xml_diff>